<commit_message>
Redesign academic CV with clearer typography and organisation
</commit_message>
<xml_diff>
--- a/academic/Joao_Jose_Academic_CV.docx
+++ b/academic/Joao_Jose_Academic_CV.docx
@@ -4,64 +4,95 @@
   <w:body>
     <w:p>
       <w:pPr>
-        <w:pStyle w:val="Title"/>
-      </w:pPr>
-      <w:r>
-        <w:t>João José</w:t>
+        <w:pStyle w:val="Kicker"/>
+        <w:rPr>
+          <w:rFonts w:hint="eastAsia"/>
+        </w:rPr>
+      </w:pPr>
+      <w:r>
+        <w:t>ACADEMIC CURRICULUM VITAE</w:t>
       </w:r>
     </w:p>
     <w:p>
       <w:pPr>
-        <w:pStyle w:val="Subtitle"/>
-      </w:pPr>
-      <w:r>
-        <w:t>Academic Curriculum Vitae</w:t>
+        <w:pStyle w:val="Title"/>
+      </w:pPr>
+      <w:r>
+        <w:t>João José</w:t>
       </w:r>
     </w:p>
     <w:p>
-      <w:r>
-        <w:t xml:space="preserve">Portugal  |  +351 910 005 592  |  </w:t>
+      <w:pPr>
+        <w:pStyle w:val="Subtitle"/>
+      </w:pPr>
+      <w:r>
+        <w:t>Computer vision and assistive navigation</w:t>
+      </w:r>
+    </w:p>
+    <w:p>
+      <w:pPr>
+        <w:pStyle w:val="Contact"/>
+        <w:rPr>
+          <w:rFonts w:hint="eastAsia"/>
+        </w:rPr>
+      </w:pPr>
+      <w:r>
+        <w:t xml:space="preserve">Portugal   ·   +351 910 005 592   ·   </w:t>
       </w:r>
       <w:hyperlink r:id="rId8">
         <w:r>
           <w:rPr>
-            <w:color w:val="174B70"/>
-            <w:u w:val="single"/>
+            <w:color w:val="176575"/>
           </w:rPr>
           <w:t>joao@jtjsoftware.com</w:t>
         </w:r>
       </w:hyperlink>
     </w:p>
     <w:p>
+      <w:pPr>
+        <w:pStyle w:val="Contact"/>
+        <w:spacing w:after="340"/>
+        <w:rPr>
+          <w:rFonts w:hint="eastAsia"/>
+        </w:rPr>
+      </w:pPr>
       <w:hyperlink r:id="rId9">
         <w:r>
           <w:rPr>
-            <w:color w:val="174B70"/>
-            <w:u w:val="single"/>
+            <w:color w:val="176575"/>
           </w:rPr>
           <w:t>Academic profile</w:t>
         </w:r>
       </w:hyperlink>
       <w:r>
-        <w:t xml:space="preserve">  |  </w:t>
+        <w:t xml:space="preserve">   ·   </w:t>
       </w:r>
       <w:hyperlink r:id="rId10">
         <w:r>
           <w:rPr>
-            <w:color w:val="174B70"/>
-            <w:u w:val="single"/>
+            <w:color w:val="176575"/>
+          </w:rPr>
+          <w:t>Google Scholar</w:t>
+        </w:r>
+      </w:hyperlink>
+      <w:r>
+        <w:t xml:space="preserve">   ·   </w:t>
+      </w:r>
+      <w:hyperlink r:id="rId11">
+        <w:r>
+          <w:rPr>
+            <w:color w:val="176575"/>
           </w:rPr>
           <w:t>LinkedIn</w:t>
         </w:r>
       </w:hyperlink>
       <w:r>
-        <w:t xml:space="preserve">  |  </w:t>
-      </w:r>
-      <w:hyperlink r:id="rId11">
+        <w:t xml:space="preserve">   ·   </w:t>
+      </w:r>
+      <w:hyperlink r:id="rId12">
         <w:r>
           <w:rPr>
-            <w:color w:val="174B70"/>
-            <w:u w:val="single"/>
+            <w:color w:val="176575"/>
           </w:rPr>
           <w:t>GitHub</w:t>
         </w:r>
@@ -69,366 +100,595 @@
     </w:p>
     <w:p>
       <w:pPr>
-        <w:pStyle w:val="Heading1"/>
-      </w:pPr>
-      <w:r>
-        <w:t>Research profile</w:t>
+        <w:pStyle w:val="Intro"/>
+        <w:rPr>
+          <w:rFonts w:hint="eastAsia"/>
+        </w:rPr>
+      </w:pPr>
+      <w:r>
+        <w:t>Software engineer with research experience at the University of Algarve’s Vision Laboratory. My academic work focused on computer vision to support the mobility of blind and visually impaired people, from real-time path and obstacle detection to indoor navigation.</w:t>
       </w:r>
     </w:p>
     <w:p>
-      <w:r>
-        <w:t>Software engineer with research experience at the University of Algarve's Vision Laboratory (2008-2013). Academic work focused on computer vision for the mobility of blind and visually impaired people: real-time path and obstacle detection, indoor landmarks, lateral-door detection and sound feedback. Contributor to SmartVision and Blavigator; author or co-author of a book, journal articles, conference papers and a conference abstract.</w:t>
+      <w:pPr>
+        <w:pStyle w:val="Heading2"/>
+        <w:spacing w:before="220"/>
+      </w:pPr>
+      <w:r>
+        <w:t>Research experience</w:t>
       </w:r>
     </w:p>
     <w:p>
       <w:pPr>
-        <w:pStyle w:val="Heading1"/>
-      </w:pPr>
-      <w:r>
-        <w:t>Research experience</w:t>
+        <w:pStyle w:val="Heading3"/>
+      </w:pPr>
+      <w:r>
+        <w:t>Computer Vision Researcher and Research Fellow</w:t>
       </w:r>
     </w:p>
     <w:p>
       <w:pPr>
-        <w:pStyle w:val="Heading2"/>
-      </w:pPr>
-      <w:r>
-        <w:t>Computer Vision Researcher / Research Fellow</w:t>
+        <w:pStyle w:val="Meta"/>
+        <w:tabs>
+          <w:tab w:val="right" w:pos="9637"/>
+        </w:tabs>
+        <w:rPr>
+          <w:rFonts w:hint="eastAsia"/>
+        </w:rPr>
+      </w:pPr>
+      <w:r>
+        <w:t>Vision Laboratory, University of Algarve</w:t>
+      </w:r>
+      <w:r>
+        <w:rPr>
+          <w:color w:val="176575"/>
+        </w:rPr>
+        <w:tab/>
+        <w:t>2008 - 2013</w:t>
       </w:r>
     </w:p>
     <w:p>
       <w:pPr>
-        <w:pStyle w:val="Metadata"/>
-      </w:pPr>
-      <w:r>
-        <w:t>Vision Laboratory, University of Algarve | 2008-2013 | Faro, Portugal</w:t>
+        <w:rPr>
+          <w:rFonts w:hint="eastAsia"/>
+        </w:rPr>
+      </w:pPr>
+      <w:r>
+        <w:t>Faro, Portugal. Developed human-vision models and active-vision algorithms in C/C++ and Matlab. Research member of ISR-Lisbon/IST, collaborating with the University of Trás-os-Montes and Alto Douro (UTAD).</w:t>
       </w:r>
     </w:p>
     <w:p>
-      <w:r>
-        <w:t>Developed human-vision models and active-vision algorithms in C/C++ and Matlab. Research member of ISR-Lisbon/IST; collaborated with the University of Trás-os-Montes and Alto Douro (UTAD).</w:t>
+      <w:pPr>
+        <w:pStyle w:val="Project"/>
+        <w:rPr>
+          <w:rFonts w:hint="eastAsia"/>
+        </w:rPr>
+      </w:pPr>
+      <w:r>
+        <w:rPr>
+          <w:b/>
+        </w:rPr>
+        <w:t xml:space="preserve">SmartVision. </w:t>
+      </w:r>
+      <w:r>
+        <w:t>Contributed to a portable navigation aid combining computer vision, geographic information and localisation. Detected walkable paths and static or moving obstacles beyond the reach of the white cane.</w:t>
       </w:r>
     </w:p>
     <w:p>
+      <w:pPr>
+        <w:pStyle w:val="Project"/>
+        <w:rPr>
+          <w:rFonts w:hint="eastAsia"/>
+        </w:rPr>
+      </w:pPr>
       <w:r>
         <w:rPr>
           <w:b/>
         </w:rPr>
-        <w:t xml:space="preserve">SmartVision. </w:t>
-      </w:r>
-      <w:r>
-        <w:t>Contributed to a portable navigation aid combining computer vision, geographic information and localisation. The vision work addressed walkable paths and static or moving obstacles beyond the reach of the white cane.</w:t>
+        <w:t xml:space="preserve">Blavigator. </w:t>
+      </w:r>
+      <w:r>
+        <w:t>Worked on path following, obstacle detection and indoor landmarks, including lateral-door detection and sound feedback for navigation guidance.</w:t>
       </w:r>
     </w:p>
     <w:p>
-      <w:r>
-        <w:rPr>
-          <w:b/>
-        </w:rPr>
-        <w:t xml:space="preserve">Blavigator. </w:t>
-      </w:r>
-      <w:r>
-        <w:t>Worked on visual navigation covering path following, obstacle detection and indoor landmarks, including lateral-door detection and sound feedback for navigation guidance.</w:t>
+      <w:pPr>
+        <w:pStyle w:val="Heading2"/>
+        <w:spacing w:before="320"/>
+      </w:pPr>
+      <w:r>
+        <w:t>Research grants and awards</w:t>
       </w:r>
     </w:p>
     <w:p>
       <w:pPr>
-        <w:pStyle w:val="Heading1"/>
-      </w:pPr>
-      <w:r>
-        <w:t>Education</w:t>
+        <w:pStyle w:val="Granttitle"/>
+        <w:rPr>
+          <w:rFonts w:hint="eastAsia"/>
+        </w:rPr>
+      </w:pPr>
+      <w:r>
+        <w:t>SmartVision research grant</w:t>
       </w:r>
     </w:p>
     <w:p>
       <w:pPr>
-        <w:pStyle w:val="Heading2"/>
-      </w:pPr>
-      <w:r>
-        <w:t>Doctoral studies in Computer Science Engineering (not completed)</w:t>
+        <w:spacing w:after="20"/>
+        <w:rPr>
+          <w:rFonts w:hint="eastAsia"/>
+        </w:rPr>
+      </w:pPr>
+      <w:r>
+        <w:t>Active vision for the blind.</w:t>
       </w:r>
     </w:p>
     <w:p>
       <w:pPr>
-        <w:pStyle w:val="Metadata"/>
-      </w:pPr>
-      <w:r>
-        <w:t>University of Algarve | Sep 2011 - Oct 2013</w:t>
+        <w:pStyle w:val="Grantmeta"/>
+        <w:rPr>
+          <w:rFonts w:hint="eastAsia"/>
+        </w:rPr>
+      </w:pPr>
+      <w:r>
+        <w:t>PTDC/EIA/73633/2006</w:t>
       </w:r>
     </w:p>
     <w:p>
-      <w:r>
-        <w:t>Robust visual recognition of objects and environments for blind users: literature review and algorithm comparison, an initial object-recognition model, and hand and arm segmentation. Completed the programme expected for the first two years; studies subsequently suspended.</w:t>
+      <w:pPr>
+        <w:pStyle w:val="Granttitle"/>
+        <w:rPr>
+          <w:rFonts w:hint="eastAsia"/>
+        </w:rPr>
+      </w:pPr>
+      <w:r>
+        <w:t>Blavigator research grant</w:t>
       </w:r>
     </w:p>
     <w:p>
       <w:pPr>
-        <w:pStyle w:val="Heading2"/>
-      </w:pPr>
-      <w:r>
-        <w:t>MSc in Computer Science Engineering</w:t>
+        <w:spacing w:after="20"/>
+        <w:rPr>
+          <w:rFonts w:hint="eastAsia"/>
+        </w:rPr>
+      </w:pPr>
+      <w:r>
+        <w:t>A cheap and reliable navigation aid for the blind.</w:t>
       </w:r>
     </w:p>
     <w:p>
       <w:pPr>
-        <w:pStyle w:val="Metadata"/>
-      </w:pPr>
-      <w:r>
-        <w:t>University of Algarve | Sep 2008 - Jun 2011 | Degree grade: 16/20</w:t>
+        <w:pStyle w:val="Grantmeta"/>
+        <w:rPr>
+          <w:rFonts w:hint="eastAsia"/>
+        </w:rPr>
+      </w:pPr>
+      <w:r>
+        <w:t>RIPD/ADA/109690/2009</w:t>
       </w:r>
     </w:p>
     <w:p>
-      <w:r>
-        <w:rPr>
-          <w:b/>
-        </w:rPr>
-        <w:t xml:space="preserve">Dissertation: </w:t>
-      </w:r>
-      <w:r>
-        <w:rPr>
-          <w:i/>
-        </w:rPr>
-        <w:t>Real-time path and obstacle detection for blind persons</w:t>
-      </w:r>
-      <w:r>
-        <w:t xml:space="preserve"> (2010).</w:t>
+      <w:pPr>
+        <w:pStyle w:val="Granttitle"/>
+        <w:rPr>
+          <w:rFonts w:hint="eastAsia"/>
+        </w:rPr>
+      </w:pPr>
+      <w:r>
+        <w:t>Doctoral research grant</w:t>
       </w:r>
     </w:p>
     <w:p>
-      <w:r>
-        <w:t>Real-time path and obstacle detection on a small netbook using C/C++, OpenCV and a Qt interface. Supervisor: Prof. Johannes Martinus Hubertina du Buf. Dissertation grade: 18/20.</w:t>
+      <w:pPr>
+        <w:spacing w:after="20"/>
+        <w:rPr>
+          <w:rFonts w:hint="eastAsia"/>
+        </w:rPr>
+      </w:pPr>
+      <w:r>
+        <w:t>Robust visual recognition of objects and environments for blind persons.</w:t>
       </w:r>
     </w:p>
     <w:p>
-      <w:hyperlink r:id="rId12">
+      <w:pPr>
+        <w:pStyle w:val="Grantmeta"/>
+        <w:rPr>
+          <w:rFonts w:hint="eastAsia"/>
+        </w:rPr>
+      </w:pPr>
+      <w:r>
+        <w:t>SFRH/BD/82310/2011</w:t>
+      </w:r>
+    </w:p>
+    <w:p>
+      <w:pPr>
+        <w:pStyle w:val="Granttitle"/>
+        <w:rPr>
+          <w:rFonts w:hint="eastAsia"/>
+        </w:rPr>
+      </w:pPr>
+      <w:r>
+        <w:t>CERATONIA award grant</w:t>
+      </w:r>
+    </w:p>
+    <w:p>
+      <w:pPr>
+        <w:spacing w:after="20"/>
+        <w:rPr>
+          <w:rFonts w:hint="eastAsia"/>
+        </w:rPr>
+      </w:pPr>
+      <w:r>
+        <w:t>The Amateur Painter.</w:t>
+      </w:r>
+    </w:p>
+    <w:p>
+      <w:pPr>
+        <w:pStyle w:val="Grantmeta"/>
+        <w:rPr>
+          <w:rFonts w:hint="eastAsia"/>
+        </w:rPr>
+      </w:pPr>
+      <w:r>
+        <w:t>3.70.13.001</w:t>
+      </w:r>
+    </w:p>
+    <w:p>
+      <w:pPr>
+        <w:pStyle w:val="Heading1"/>
+        <w:pageBreakBefore/>
+      </w:pPr>
+      <w:r>
+        <w:lastRenderedPageBreak/>
+        <w:t>Publications</w:t>
+      </w:r>
+    </w:p>
+    <w:p>
+      <w:pPr>
+        <w:pStyle w:val="Pubgroup"/>
+        <w:spacing w:before="0"/>
+        <w:rPr>
+          <w:rFonts w:hint="eastAsia"/>
+        </w:rPr>
+      </w:pPr>
+      <w:r>
+        <w:t>Journal articles</w:t>
+      </w:r>
+    </w:p>
+    <w:p>
+      <w:pPr>
+        <w:pStyle w:val="Pubtitle"/>
+        <w:spacing w:before="0"/>
+        <w:rPr>
+          <w:rFonts w:hint="eastAsia"/>
+        </w:rPr>
+      </w:pPr>
+      <w:r>
+        <w:rPr>
+          <w:color w:val="176575"/>
+        </w:rPr>
+        <w:t xml:space="preserve">2015   </w:t>
+      </w:r>
+      <w:r>
+        <w:t>Computer vision and GIS for the navigation of blind persons in buildings</w:t>
+      </w:r>
+    </w:p>
+    <w:p>
+      <w:pPr>
+        <w:pStyle w:val="Pubauthors"/>
+        <w:rPr>
+          <w:rFonts w:hint="eastAsia"/>
+        </w:rPr>
+      </w:pPr>
+      <w:r>
+        <w:t xml:space="preserve">M. Serrão, S. Shahrabadi, M. Moreno, </w:t>
+      </w:r>
+      <w:r>
+        <w:rPr>
+          <w:b/>
+        </w:rPr>
+        <w:t>J. T. José</w:t>
+      </w:r>
+      <w:r>
+        <w:t>, J. I. Rodrigues, J. M. F. Rodrigues &amp; J. M. H. du Buf</w:t>
+      </w:r>
+    </w:p>
+    <w:p>
+      <w:pPr>
+        <w:pStyle w:val="Pubvenue"/>
+        <w:rPr>
+          <w:rFonts w:hint="eastAsia"/>
+        </w:rPr>
+      </w:pPr>
+      <w:r>
+        <w:t>Universal Access in the Information Society, 14, 67-80. March 2015; online 19 February 2014.</w:t>
+      </w:r>
+    </w:p>
+    <w:p>
+      <w:pPr>
+        <w:pStyle w:val="Publinks"/>
+        <w:rPr>
+          <w:rFonts w:hint="eastAsia"/>
+        </w:rPr>
+      </w:pPr>
+      <w:hyperlink r:id="rId13">
         <w:r>
           <w:rPr>
-            <w:color w:val="174B70"/>
-            <w:u w:val="single"/>
+            <w:color w:val="176575"/>
           </w:rPr>
-          <w:t>Dissertation in the University of Algarve repository</w:t>
+          <w:t>DOI</w:t>
+        </w:r>
+      </w:hyperlink>
+      <w:r>
+        <w:t xml:space="preserve">   ·   </w:t>
+      </w:r>
+      <w:hyperlink r:id="rId14">
+        <w:r>
+          <w:rPr>
+            <w:color w:val="176575"/>
+          </w:rPr>
+          <w:t>PDF</w:t>
         </w:r>
       </w:hyperlink>
     </w:p>
     <w:p>
       <w:pPr>
-        <w:pStyle w:val="Heading2"/>
-      </w:pPr>
-      <w:r>
-        <w:t>BSc in Computer Science Engineering</w:t>
+        <w:pStyle w:val="Pubtitle"/>
+        <w:rPr>
+          <w:rFonts w:hint="eastAsia"/>
+        </w:rPr>
+      </w:pPr>
+      <w:r>
+        <w:rPr>
+          <w:color w:val="176575"/>
+        </w:rPr>
+        <w:t xml:space="preserve">2011   </w:t>
+      </w:r>
+      <w:r>
+        <w:t>The SmartVision local navigation aid for blind and visually impaired persons</w:t>
       </w:r>
     </w:p>
     <w:p>
       <w:pPr>
-        <w:pStyle w:val="Metadata"/>
-      </w:pPr>
-      <w:r>
-        <w:t>University of Algarve | Sep 2003 - Jul 2008</w:t>
+        <w:pStyle w:val="Pubauthors"/>
+        <w:rPr>
+          <w:rFonts w:hint="eastAsia"/>
+        </w:rPr>
+      </w:pPr>
+      <w:r>
+        <w:rPr>
+          <w:b/>
+        </w:rPr>
+        <w:t>J. José</w:t>
+      </w:r>
+      <w:r>
+        <w:t>, M. Farrajota, J. M. F. Rodrigues &amp; J. M. H. du Buf</w:t>
       </w:r>
     </w:p>
     <w:p>
-      <w:r>
-        <w:t>Selected project: a web content-management system for football news and results, using HTML, PHP, JavaScript, PostgreSQL and PL/pgSQL. Project grade: 19/20.</w:t>
+      <w:pPr>
+        <w:pStyle w:val="Pubvenue"/>
+        <w:rPr>
+          <w:rFonts w:hint="eastAsia"/>
+        </w:rPr>
+      </w:pPr>
+      <w:r>
+        <w:t>International Journal of Digital Content Technology and its Applications, 5(5), 362-375.</w:t>
       </w:r>
     </w:p>
     <w:p>
       <w:pPr>
-        <w:pStyle w:val="Heading2"/>
-      </w:pPr>
-      <w:r>
-        <w:t>Studies in Electronics Engineering</w:t>
-      </w:r>
-    </w:p>
-    <w:p>
-      <w:pPr>
-        <w:pStyle w:val="Metadata"/>
-      </w:pPr>
-      <w:r>
-        <w:t>University of Algarve | Sep 2001 - Jul 2003</w:t>
-      </w:r>
-    </w:p>
-    <w:p>
-      <w:r>
-        <w:t>Changed major to Computer Science Engineering; no degree awarded in Electronics Engineering.</w:t>
-      </w:r>
-    </w:p>
-    <w:p>
-      <w:r>
-        <w:br w:type="page"/>
-      </w:r>
-    </w:p>
-    <w:p>
-      <w:pPr>
-        <w:pStyle w:val="Heading1"/>
-      </w:pPr>
-      <w:r>
-        <w:lastRenderedPageBreak/>
-        <w:t>Publications</w:t>
-      </w:r>
-    </w:p>
-    <w:p>
-      <w:pPr>
-        <w:pStyle w:val="Heading2"/>
-      </w:pPr>
-      <w:r>
-        <w:t>Journal articles</w:t>
-      </w:r>
-    </w:p>
-    <w:p>
-      <w:pPr>
-        <w:pStyle w:val="Publication"/>
-      </w:pPr>
-      <w:r>
-        <w:t xml:space="preserve">M. Serrão, S. Shahrabadi, M. Moreno, </w:t>
-      </w:r>
-      <w:r>
-        <w:rPr>
-          <w:b/>
-        </w:rPr>
-        <w:t>J. T. José</w:t>
-      </w:r>
-      <w:r>
-        <w:t xml:space="preserve">, J. I. Rodrigues, J. M. F. Rodrigues &amp; J. M. H. du Buf (2015). </w:t>
-      </w:r>
-      <w:r>
-        <w:rPr>
-          <w:b/>
-        </w:rPr>
-        <w:t xml:space="preserve">Computer vision and GIS for the navigation of blind persons in buildings. </w:t>
-      </w:r>
-      <w:r>
-        <w:t xml:space="preserve">Universal Access in the Information Society, 14, 67-80. Journal issue: March 2015. First published online: 19 February 2014. </w:t>
-      </w:r>
-      <w:hyperlink r:id="rId13">
+        <w:pStyle w:val="Publinks"/>
+        <w:rPr>
+          <w:rFonts w:hint="eastAsia"/>
+        </w:rPr>
+      </w:pPr>
+      <w:hyperlink r:id="rId15">
         <w:r>
           <w:rPr>
-            <w:color w:val="174B70"/>
-            <w:u w:val="single"/>
+            <w:color w:val="176575"/>
           </w:rPr>
           <w:t>DOI</w:t>
         </w:r>
       </w:hyperlink>
       <w:r>
-        <w:t xml:space="preserve"> | </w:t>
-      </w:r>
-      <w:hyperlink r:id="rId14">
+        <w:t xml:space="preserve">   ·   </w:t>
+      </w:r>
+      <w:hyperlink r:id="rId16">
         <w:r>
           <w:rPr>
-            <w:color w:val="174B70"/>
-            <w:u w:val="single"/>
+            <w:color w:val="176575"/>
           </w:rPr>
-          <w:t>Open PDF</w:t>
+          <w:t>PDF</w:t>
         </w:r>
       </w:hyperlink>
     </w:p>
     <w:p>
       <w:pPr>
-        <w:pStyle w:val="Publication"/>
-      </w:pPr>
+        <w:pStyle w:val="Pubtitle"/>
+        <w:rPr>
+          <w:rFonts w:hint="eastAsia"/>
+        </w:rPr>
+      </w:pPr>
+      <w:r>
+        <w:rPr>
+          <w:color w:val="176575"/>
+        </w:rPr>
+        <w:t xml:space="preserve">2011   </w:t>
+      </w:r>
+      <w:r>
+        <w:t>The SmartVision Navigation Prototype for Blind Users</w:t>
+      </w:r>
+    </w:p>
+    <w:p>
+      <w:pPr>
+        <w:pStyle w:val="Pubauthors"/>
+        <w:rPr>
+          <w:rFonts w:hint="eastAsia"/>
+        </w:rPr>
+      </w:pPr>
+      <w:r>
+        <w:t xml:space="preserve">J. M. H. du Buf, J. Barroso, J. M. F. Rodrigues, H. Paredes, M. Farrajota, H. Fernandes, </w:t>
+      </w:r>
       <w:r>
         <w:rPr>
           <w:b/>
         </w:rPr>
-        <w:t>João José</w:t>
-      </w:r>
-      <w:r>
-        <w:t xml:space="preserve">, Miguel Farrajota, João M. F. Rodrigues &amp; J. M. Hans du Buf (2011). </w:t>
-      </w:r>
-      <w:r>
-        <w:rPr>
-          <w:b/>
-        </w:rPr>
-        <w:t xml:space="preserve">The SmartVision local navigation aid for blind and visually impaired persons. </w:t>
-      </w:r>
-      <w:r>
-        <w:t xml:space="preserve">International Journal of Digital Content Technology and its Applications, 5(5), 362-375. </w:t>
-      </w:r>
-      <w:hyperlink r:id="rId15">
+        <w:t>J. José</w:t>
+      </w:r>
+      <w:r>
+        <w:t>, V. Teixeira &amp; M. Saleiro</w:t>
+      </w:r>
+    </w:p>
+    <w:p>
+      <w:pPr>
+        <w:pStyle w:val="Pubvenue"/>
+        <w:rPr>
+          <w:rFonts w:hint="eastAsia"/>
+        </w:rPr>
+      </w:pPr>
+      <w:r>
+        <w:t>International Journal of Digital Content Technology and its Applications, 5(5), 351-361.</w:t>
+      </w:r>
+    </w:p>
+    <w:p>
+      <w:pPr>
+        <w:pStyle w:val="Publinks"/>
+        <w:rPr>
+          <w:rFonts w:hint="eastAsia"/>
+        </w:rPr>
+      </w:pPr>
+      <w:hyperlink r:id="rId17">
         <w:r>
           <w:rPr>
-            <w:color w:val="174B70"/>
-            <w:u w:val="single"/>
+            <w:color w:val="176575"/>
           </w:rPr>
           <w:t>DOI</w:t>
         </w:r>
       </w:hyperlink>
       <w:r>
-        <w:t xml:space="preserve"> | </w:t>
-      </w:r>
-      <w:hyperlink r:id="rId16">
+        <w:t xml:space="preserve">   ·   </w:t>
+      </w:r>
+      <w:hyperlink r:id="rId18">
         <w:r>
           <w:rPr>
-            <w:color w:val="174B70"/>
-            <w:u w:val="single"/>
+            <w:color w:val="176575"/>
           </w:rPr>
-          <w:t>Open PDF</w:t>
+          <w:t>PDF</w:t>
         </w:r>
       </w:hyperlink>
     </w:p>
     <w:p>
       <w:pPr>
-        <w:pStyle w:val="Publication"/>
-      </w:pPr>
-      <w:r>
-        <w:t xml:space="preserve">J. M. Hans du Buf, João Barroso, João M. F. Rodrigues, Hugo Paredes, Miguel Farrajota, Hugo Fernandes, </w:t>
+        <w:pStyle w:val="Pubgroup"/>
+        <w:spacing w:before="200"/>
+        <w:rPr>
+          <w:rFonts w:hint="eastAsia"/>
+        </w:rPr>
+      </w:pPr>
+      <w:r>
+        <w:t>Conference papers</w:t>
+      </w:r>
+    </w:p>
+    <w:p>
+      <w:pPr>
+        <w:pStyle w:val="Pubtitle"/>
+        <w:spacing w:before="0"/>
+        <w:rPr>
+          <w:rFonts w:hint="eastAsia"/>
+        </w:rPr>
+      </w:pPr>
+      <w:r>
+        <w:rPr>
+          <w:color w:val="176575"/>
+        </w:rPr>
+        <w:t xml:space="preserve">2012   </w:t>
+      </w:r>
+      <w:r>
+        <w:t>Realtime Local Navigation for the Blind: Detection of Lateral Doors and Sound Interface</w:t>
+      </w:r>
+    </w:p>
+    <w:p>
+      <w:pPr>
+        <w:pStyle w:val="Pubauthors"/>
+        <w:rPr>
+          <w:rFonts w:hint="eastAsia"/>
+        </w:rPr>
+      </w:pPr>
+      <w:r>
+        <w:t xml:space="preserve">M. Moreno, S. Shahrabadi, </w:t>
       </w:r>
       <w:r>
         <w:rPr>
           <w:b/>
         </w:rPr>
-        <w:t>João José</w:t>
-      </w:r>
-      <w:r>
-        <w:t>, Victor Teixeira &amp; Mário Saleiro</w:t>
-      </w:r>
-      <w:r>
-        <w:t xml:space="preserve"> (2011). </w:t>
-      </w:r>
-      <w:r>
-        <w:rPr>
-          <w:b/>
-        </w:rPr>
-        <w:t xml:space="preserve">The SmartVision Navigation Prototype for Blind Users. </w:t>
-      </w:r>
-      <w:r>
-        <w:t xml:space="preserve">International Journal of Digital Content Technology and its Applications, 5(5), 351-361. </w:t>
-      </w:r>
-      <w:hyperlink r:id="rId17">
+        <w:t>J. José</w:t>
+      </w:r>
+      <w:r>
+        <w:t>, J. M. H. du Buf &amp; J. M. F. Rodrigues</w:t>
+      </w:r>
+    </w:p>
+    <w:p>
+      <w:pPr>
+        <w:pStyle w:val="Pubvenue"/>
+        <w:rPr>
+          <w:rFonts w:hint="eastAsia"/>
+        </w:rPr>
+      </w:pPr>
+      <w:r>
+        <w:t>DSAI 2012. Procedia Computer Science, 14, 74-82.</w:t>
+      </w:r>
+    </w:p>
+    <w:p>
+      <w:pPr>
+        <w:pStyle w:val="Publinks"/>
+        <w:rPr>
+          <w:rFonts w:hint="eastAsia"/>
+        </w:rPr>
+      </w:pPr>
+      <w:hyperlink r:id="rId19">
         <w:r>
           <w:rPr>
-            <w:color w:val="174B70"/>
-            <w:u w:val="single"/>
+            <w:color w:val="176575"/>
           </w:rPr>
           <w:t>DOI</w:t>
         </w:r>
       </w:hyperlink>
       <w:r>
-        <w:t xml:space="preserve"> | </w:t>
-      </w:r>
-      <w:hyperlink r:id="rId18">
+        <w:t xml:space="preserve">   ·   </w:t>
+      </w:r>
+      <w:hyperlink r:id="rId20">
         <w:r>
           <w:rPr>
-            <w:color w:val="174B70"/>
-            <w:u w:val="single"/>
+            <w:color w:val="176575"/>
           </w:rPr>
-          <w:t>Open PDF</w:t>
+          <w:t>PDF</w:t>
         </w:r>
       </w:hyperlink>
     </w:p>
     <w:p>
       <w:pPr>
-        <w:pStyle w:val="Heading2"/>
-      </w:pPr>
-      <w:r>
-        <w:t>Conference papers</w:t>
+        <w:pStyle w:val="Pubtitle"/>
+        <w:rPr>
+          <w:rFonts w:hint="eastAsia"/>
+        </w:rPr>
+      </w:pPr>
+      <w:r>
+        <w:rPr>
+          <w:color w:val="176575"/>
+        </w:rPr>
+        <w:t xml:space="preserve">2012   </w:t>
+      </w:r>
+      <w:r>
+        <w:t>Visual Navigation for the Blind - Path and Obstacle Detection</w:t>
       </w:r>
     </w:p>
     <w:p>
       <w:pPr>
-        <w:pStyle w:val="Publication"/>
-      </w:pPr>
-      <w:r>
-        <w:t xml:space="preserve">M. Moreno, S. Shahrabadi, </w:t>
-      </w:r>
+        <w:pStyle w:val="Pubauthors"/>
+        <w:rPr>
+          <w:rFonts w:hint="eastAsia"/>
+        </w:rPr>
+      </w:pPr>
       <w:r>
         <w:rPr>
           <w:b/>
@@ -436,42 +696,70 @@
         <w:t>J. José</w:t>
       </w:r>
       <w:r>
-        <w:t xml:space="preserve">, J. M. H. du Buf &amp; J. M. F. Rodrigues (2012). </w:t>
-      </w:r>
-      <w:r>
-        <w:rPr>
-          <w:b/>
-        </w:rPr>
-        <w:t xml:space="preserve">Realtime Local Navigation for the Blind: Detection of Lateral Doors and Sound Interface. </w:t>
-      </w:r>
-      <w:r>
-        <w:t xml:space="preserve">DSAI 2012 · Procedia Computer Science, 14, 74-82. </w:t>
-      </w:r>
-      <w:hyperlink r:id="rId19">
+        <w:t>, J. M. H. du Buf &amp; J. M. F. Rodrigues</w:t>
+      </w:r>
+    </w:p>
+    <w:p>
+      <w:pPr>
+        <w:pStyle w:val="Pubvenue"/>
+        <w:rPr>
+          <w:rFonts w:hint="eastAsia"/>
+        </w:rPr>
+      </w:pPr>
+      <w:r>
+        <w:t>1st International Conference on Pattern Recognition Applications and Methods (ICPRAM), 515-519.</w:t>
+      </w:r>
+    </w:p>
+    <w:p>
+      <w:pPr>
+        <w:pStyle w:val="Publinks"/>
+        <w:rPr>
+          <w:rFonts w:hint="eastAsia"/>
+        </w:rPr>
+      </w:pPr>
+      <w:hyperlink r:id="rId21">
         <w:r>
           <w:rPr>
-            <w:color w:val="174B70"/>
-            <w:u w:val="single"/>
+            <w:color w:val="176575"/>
           </w:rPr>
           <w:t>DOI</w:t>
         </w:r>
       </w:hyperlink>
       <w:r>
-        <w:t xml:space="preserve"> | </w:t>
-      </w:r>
-      <w:hyperlink r:id="rId20">
+        <w:t xml:space="preserve">   ·   </w:t>
+      </w:r>
+      <w:hyperlink r:id="rId22">
         <w:r>
           <w:rPr>
-            <w:color w:val="174B70"/>
-            <w:u w:val="single"/>
+            <w:color w:val="176575"/>
           </w:rPr>
-          <w:t>Open PDF</w:t>
+          <w:t>PDF</w:t>
         </w:r>
       </w:hyperlink>
     </w:p>
     <w:p>
       <w:pPr>
-        <w:pStyle w:val="Publication"/>
+        <w:pStyle w:val="Pubtitle"/>
+        <w:rPr>
+          <w:rFonts w:hint="eastAsia"/>
+        </w:rPr>
+      </w:pPr>
+      <w:r>
+        <w:rPr>
+          <w:color w:val="176575"/>
+        </w:rPr>
+        <w:t xml:space="preserve">2010   </w:t>
+      </w:r>
+      <w:r>
+        <w:t>A vision system for detecting paths and moving obstacles for the blind</w:t>
+      </w:r>
+    </w:p>
+    <w:p>
+      <w:pPr>
+        <w:pStyle w:val="Pubauthors"/>
+        <w:rPr>
+          <w:rFonts w:hint="eastAsia"/>
+        </w:rPr>
       </w:pPr>
       <w:r>
         <w:rPr>
@@ -480,43 +768,63 @@
         <w:t>J. José</w:t>
       </w:r>
       <w:r>
-        <w:t xml:space="preserve">, J. M. H. du Buf &amp; J. M. F. Rodrigues (2012). </w:t>
-      </w:r>
-      <w:r>
-        <w:rPr>
-          <w:b/>
-        </w:rPr>
-        <w:t xml:space="preserve">Visual Navigation for the Blind - Path and Obstacle Detection. </w:t>
-      </w:r>
-      <w:r>
-        <w:t xml:space="preserve">Proceedings of the 1st International Conference on Pattern Recognition Applications and Methods (ICPRAM), 515-519. </w:t>
-      </w:r>
-      <w:hyperlink r:id="rId21">
+        <w:t>, M. Farrajota, J. M. F. Rodrigues &amp; J. M. H. du Buf</w:t>
+      </w:r>
+    </w:p>
+    <w:p>
+      <w:pPr>
+        <w:pStyle w:val="Pubvenue"/>
+        <w:rPr>
+          <w:rFonts w:hint="eastAsia"/>
+        </w:rPr>
+      </w:pPr>
+      <w:r>
+        <w:t>3rd International Conference on Software Development for Enhancing Accessibility and Fighting Info-exclusion (DSAI), Oxford, 175-182.</w:t>
+      </w:r>
+    </w:p>
+    <w:p>
+      <w:pPr>
+        <w:pStyle w:val="Publinks"/>
+        <w:rPr>
+          <w:rFonts w:hint="eastAsia"/>
+        </w:rPr>
+      </w:pPr>
+      <w:hyperlink r:id="rId23">
         <w:r>
           <w:rPr>
-            <w:color w:val="174B70"/>
-            <w:u w:val="single"/>
+            <w:color w:val="176575"/>
           </w:rPr>
-          <w:t>DOI</w:t>
-        </w:r>
-      </w:hyperlink>
-      <w:r>
-        <w:t xml:space="preserve"> | </w:t>
-      </w:r>
-      <w:hyperlink r:id="rId22">
-        <w:r>
-          <w:rPr>
-            <w:color w:val="174B70"/>
-            <w:u w:val="single"/>
-          </w:rPr>
-          <w:t>Open PDF</w:t>
+          <w:t>PDF</w:t>
         </w:r>
       </w:hyperlink>
     </w:p>
     <w:p>
       <w:pPr>
-        <w:pStyle w:val="Publication"/>
-      </w:pPr>
+        <w:pStyle w:val="Pubtitle"/>
+        <w:rPr>
+          <w:rFonts w:hint="eastAsia"/>
+        </w:rPr>
+      </w:pPr>
+      <w:r>
+        <w:rPr>
+          <w:color w:val="176575"/>
+        </w:rPr>
+        <w:t xml:space="preserve">2010   </w:t>
+      </w:r>
+      <w:r>
+        <w:t>The SmartVision Navigation Prototype for the Blind</w:t>
+      </w:r>
+    </w:p>
+    <w:p>
+      <w:pPr>
+        <w:pStyle w:val="Pubauthors"/>
+        <w:rPr>
+          <w:rFonts w:hint="eastAsia"/>
+        </w:rPr>
+      </w:pPr>
+      <w:r>
+        <w:t xml:space="preserve">J. M. H. du Buf, J. Barroso, J. M. F. Rodrigues, H. Paredes, M. Farrajota, H. Fernandes, </w:t>
+      </w:r>
       <w:r>
         <w:rPr>
           <w:b/>
@@ -524,586 +832,946 @@
         <w:t>J. José</w:t>
       </w:r>
       <w:r>
-        <w:t xml:space="preserve">, M. Farrajota, J. M. F. Rodrigues &amp; J. M. H. du Buf (2010). </w:t>
-      </w:r>
-      <w:r>
-        <w:rPr>
-          <w:b/>
-        </w:rPr>
-        <w:t xml:space="preserve">A vision system for detecting paths and moving obstacles for the blind. </w:t>
-      </w:r>
-      <w:r>
-        <w:t xml:space="preserve">Proceedings of the 3rd International Conference on Software Development for Enhancing Accessibility and Fighting Info-exclusion (DSAI), Oxford, 175-182. </w:t>
-      </w:r>
-      <w:hyperlink r:id="rId23">
+        <w:t>, V. Teixeira &amp; M. Saleiro</w:t>
+      </w:r>
+    </w:p>
+    <w:p>
+      <w:pPr>
+        <w:pStyle w:val="Pubvenue"/>
+        <w:rPr>
+          <w:rFonts w:hint="eastAsia"/>
+        </w:rPr>
+      </w:pPr>
+      <w:r>
+        <w:t>3rd International Conference on Software Development for Enhancing Accessibility and Fighting Info-exclusion (DSAI), Oxford, 167-174.</w:t>
+      </w:r>
+    </w:p>
+    <w:p>
+      <w:pPr>
+        <w:pStyle w:val="Publinks"/>
+        <w:rPr>
+          <w:rFonts w:hint="eastAsia"/>
+        </w:rPr>
+      </w:pPr>
+      <w:hyperlink r:id="rId24">
         <w:r>
           <w:rPr>
-            <w:color w:val="174B70"/>
-            <w:u w:val="single"/>
+            <w:color w:val="176575"/>
           </w:rPr>
-          <w:t>Open PDF</w:t>
+          <w:t>PDF</w:t>
         </w:r>
       </w:hyperlink>
     </w:p>
     <w:p>
       <w:pPr>
-        <w:pStyle w:val="Publication"/>
-      </w:pPr>
-      <w:r>
-        <w:t xml:space="preserve">J. M. H. du Buf, J. Barroso, J. M. F. Rodrigues, H. Paredes, M. Farrajota, H. Fernandes, </w:t>
-      </w:r>
+        <w:pStyle w:val="Pubgroup"/>
+        <w:spacing w:before="200"/>
+        <w:rPr>
+          <w:rFonts w:hint="eastAsia"/>
+        </w:rPr>
+      </w:pPr>
+      <w:r>
+        <w:t>Conference abstract</w:t>
+      </w:r>
+    </w:p>
+    <w:p>
+      <w:pPr>
+        <w:pStyle w:val="Pubtitle"/>
+        <w:spacing w:before="0"/>
+        <w:rPr>
+          <w:rFonts w:hint="eastAsia"/>
+        </w:rPr>
+      </w:pPr>
+      <w:r>
+        <w:rPr>
+          <w:color w:val="176575"/>
+        </w:rPr>
+        <w:t xml:space="preserve">2012   </w:t>
+      </w:r>
+      <w:r>
+        <w:t>Blavigator: a navigation aid for blind persons</w:t>
+      </w:r>
+    </w:p>
+    <w:p>
+      <w:pPr>
+        <w:pStyle w:val="Pubauthors"/>
+        <w:rPr>
+          <w:rFonts w:hint="eastAsia"/>
+        </w:rPr>
+      </w:pPr>
       <w:r>
         <w:rPr>
           <w:b/>
         </w:rPr>
-        <w:t>J. José</w:t>
-      </w:r>
-      <w:r>
-        <w:t xml:space="preserve">, V. Teixeira &amp; M. Saleiro (2010). </w:t>
-      </w:r>
-      <w:r>
-        <w:rPr>
-          <w:b/>
-        </w:rPr>
-        <w:t xml:space="preserve">The SmartVision Navigation Prototype for the Blind. </w:t>
-      </w:r>
-      <w:r>
-        <w:t xml:space="preserve">Proceedings of the 3rd International Conference on Software Development for Enhancing Accessibility and Fighting Info-exclusion (DSAI), Oxford, 167-174. </w:t>
-      </w:r>
-      <w:hyperlink r:id="rId24">
+        <w:t>J. Jose</w:t>
+      </w:r>
+      <w:r>
+        <w:t>, M. Moreno, J. Pinilla-Dutoit, J. Rodrigues &amp; J. Du Buf</w:t>
+      </w:r>
+    </w:p>
+    <w:p>
+      <w:pPr>
+        <w:pStyle w:val="Pubvenue"/>
+        <w:rPr>
+          <w:rFonts w:hint="eastAsia"/>
+        </w:rPr>
+      </w:pPr>
+      <w:r>
+        <w:t>ECVP 2012. Perception, 41(1_suppl), p. 99, abstract 97.</w:t>
+      </w:r>
+    </w:p>
+    <w:p>
+      <w:pPr>
+        <w:pStyle w:val="Publinks"/>
+        <w:rPr>
+          <w:rFonts w:hint="eastAsia"/>
+        </w:rPr>
+      </w:pPr>
+      <w:hyperlink r:id="rId25" w:anchor="page=99">
         <w:r>
           <w:rPr>
-            <w:color w:val="174B70"/>
-            <w:u w:val="single"/>
+            <w:color w:val="176575"/>
           </w:rPr>
-          <w:t>Open PDF</w:t>
+          <w:t>Abstract collection PDF · p. 99</w:t>
         </w:r>
       </w:hyperlink>
     </w:p>
     <w:p>
       <w:pPr>
-        <w:pStyle w:val="Heading2"/>
-      </w:pPr>
-      <w:r>
-        <w:t>Conference abstract</w:t>
+        <w:pStyle w:val="Pubgroup"/>
+        <w:spacing w:before="200"/>
+        <w:rPr>
+          <w:rFonts w:hint="eastAsia"/>
+        </w:rPr>
+      </w:pPr>
+      <w:r>
+        <w:t>Book</w:t>
       </w:r>
     </w:p>
     <w:p>
       <w:pPr>
-        <w:pStyle w:val="Publication"/>
+        <w:pStyle w:val="Pubtitle"/>
+        <w:spacing w:before="0"/>
+        <w:rPr>
+          <w:rFonts w:hint="eastAsia"/>
+        </w:rPr>
+      </w:pPr>
+      <w:r>
+        <w:rPr>
+          <w:color w:val="176575"/>
+        </w:rPr>
+        <w:t xml:space="preserve">2013   </w:t>
+      </w:r>
+      <w:r>
+        <w:t>Real-time path and obstacle detection for blind persons</w:t>
+      </w:r>
+    </w:p>
+    <w:p>
+      <w:pPr>
+        <w:pStyle w:val="Pubauthors"/>
+        <w:rPr>
+          <w:rFonts w:hint="eastAsia"/>
+        </w:rPr>
       </w:pPr>
       <w:r>
         <w:rPr>
           <w:b/>
         </w:rPr>
-        <w:t>J. Jose</w:t>
-      </w:r>
-      <w:r>
-        <w:t xml:space="preserve">, M. Moreno, J. Pinilla-Dutoit, J. Rodrigues &amp; J. Du Buf (2012). </w:t>
-      </w:r>
+        <w:t>João Tiago Pereira Nunes José</w:t>
+      </w:r>
+    </w:p>
+    <w:p>
+      <w:pPr>
+        <w:pStyle w:val="Pubvenue"/>
+        <w:keepNext w:val="0"/>
+        <w:rPr>
+          <w:rFonts w:hint="eastAsia"/>
+        </w:rPr>
+      </w:pPr>
+      <w:r>
+        <w:t>LAP LAMBERT Academic Publishing. ISBN 978-3-659-45730-2.</w:t>
+      </w:r>
+    </w:p>
+    <w:p>
+      <w:pPr>
+        <w:pStyle w:val="Heading1"/>
+        <w:pageBreakBefore/>
+      </w:pPr>
+      <w:r>
+        <w:lastRenderedPageBreak/>
+        <w:t>Education and teaching</w:t>
+      </w:r>
+    </w:p>
+    <w:p>
+      <w:pPr>
+        <w:pStyle w:val="Heading2"/>
+        <w:spacing w:before="0"/>
+      </w:pPr>
+      <w:r>
+        <w:t>Education</w:t>
+      </w:r>
+    </w:p>
+    <w:p>
+      <w:pPr>
+        <w:pStyle w:val="Heading3"/>
+      </w:pPr>
+      <w:r>
+        <w:t>Doctoral studies in Computer Science Engineering</w:t>
+      </w:r>
+    </w:p>
+    <w:p>
+      <w:pPr>
+        <w:pStyle w:val="Meta"/>
+        <w:tabs>
+          <w:tab w:val="right" w:pos="9637"/>
+        </w:tabs>
+        <w:rPr>
+          <w:rFonts w:hint="eastAsia"/>
+        </w:rPr>
+      </w:pPr>
+      <w:r>
+        <w:t>University of Algarve</w:t>
+      </w:r>
+      <w:r>
+        <w:rPr>
+          <w:color w:val="176575"/>
+        </w:rPr>
+        <w:tab/>
+      </w:r>
+      <w:r>
+        <w:rPr>
+          <w:color w:val="176575"/>
+        </w:rPr>
+        <w:t>Sep 2011 - Oct 2013</w:t>
+      </w:r>
+    </w:p>
+    <w:p>
+      <w:pPr>
+        <w:pStyle w:val="Compact"/>
+        <w:rPr>
+          <w:rFonts w:hint="eastAsia"/>
+        </w:rPr>
+      </w:pPr>
+      <w:r>
+        <w:t>Completed the programme expected for the first two years; doctorate not completed and studies subsequently suspended. Research covered robust visual recognition of objects and environments for blind users, literature review and algorithm comparison, an initial object-recognition model, and hand and arm segmentation.</w:t>
+      </w:r>
+    </w:p>
+    <w:p>
+      <w:pPr>
+        <w:pStyle w:val="Heading3"/>
+      </w:pPr>
+      <w:r>
+        <w:t>MSc in Computer Science Engineering</w:t>
+      </w:r>
+    </w:p>
+    <w:p>
+      <w:pPr>
+        <w:pStyle w:val="Meta"/>
+        <w:tabs>
+          <w:tab w:val="right" w:pos="9637"/>
+        </w:tabs>
+        <w:rPr>
+          <w:rFonts w:hint="eastAsia"/>
+        </w:rPr>
+      </w:pPr>
+      <w:r>
+        <w:t>University of Algarve</w:t>
+      </w:r>
+      <w:r>
+        <w:rPr>
+          <w:color w:val="176575"/>
+        </w:rPr>
+        <w:tab/>
+        <w:t>Sep 2008 - Jun 2011</w:t>
+      </w:r>
+    </w:p>
+    <w:p>
+      <w:pPr>
+        <w:pStyle w:val="Compact"/>
+        <w:rPr>
+          <w:rFonts w:hint="eastAsia"/>
+        </w:rPr>
+      </w:pPr>
       <w:r>
         <w:rPr>
           <w:b/>
         </w:rPr>
-        <w:t xml:space="preserve">Blavigator: a navigation aid for blind persons. </w:t>
-      </w:r>
-      <w:r>
-        <w:t xml:space="preserve">European Conference on Visual Perception (ECVP 2012). Perception, 41(1_suppl), p. 99, abstract 97. </w:t>
-      </w:r>
-      <w:hyperlink r:id="rId25" w:anchor="page=99">
+        <w:t xml:space="preserve">Degree grade: 16/20. </w:t>
+      </w:r>
+      <w:r>
+        <w:t>Dissertation grade: 18/20.</w:t>
+      </w:r>
+    </w:p>
+    <w:p>
+      <w:pPr>
+        <w:pStyle w:val="Compact"/>
+        <w:rPr>
+          <w:rFonts w:hint="eastAsia"/>
+        </w:rPr>
+      </w:pPr>
+      <w:r>
+        <w:rPr>
+          <w:b/>
+        </w:rPr>
+        <w:t xml:space="preserve">Dissertation (2010): </w:t>
+      </w:r>
+      <w:r>
+        <w:rPr>
+          <w:i/>
+        </w:rPr>
+        <w:t>Real-time path and obstacle detection for blind persons.</w:t>
+      </w:r>
+    </w:p>
+    <w:p>
+      <w:pPr>
+        <w:pStyle w:val="Compact"/>
+        <w:rPr>
+          <w:rFonts w:hint="eastAsia"/>
+        </w:rPr>
+      </w:pPr>
+      <w:r>
+        <w:t>Real-time path and obstacle detection on a small netbook using C/C++, OpenCV and Qt. Supervisor: Prof. Johannes Martinus Hubertina du Buf.</w:t>
+      </w:r>
+    </w:p>
+    <w:p>
+      <w:pPr>
+        <w:pStyle w:val="Contact"/>
+        <w:spacing w:after="160"/>
+        <w:rPr>
+          <w:rFonts w:hint="eastAsia"/>
+        </w:rPr>
+      </w:pPr>
+      <w:hyperlink r:id="rId26">
         <w:r>
           <w:rPr>
-            <w:color w:val="174B70"/>
-            <w:u w:val="single"/>
+            <w:color w:val="176575"/>
           </w:rPr>
-          <w:t>ECVP 2012 abstracts · PDF, page 99</w:t>
+          <w:t>Dissertation · University of Algarve repository</w:t>
         </w:r>
       </w:hyperlink>
     </w:p>
     <w:p>
       <w:pPr>
-        <w:pStyle w:val="Heading2"/>
-      </w:pPr>
-      <w:r>
-        <w:t>Book</w:t>
+        <w:pStyle w:val="Heading3"/>
+      </w:pPr>
+      <w:r>
+        <w:t>BSc in Computer Science Engineering</w:t>
       </w:r>
     </w:p>
     <w:p>
       <w:pPr>
-        <w:pStyle w:val="Publication"/>
-      </w:pPr>
-      <w:r>
-        <w:rPr>
-          <w:b/>
-        </w:rPr>
-        <w:t>João Tiago Pereira Nunes José</w:t>
-      </w:r>
-      <w:r>
-        <w:t xml:space="preserve"> (2013). </w:t>
-      </w:r>
-      <w:r>
-        <w:rPr>
-          <w:b/>
-        </w:rPr>
-        <w:t xml:space="preserve">Real-time path and obstacle detection for blind persons. </w:t>
-      </w:r>
-      <w:r>
-        <w:t xml:space="preserve">ISBN 978-3-659-45730-2. </w:t>
+        <w:pStyle w:val="Meta"/>
+        <w:tabs>
+          <w:tab w:val="right" w:pos="9637"/>
+        </w:tabs>
+        <w:rPr>
+          <w:rFonts w:hint="eastAsia"/>
+        </w:rPr>
+      </w:pPr>
+      <w:r>
+        <w:t>University of Algarve</w:t>
+      </w:r>
+      <w:r>
+        <w:rPr>
+          <w:color w:val="176575"/>
+        </w:rPr>
+        <w:tab/>
+        <w:t>Sep 2003 - Jul 2008</w:t>
       </w:r>
     </w:p>
     <w:p>
-      <w:r>
-        <w:br w:type="page"/>
+      <w:pPr>
+        <w:pStyle w:val="Compact"/>
+        <w:rPr>
+          <w:rFonts w:hint="eastAsia"/>
+        </w:rPr>
+      </w:pPr>
+      <w:r>
+        <w:t>Selected project: a web content-management system for football news and results, using HTML, PHP, JavaScript, PostgreSQL and PL/pgSQL. Project grade: 19/20.</w:t>
       </w:r>
     </w:p>
     <w:p>
       <w:pPr>
-        <w:pStyle w:val="Heading1"/>
-      </w:pPr>
-      <w:r>
-        <w:lastRenderedPageBreak/>
-        <w:t>Research grants and awards</w:t>
+        <w:pStyle w:val="Heading3"/>
+      </w:pPr>
+      <w:r>
+        <w:t>Studies in Electronics Engineering</w:t>
       </w:r>
     </w:p>
     <w:p>
       <w:pPr>
-        <w:pStyle w:val="Heading2"/>
-      </w:pPr>
-      <w:r>
-        <w:t>SmartVision research grant</w:t>
+        <w:pStyle w:val="Meta"/>
+        <w:tabs>
+          <w:tab w:val="right" w:pos="9637"/>
+        </w:tabs>
+        <w:rPr>
+          <w:rFonts w:hint="eastAsia"/>
+        </w:rPr>
+      </w:pPr>
+      <w:r>
+        <w:t>University of Algarve</w:t>
+      </w:r>
+      <w:r>
+        <w:rPr>
+          <w:color w:val="176575"/>
+        </w:rPr>
+        <w:tab/>
+        <w:t>Sep 2001 - Jul 2003</w:t>
       </w:r>
     </w:p>
     <w:p>
       <w:pPr>
-        <w:pStyle w:val="Metadata"/>
-      </w:pPr>
-      <w:r>
-        <w:t>Project PTDC/EIA/73633/2006</w:t>
+        <w:pStyle w:val="Compact"/>
+        <w:rPr>
+          <w:rFonts w:hint="eastAsia"/>
+        </w:rPr>
+      </w:pPr>
+      <w:r>
+        <w:t>Changed major to Computer Science Engineering; no degree awarded in Electronics Engineering.</w:t>
       </w:r>
     </w:p>
     <w:p>
-      <w:r>
-        <w:t>SmartVision: active vision for the blind.</w:t>
+      <w:pPr>
+        <w:pStyle w:val="Heading2"/>
+        <w:spacing w:before="240"/>
+      </w:pPr>
+      <w:r>
+        <w:t>Teaching</w:t>
       </w:r>
     </w:p>
     <w:p>
       <w:pPr>
-        <w:pStyle w:val="Heading2"/>
-      </w:pPr>
-      <w:r>
-        <w:t>Blavigator research grant</w:t>
+        <w:pStyle w:val="Heading3"/>
+      </w:pPr>
+      <w:r>
+        <w:t>Cisco CCNA Exploration Instructor</w:t>
       </w:r>
     </w:p>
     <w:p>
       <w:pPr>
-        <w:pStyle w:val="Metadata"/>
-      </w:pPr>
-      <w:r>
-        <w:t>Project RIPD/ADA/109690/2009</w:t>
+        <w:pStyle w:val="Meta"/>
+        <w:tabs>
+          <w:tab w:val="right" w:pos="9637"/>
+        </w:tabs>
+        <w:rPr>
+          <w:rFonts w:hint="eastAsia"/>
+        </w:rPr>
+      </w:pPr>
+      <w:r>
+        <w:t>Cisco Academy, FCT - University of Algarve</w:t>
+      </w:r>
+      <w:r>
+        <w:rPr>
+          <w:color w:val="176575"/>
+        </w:rPr>
+        <w:tab/>
+        <w:t>Nov 2008 - Jun 2009</w:t>
       </w:r>
     </w:p>
     <w:p>
-      <w:r>
-        <w:t>Blavigator: a cheap and reliable navigation aid for the blind.</w:t>
+      <w:pPr>
+        <w:pStyle w:val="Compact"/>
+        <w:spacing w:after="60"/>
+        <w:rPr>
+          <w:rFonts w:hint="eastAsia"/>
+        </w:rPr>
+      </w:pPr>
+      <w:r>
+        <w:t>Faro, Portugal. Taught the four CCNA Exploration modules:</w:t>
       </w:r>
     </w:p>
     <w:p>
       <w:pPr>
-        <w:pStyle w:val="Heading2"/>
-      </w:pPr>
-      <w:r>
-        <w:t>Doctoral research grant</w:t>
+        <w:pStyle w:val="Compact"/>
+        <w:rPr>
+          <w:rFonts w:hint="eastAsia"/>
+        </w:rPr>
+      </w:pPr>
+      <w:r>
+        <w:rPr>
+          <w:b/>
+        </w:rPr>
+        <w:t xml:space="preserve">Network Fundamentals. </w:t>
+      </w:r>
+      <w:r>
+        <w:t>Network models and protocols, Ethernet, IP addressing and subnetting.</w:t>
       </w:r>
     </w:p>
     <w:p>
       <w:pPr>
-        <w:pStyle w:val="Metadata"/>
-      </w:pPr>
-      <w:r>
-        <w:t>SFRH/BD/82310/2011</w:t>
+        <w:pStyle w:val="Compact"/>
+        <w:rPr>
+          <w:rFonts w:hint="eastAsia"/>
+        </w:rPr>
+      </w:pPr>
+      <w:r>
+        <w:rPr>
+          <w:b/>
+        </w:rPr>
+        <w:t xml:space="preserve">Routing Protocols and Concepts. </w:t>
+      </w:r>
+      <w:r>
+        <w:t>Routing fundamentals, VLSM, RIP, OSPF and EIGRP.</w:t>
       </w:r>
     </w:p>
     <w:p>
-      <w:r>
-        <w:t>Robust visual recognition of objects and environments for blind persons.</w:t>
+      <w:pPr>
+        <w:pStyle w:val="Compact"/>
+        <w:rPr>
+          <w:rFonts w:hint="eastAsia"/>
+        </w:rPr>
+      </w:pPr>
+      <w:r>
+        <w:rPr>
+          <w:b/>
+        </w:rPr>
+        <w:t xml:space="preserve">LAN Switching and Wireless. </w:t>
+      </w:r>
+      <w:r>
+        <w:t>Switch configuration, VLANs, trunking, spanning tree and WLANs.</w:t>
       </w:r>
     </w:p>
     <w:p>
       <w:pPr>
-        <w:pStyle w:val="Heading2"/>
-      </w:pPr>
-      <w:r>
-        <w:t>CERATONIA award grant</w:t>
+        <w:pStyle w:val="Compact"/>
+        <w:rPr>
+          <w:rFonts w:hint="eastAsia"/>
+        </w:rPr>
+      </w:pPr>
+      <w:r>
+        <w:rPr>
+          <w:b/>
+        </w:rPr>
+        <w:t xml:space="preserve">Accessing the WAN. </w:t>
+      </w:r>
+      <w:r>
+        <w:t>WAN technologies, ACLs, PPP/PPPoE, Frame Relay and VPN concepts.</w:t>
       </w:r>
     </w:p>
     <w:p>
       <w:pPr>
-        <w:pStyle w:val="Metadata"/>
-      </w:pPr>
-      <w:r>
-        <w:t>3.70.13.001</w:t>
+        <w:pStyle w:val="Heading2"/>
+        <w:spacing w:before="240"/>
+      </w:pPr>
+      <w:r>
+        <w:t>Training and qualifications</w:t>
       </w:r>
     </w:p>
     <w:p>
-      <w:r>
-        <w:t>The Amateur Painter.</w:t>
+      <w:pPr>
+        <w:pStyle w:val="Compact"/>
+        <w:rPr>
+          <w:rFonts w:hint="eastAsia"/>
+        </w:rPr>
+      </w:pPr>
+      <w:r>
+        <w:rPr>
+          <w:b/>
+        </w:rPr>
+        <w:t xml:space="preserve">Certificate of Pedagogical Competences (CCP) · 2015. </w:t>
+      </w:r>
+      <w:r>
+        <w:t>IEFP, March 2015. Initial trainer training in pedagogical methods and competences at Training House, Faro, January-March 2015.</w:t>
       </w:r>
     </w:p>
     <w:p>
       <w:pPr>
-        <w:pStyle w:val="Heading1"/>
-      </w:pPr>
-      <w:r>
-        <w:t>Teaching</w:t>
+        <w:pStyle w:val="Compact"/>
+        <w:rPr>
+          <w:rFonts w:hint="eastAsia"/>
+        </w:rPr>
+      </w:pPr>
+      <w:r>
+        <w:rPr>
+          <w:b/>
+        </w:rPr>
+        <w:t xml:space="preserve">Cisco Certified Network Associate (CCNA) · 2008. </w:t>
+      </w:r>
+      <w:r>
+        <w:t>Cisco Academy, FCT - University of Algarve, October 2007-May 2008. Modules 1-4; average grade: 90%.</w:t>
       </w:r>
     </w:p>
     <w:p>
       <w:pPr>
-        <w:pStyle w:val="Heading2"/>
-      </w:pPr>
-      <w:r>
-        <w:t>Cisco CCNA Exploration Instructor</w:t>
+        <w:pStyle w:val="Compact"/>
+        <w:rPr>
+          <w:rFonts w:hint="eastAsia"/>
+        </w:rPr>
+      </w:pPr>
+      <w:r>
+        <w:rPr>
+          <w:b/>
+        </w:rPr>
+        <w:t xml:space="preserve">Professional Scrum Master I · 2018. </w:t>
+      </w:r>
+      <w:r>
+        <w:t>Scrum.org, March 2018.</w:t>
       </w:r>
     </w:p>
     <w:p>
       <w:pPr>
-        <w:pStyle w:val="Metadata"/>
-      </w:pPr>
-      <w:r>
-        <w:t>Cisco Academy, FCT - University of Algarve | Nov 2008 - Jun 2009 | Faro, Portugal</w:t>
+        <w:pStyle w:val="Heading1"/>
+        <w:pageBreakBefore/>
+      </w:pPr>
+      <w:r>
+        <w:lastRenderedPageBreak/>
+        <w:t>Professional experience</w:t>
       </w:r>
     </w:p>
     <w:p>
-      <w:r>
-        <w:rPr>
-          <w:b/>
-        </w:rPr>
-        <w:t xml:space="preserve">Network Fundamentals. </w:t>
-      </w:r>
-      <w:r>
-        <w:t>Network models and protocols, Ethernet, IP addressing and subnetting.</w:t>
+      <w:pPr>
+        <w:pStyle w:val="Heading3"/>
+      </w:pPr>
+      <w:r>
+        <w:t>Independent Software Engineer</w:t>
       </w:r>
     </w:p>
     <w:p>
-      <w:r>
-        <w:rPr>
-          <w:b/>
-        </w:rPr>
-        <w:t xml:space="preserve">Routing Protocols and Concepts. </w:t>
-      </w:r>
-      <w:r>
-        <w:t>Routing fundamentals, VLSM, RIP, OSPF and EIGRP.</w:t>
+      <w:pPr>
+        <w:pStyle w:val="Meta"/>
+        <w:tabs>
+          <w:tab w:val="right" w:pos="9637"/>
+        </w:tabs>
+        <w:rPr>
+          <w:rFonts w:hint="eastAsia"/>
+        </w:rPr>
+      </w:pPr>
+      <w:r>
+        <w:t>JTJ Software · Netherlands and Portugal</w:t>
+      </w:r>
+      <w:r>
+        <w:rPr>
+          <w:color w:val="176575"/>
+        </w:rPr>
+        <w:tab/>
+        <w:t>Nov 2022 - Present</w:t>
       </w:r>
     </w:p>
     <w:p>
+      <w:pPr>
+        <w:pStyle w:val="Compact"/>
+        <w:rPr>
+          <w:rFonts w:hint="eastAsia"/>
+        </w:rPr>
+      </w:pPr>
       <w:r>
         <w:rPr>
           <w:b/>
         </w:rPr>
-        <w:t xml:space="preserve">LAN Switching and Wireless. </w:t>
-      </w:r>
-      <w:r>
-        <w:t>Switch configuration, VLANs, trunking, spanning tree and WLANs.</w:t>
+        <w:t xml:space="preserve">LVNL SIM Builder · Jun 2024 - Feb 2026. </w:t>
+      </w:r>
+      <w:r>
+        <w:t>Contributed across the full stack of a web-based ATM scenario platform built on an adapted BlueSky simulator, combining development and Scrum Master responsibilities.</w:t>
       </w:r>
     </w:p>
     <w:p>
+      <w:pPr>
+        <w:pStyle w:val="Compact"/>
+        <w:rPr>
+          <w:rFonts w:hint="eastAsia"/>
+        </w:rPr>
+      </w:pPr>
       <w:r>
         <w:rPr>
           <w:b/>
         </w:rPr>
-        <w:t xml:space="preserve">Accessing the WAN. </w:t>
-      </w:r>
-      <w:r>
-        <w:t>WAN technologies, ACLs, PPP/PPPoE, Frame Relay and VPN concepts.</w:t>
+        <w:t xml:space="preserve">LVNL iCAS SIM · Nov 2022 - Dec 2025. </w:t>
+      </w:r>
+      <w:r>
+        <w:t>Developed and maintained the simulation and training environment for the Netherlands’ next-generation air traffic management system, including integration with peripheral systems.</w:t>
       </w:r>
     </w:p>
     <w:p>
       <w:pPr>
-        <w:pStyle w:val="Heading1"/>
-      </w:pPr>
-      <w:r>
-        <w:t>Training and qualifications</w:t>
+        <w:pStyle w:val="Compact"/>
+        <w:rPr>
+          <w:rFonts w:hint="eastAsia"/>
+        </w:rPr>
+      </w:pPr>
+      <w:r>
+        <w:rPr>
+          <w:b/>
+        </w:rPr>
+        <w:t xml:space="preserve">Portuguese real-estate software · Jan 2026 - Present. </w:t>
+      </w:r>
+      <w:r>
+        <w:t>Product discovery, architecture and implementation for the Portuguese real-estate market.</w:t>
       </w:r>
     </w:p>
     <w:p>
       <w:pPr>
-        <w:pStyle w:val="Heading2"/>
-      </w:pPr>
-      <w:r>
-        <w:t>Certificate of Pedagogical Competences (CCP)</w:t>
+        <w:pStyle w:val="Heading3"/>
+      </w:pPr>
+      <w:r>
+        <w:t>C++ Software Developer</w:t>
       </w:r>
     </w:p>
     <w:p>
       <w:pPr>
-        <w:pStyle w:val="Metadata"/>
-      </w:pPr>
-      <w:r>
-        <w:t>IEFP | Mar 2015</w:t>
+        <w:pStyle w:val="Meta"/>
+        <w:tabs>
+          <w:tab w:val="right" w:pos="9637"/>
+        </w:tabs>
+        <w:rPr>
+          <w:rFonts w:hint="eastAsia"/>
+        </w:rPr>
+      </w:pPr>
+      <w:r>
+        <w:t>Accent Pointe B.V. · Netherlands</w:t>
+      </w:r>
+      <w:r>
+        <w:rPr>
+          <w:color w:val="176575"/>
+        </w:rPr>
+        <w:tab/>
+        <w:t>May 2021 - Nov 2022</w:t>
       </w:r>
     </w:p>
     <w:p>
-      <w:r>
-        <w:t>Initial trainer training at Training House, Faro (Jan-Mar 2015), covering pedagogical methods and competences.</w:t>
+      <w:pPr>
+        <w:pStyle w:val="Compact"/>
+        <w:rPr>
+          <w:rFonts w:hint="eastAsia"/>
+        </w:rPr>
+      </w:pPr>
+      <w:r>
+        <w:t>Developed trading software integrated with brokers and market-data feeds; modernised a legacy MFC and Microsoft RPC codebase.</w:t>
       </w:r>
     </w:p>
     <w:p>
       <w:pPr>
-        <w:pStyle w:val="Heading2"/>
-      </w:pPr>
-      <w:r>
-        <w:t>Cisco Certified Network Associate (CCNA)</w:t>
+        <w:pStyle w:val="Heading3"/>
+      </w:pPr>
+      <w:r>
+        <w:t>C++ Software Developer</w:t>
       </w:r>
     </w:p>
     <w:p>
       <w:pPr>
-        <w:pStyle w:val="Metadata"/>
-      </w:pPr>
-      <w:r>
-        <w:t>Cisco Academy, FCT - University of Algarve | Oct 2007 - May 2008</w:t>
+        <w:pStyle w:val="Meta"/>
+        <w:tabs>
+          <w:tab w:val="right" w:pos="9637"/>
+        </w:tabs>
+        <w:rPr>
+          <w:rFonts w:hint="eastAsia"/>
+        </w:rPr>
+      </w:pPr>
+      <w:r>
+        <w:t>ABN AMRO Clearing Bank · Netherlands</w:t>
+      </w:r>
+      <w:r>
+        <w:rPr>
+          <w:color w:val="176575"/>
+        </w:rPr>
+        <w:tab/>
+        <w:t>Nov 2016 - May 2021</w:t>
       </w:r>
     </w:p>
     <w:p>
-      <w:r>
-        <w:t>Modules 1-4; average grade: 90%.</w:t>
+      <w:pPr>
+        <w:pStyle w:val="Compact"/>
+        <w:rPr>
+          <w:rFonts w:hint="eastAsia"/>
+        </w:rPr>
+      </w:pPr>
+      <w:r>
+        <w:t>Delivered financial risk-management software and integrated service interfaces, messaging and authentication components.</w:t>
       </w:r>
     </w:p>
     <w:p>
       <w:pPr>
-        <w:pStyle w:val="Heading2"/>
-      </w:pPr>
-      <w:r>
-        <w:t>Professional Scrum Master I</w:t>
+        <w:pStyle w:val="Heading3"/>
+      </w:pPr>
+      <w:r>
+        <w:t>Software Engineer</w:t>
       </w:r>
     </w:p>
     <w:p>
       <w:pPr>
-        <w:pStyle w:val="Metadata"/>
-      </w:pPr>
-      <w:r>
-        <w:t>Scrum.org | Mar 2018</w:t>
+        <w:pStyle w:val="Meta"/>
+        <w:tabs>
+          <w:tab w:val="right" w:pos="9637"/>
+        </w:tabs>
+        <w:rPr>
+          <w:rFonts w:hint="eastAsia"/>
+        </w:rPr>
+      </w:pPr>
+      <w:r>
+        <w:t>Frinch · Faro, Portugal / Remote</w:t>
+      </w:r>
+      <w:r>
+        <w:rPr>
+          <w:color w:val="176575"/>
+        </w:rPr>
+        <w:tab/>
+        <w:t>Apr 2016 - Oct 2016</w:t>
       </w:r>
     </w:p>
     <w:p>
       <w:pPr>
-        <w:pStyle w:val="Heading1"/>
-      </w:pPr>
-      <w:r>
-        <w:t>Languages</w:t>
+        <w:pStyle w:val="Compact"/>
+        <w:rPr>
+          <w:rFonts w:hint="eastAsia"/>
+        </w:rPr>
+      </w:pPr>
+      <w:r>
+        <w:t>Developed Product Information Management software with a distributed team working with the company’s Munich headquarters.</w:t>
       </w:r>
     </w:p>
     <w:p>
-      <w:r>
-        <w:t>Portuguese (native), English (fluent), Dutch (intermediate), Spanish (good).</w:t>
+      <w:pPr>
+        <w:pStyle w:val="Heading3"/>
+      </w:pPr>
+      <w:r>
+        <w:t>Software Engineer and Lead Researcher</w:t>
       </w:r>
     </w:p>
     <w:p>
-      <w:r>
-        <w:br w:type="page"/>
+      <w:pPr>
+        <w:pStyle w:val="Meta"/>
+        <w:tabs>
+          <w:tab w:val="right" w:pos="9637"/>
+        </w:tabs>
+        <w:rPr>
+          <w:rFonts w:hint="eastAsia"/>
+        </w:rPr>
+      </w:pPr>
+      <w:r>
+        <w:t>Evision Industry Software · Faro, Portugal</w:t>
+      </w:r>
+      <w:r>
+        <w:rPr>
+          <w:color w:val="176575"/>
+        </w:rPr>
+        <w:tab/>
+        <w:t>Oct 2013 - Sep 2015</w:t>
       </w:r>
     </w:p>
     <w:p>
       <w:pPr>
-        <w:pStyle w:val="Heading1"/>
-      </w:pPr>
-      <w:r>
-        <w:lastRenderedPageBreak/>
-        <w:t>Selected professional and applied experience</w:t>
+        <w:pStyle w:val="Compact"/>
+        <w:rPr>
+          <w:rFonts w:hint="eastAsia"/>
+        </w:rPr>
+      </w:pPr>
+      <w:r>
+        <w:t>Developed algorithms for text detection, raster-to-vector conversion and automatic interpretation of piping and instrumentation diagrams and AutoCAD files, including pipe and instrument recognition. Worked with the team in The Hague using C# and TypeScript.</w:t>
       </w:r>
     </w:p>
     <w:p>
       <w:pPr>
-        <w:pStyle w:val="Heading2"/>
-      </w:pPr>
-      <w:r>
-        <w:t>Independent Software Engineer at JTJ Software</w:t>
+        <w:pStyle w:val="Heading3"/>
+      </w:pPr>
+      <w:r>
+        <w:t>Invited Expert</w:t>
       </w:r>
     </w:p>
     <w:p>
       <w:pPr>
-        <w:pStyle w:val="Metadata"/>
-      </w:pPr>
-      <w:r>
-        <w:t>Nov 2022 - Present | Netherlands and Portugal</w:t>
+        <w:pStyle w:val="Meta"/>
+        <w:tabs>
+          <w:tab w:val="right" w:pos="9637"/>
+        </w:tabs>
+        <w:rPr>
+          <w:rFonts w:hint="eastAsia"/>
+        </w:rPr>
+      </w:pPr>
+      <w:r>
+        <w:t>SEF · Faro, Portugal</w:t>
+      </w:r>
+      <w:r>
+        <w:rPr>
+          <w:color w:val="176575"/>
+        </w:rPr>
+        <w:tab/>
+        <w:t>May 2007 - Aug 2007</w:t>
       </w:r>
     </w:p>
     <w:p>
-      <w:r>
-        <w:rPr>
-          <w:b/>
-        </w:rPr>
-        <w:t xml:space="preserve">LVNL SIM Builder (Jun 2024 - Feb 2026). </w:t>
-      </w:r>
-      <w:r>
-        <w:t>Contributed across the full stack of a web-based ATM scenario platform built on an adapted BlueSky simulator, combining development and Scrum Master responsibilities.</w:t>
+      <w:pPr>
+        <w:pStyle w:val="Compact"/>
+        <w:rPr>
+          <w:rFonts w:hint="eastAsia"/>
+        </w:rPr>
+      </w:pPr>
+      <w:r>
+        <w:t>Participated in the quality assessment of the electronic border-control system installed at Faro Airport.</w:t>
       </w:r>
     </w:p>
     <w:p>
-      <w:r>
-        <w:rPr>
-          <w:b/>
-        </w:rPr>
-        <w:t xml:space="preserve">LVNL iCAS SIM (Nov 2022 - Dec 2025). </w:t>
-      </w:r>
-      <w:r>
-        <w:t>Developed and maintained the simulation and training environment for the Netherlands' next-generation air traffic management system, including integration with peripheral systems.</w:t>
+      <w:pPr>
+        <w:pStyle w:val="Heading2"/>
+        <w:spacing w:before="260"/>
+      </w:pPr>
+      <w:r>
+        <w:t>Technical skills</w:t>
       </w:r>
     </w:p>
     <w:p>
+      <w:pPr>
+        <w:pStyle w:val="Compact"/>
+        <w:rPr>
+          <w:rFonts w:hint="eastAsia"/>
+        </w:rPr>
+      </w:pPr>
       <w:r>
         <w:rPr>
           <w:b/>
         </w:rPr>
-        <w:t xml:space="preserve">Portuguese real-estate software (Jan 2026 - Present). </w:t>
-      </w:r>
-      <w:r>
-        <w:t>Product discovery, architecture and implementation for the Portuguese real-estate market.</w:t>
+        <w:t xml:space="preserve">Research and computer vision. </w:t>
+      </w:r>
+      <w:r>
+        <w:t>C/C++, Matlab, OpenCV and Qt; real-time path and obstacle detection, visual object recognition, text detection and raster-to-vector conversion.</w:t>
       </w:r>
     </w:p>
     <w:p>
       <w:pPr>
-        <w:pStyle w:val="Heading2"/>
-      </w:pPr>
-      <w:r>
-        <w:t>C++ Software Developer at Accent Pointe B.V.</w:t>
+        <w:pStyle w:val="Compact"/>
+        <w:rPr>
+          <w:rFonts w:hint="eastAsia"/>
+        </w:rPr>
+      </w:pPr>
+      <w:r>
+        <w:rPr>
+          <w:b/>
+        </w:rPr>
+        <w:t xml:space="preserve">Software engineering. </w:t>
+      </w:r>
+      <w:r>
+        <w:t>C++, Python, C, Go, Ada, Bash, C# and TypeScript; HTML, PHP and JavaScript; REST APIs, ZeroMQ, Kafka and Protobuf; PostgreSQL, PL/pgSQL and Ingres; Git, CMake, GCC and GDB; pytest and C++ testing tools; Linux, Docker and OpenShift.</w:t>
       </w:r>
     </w:p>
     <w:p>
       <w:pPr>
-        <w:pStyle w:val="Metadata"/>
-      </w:pPr>
-      <w:r>
-        <w:t>May 2021 - Nov 2022 | Netherlands</w:t>
+        <w:pStyle w:val="Heading2"/>
+        <w:spacing w:before="220"/>
+      </w:pPr>
+      <w:r>
+        <w:t>Languages</w:t>
       </w:r>
     </w:p>
     <w:p>
-      <w:r>
-        <w:t>Developed trading software integrated with brokers and market-data feeds; modernised a legacy MFC and Microsoft RPC codebase.</w:t>
-      </w:r>
-    </w:p>
-    <w:p>
-      <w:pPr>
-        <w:pStyle w:val="Heading2"/>
-      </w:pPr>
-      <w:r>
-        <w:t>C++ Software Developer at ABN AMRO Clearing Bank</w:t>
-      </w:r>
-    </w:p>
-    <w:p>
-      <w:pPr>
-        <w:pStyle w:val="Metadata"/>
-      </w:pPr>
-      <w:r>
-        <w:t>Nov 2016 - May 2021 | Netherlands</w:t>
-      </w:r>
-    </w:p>
-    <w:p>
-      <w:r>
-        <w:t>Delivered financial risk-management software and integrated service interfaces, messaging and authentication components.</w:t>
-      </w:r>
-    </w:p>
-    <w:p>
-      <w:pPr>
-        <w:pStyle w:val="Heading2"/>
-      </w:pPr>
-      <w:r>
-        <w:t>Software Engineer at Frinch</w:t>
-      </w:r>
-    </w:p>
-    <w:p>
-      <w:pPr>
-        <w:pStyle w:val="Metadata"/>
-      </w:pPr>
-      <w:r>
-        <w:t>Apr 2016 - Oct 2016 | Faro, Portugal / Remote</w:t>
-      </w:r>
-    </w:p>
-    <w:p>
-      <w:r>
-        <w:t>Developed Product Information Management software with a distributed team working with the company's Munich headquarters.</w:t>
-      </w:r>
-    </w:p>
-    <w:p>
-      <w:pPr>
-        <w:pStyle w:val="Heading2"/>
-      </w:pPr>
-      <w:r>
-        <w:t>Software Engineer and Lead Researcher at Evision Industry Software</w:t>
-      </w:r>
-    </w:p>
-    <w:p>
-      <w:pPr>
-        <w:pStyle w:val="Metadata"/>
-      </w:pPr>
-      <w:r>
-        <w:t>Oct 2013 - Sep 2015 | Faro, Portugal</w:t>
-      </w:r>
-    </w:p>
-    <w:p>
-      <w:r>
-        <w:t>Developed algorithms for text detection, raster-to-vector conversion and automatic interpretation of piping and instrumentation diagrams and AutoCAD files, including pipe and instrument recognition. Worked with the team in The Hague using C# and TypeScript.</w:t>
-      </w:r>
-    </w:p>
-    <w:p>
-      <w:pPr>
-        <w:pStyle w:val="Heading2"/>
-      </w:pPr>
-      <w:r>
-        <w:t>Invited Expert at SEF</w:t>
-      </w:r>
-    </w:p>
-    <w:p>
-      <w:pPr>
-        <w:pStyle w:val="Metadata"/>
-      </w:pPr>
-      <w:r>
-        <w:t>May 2007 - Aug 2007 | Faro, Portugal</w:t>
-      </w:r>
-    </w:p>
-    <w:p>
-      <w:r>
-        <w:t>Participated in the quality assessment of the electronic border-control system installed at Faro Airport.</w:t>
-      </w:r>
-    </w:p>
-    <w:p>
-      <w:pPr>
-        <w:pStyle w:val="Heading1"/>
-      </w:pPr>
-      <w:r>
-        <w:t>Technical skills</w:t>
-      </w:r>
-    </w:p>
-    <w:p>
-      <w:r>
-        <w:rPr>
-          <w:b/>
-        </w:rPr>
-        <w:t xml:space="preserve">Research and computer vision. </w:t>
-      </w:r>
-      <w:r>
-        <w:t>C/C++, Matlab, OpenCV and Qt; real-time path and obstacle detection, visual object recognition, text detection and raster-to-vector conversion.</w:t>
-      </w:r>
-    </w:p>
-    <w:p>
-      <w:r>
-        <w:rPr>
-          <w:b/>
-        </w:rPr>
-        <w:t xml:space="preserve">Software engineering. </w:t>
-      </w:r>
-      <w:r>
-        <w:t>C++, Python, C, Go, Ada, Bash, C# and TypeScript; HTML, PHP and JavaScript; REST APIs, ZeroMQ, Kafka and Protobuf; PostgreSQL, PL/pgSQL and Ingres; Git, CMake, GCC and GDB; pytest and C++ testing tools; Linux, Docker and OpenShift.</w:t>
+      <w:pPr>
+        <w:pStyle w:val="Compact"/>
+        <w:rPr>
+          <w:rFonts w:hint="eastAsia"/>
+        </w:rPr>
+      </w:pPr>
+      <w:r>
+        <w:t>Portuguese · Native     English · Fluent     Dutch · Intermediate     Spanish · Good</w:t>
       </w:r>
     </w:p>
     <w:sectPr>
-      <w:headerReference w:type="even" r:id="rId26"/>
-      <w:headerReference w:type="default" r:id="rId27"/>
-      <w:footerReference w:type="even" r:id="rId28"/>
-      <w:footerReference w:type="default" r:id="rId29"/>
-      <w:headerReference w:type="first" r:id="rId30"/>
-      <w:footerReference w:type="first" r:id="rId31"/>
+      <w:headerReference w:type="even" r:id="rId27"/>
+      <w:headerReference w:type="default" r:id="rId28"/>
+      <w:footerReference w:type="even" r:id="rId29"/>
+      <w:footerReference w:type="default" r:id="rId30"/>
+      <w:headerReference w:type="first" r:id="rId31"/>
+      <w:footerReference w:type="first" r:id="rId32"/>
       <w:pgSz w:w="11905" w:h="16838"/>
-      <w:pgMar w:top="893" w:right="1037" w:bottom="835" w:left="1037" w:header="403" w:footer="432" w:gutter="0"/>
+      <w:pgMar w:top="1077" w:right="1134" w:bottom="1020" w:left="1134" w:header="454" w:footer="454" w:gutter="0"/>
       <w:cols w:space="720"/>
+      <w:titlePg/>
       <w:docGrid w:linePitch="360"/>
     </w:sectPr>
   </w:body>
@@ -1116,6 +1784,9 @@
     <w:p>
       <w:pPr>
         <w:spacing w:after="0" w:line="240" w:lineRule="auto"/>
+        <w:rPr>
+          <w:rFonts w:hint="eastAsia"/>
+        </w:rPr>
       </w:pPr>
       <w:r>
         <w:separator/>
@@ -1126,6 +1797,9 @@
     <w:p>
       <w:pPr>
         <w:spacing w:after="0" w:line="240" w:lineRule="auto"/>
+        <w:rPr>
+          <w:rFonts w:hint="eastAsia"/>
+        </w:rPr>
       </w:pPr>
       <w:r>
         <w:continuationSeparator/>
@@ -1151,98 +1825,49 @@
     <w:pPr>
       <w:pStyle w:val="Footer"/>
       <w:tabs>
-        <w:tab w:val="right" w:pos="9831"/>
+        <w:tab w:val="right" w:pos="9637"/>
       </w:tabs>
+      <w:rPr>
+        <w:rFonts w:hint="eastAsia"/>
+      </w:rPr>
     </w:pPr>
     <w:r>
-      <w:rPr>
-        <w:color w:val="505050"/>
-        <w:sz w:val="16"/>
-      </w:rPr>
-      <w:t>João José | Academic CV | 17 September 2026</w:t>
+      <w:t>17 September 2026</w:t>
     </w:r>
     <w:r>
-      <w:rPr>
-        <w:color w:val="505050"/>
-        <w:sz w:val="16"/>
-      </w:rPr>
       <w:tab/>
     </w:r>
     <w:r>
-      <w:rPr>
-        <w:color w:val="505050"/>
-        <w:sz w:val="16"/>
-      </w:rPr>
       <w:fldChar w:fldCharType="begin"/>
     </w:r>
     <w:r>
-      <w:rPr>
-        <w:color w:val="505050"/>
-        <w:sz w:val="16"/>
-      </w:rPr>
-      <w:instrText xml:space="preserve"> PAGE </w:instrText>
+      <w:instrText>PAGE</w:instrText>
     </w:r>
     <w:r>
-      <w:rPr>
-        <w:color w:val="505050"/>
-        <w:sz w:val="16"/>
-      </w:rPr>
       <w:fldChar w:fldCharType="separate"/>
     </w:r>
     <w:r>
-      <w:rPr>
-        <w:color w:val="505050"/>
-        <w:sz w:val="16"/>
-      </w:rPr>
       <w:t>1</w:t>
     </w:r>
     <w:r>
-      <w:rPr>
-        <w:color w:val="505050"/>
-        <w:sz w:val="16"/>
-      </w:rPr>
       <w:fldChar w:fldCharType="end"/>
     </w:r>
     <w:r>
-      <w:rPr>
-        <w:color w:val="505050"/>
-        <w:sz w:val="16"/>
-      </w:rPr>
       <w:t xml:space="preserve"> / </w:t>
     </w:r>
     <w:r>
-      <w:rPr>
-        <w:color w:val="505050"/>
-        <w:sz w:val="16"/>
-      </w:rPr>
       <w:fldChar w:fldCharType="begin"/>
     </w:r>
     <w:r>
-      <w:rPr>
-        <w:color w:val="505050"/>
-        <w:sz w:val="16"/>
-      </w:rPr>
-      <w:instrText xml:space="preserve"> NUMPAGES </w:instrText>
+      <w:instrText>NUMPAGES</w:instrText>
     </w:r>
     <w:r>
-      <w:rPr>
-        <w:color w:val="505050"/>
-        <w:sz w:val="16"/>
-      </w:rPr>
       <w:fldChar w:fldCharType="separate"/>
     </w:r>
     <w:r>
-      <w:rPr>
-        <w:color w:val="505050"/>
-        <w:sz w:val="16"/>
-      </w:rPr>
       <w:t>4</w:t>
     </w:r>
     <w:r>
-      <w:rPr>
-        <w:color w:val="505050"/>
-        <w:sz w:val="16"/>
-      </w:rPr>
       <w:fldChar w:fldCharType="end"/>
     </w:r>
   </w:p>
@@ -1254,7 +1879,52 @@
   <w:p>
     <w:pPr>
       <w:pStyle w:val="Footer"/>
-    </w:pPr>
+      <w:tabs>
+        <w:tab w:val="right" w:pos="9637"/>
+      </w:tabs>
+      <w:rPr>
+        <w:rFonts w:hint="eastAsia"/>
+      </w:rPr>
+    </w:pPr>
+    <w:r>
+      <w:t>17 September 2026</w:t>
+    </w:r>
+    <w:r>
+      <w:tab/>
+    </w:r>
+    <w:r>
+      <w:fldChar w:fldCharType="begin"/>
+    </w:r>
+    <w:r>
+      <w:instrText>PAGE</w:instrText>
+    </w:r>
+    <w:r>
+      <w:fldChar w:fldCharType="separate"/>
+    </w:r>
+    <w:r>
+      <w:t>1</w:t>
+    </w:r>
+    <w:r>
+      <w:fldChar w:fldCharType="end"/>
+    </w:r>
+    <w:r>
+      <w:t xml:space="preserve"> / </w:t>
+    </w:r>
+    <w:r>
+      <w:fldChar w:fldCharType="begin"/>
+    </w:r>
+    <w:r>
+      <w:instrText>NUMPAGES</w:instrText>
+    </w:r>
+    <w:r>
+      <w:fldChar w:fldCharType="separate"/>
+    </w:r>
+    <w:r>
+      <w:t>4</w:t>
+    </w:r>
+    <w:r>
+      <w:fldChar w:fldCharType="end"/>
+    </w:r>
   </w:p>
 </w:ftr>
 </file>
@@ -1265,6 +1935,9 @@
     <w:p>
       <w:pPr>
         <w:spacing w:after="0" w:line="240" w:lineRule="auto"/>
+        <w:rPr>
+          <w:rFonts w:hint="eastAsia"/>
+        </w:rPr>
       </w:pPr>
       <w:r>
         <w:separator/>
@@ -1275,6 +1948,9 @@
     <w:p>
       <w:pPr>
         <w:spacing w:after="0" w:line="240" w:lineRule="auto"/>
+        <w:rPr>
+          <w:rFonts w:hint="eastAsia"/>
+        </w:rPr>
       </w:pPr>
       <w:r>
         <w:continuationSeparator/>
@@ -1299,7 +1975,23 @@
   <w:p>
     <w:pPr>
       <w:pStyle w:val="Header"/>
-    </w:pPr>
+      <w:tabs>
+        <w:tab w:val="right" w:pos="9637"/>
+      </w:tabs>
+      <w:rPr>
+        <w:rFonts w:hint="eastAsia"/>
+      </w:rPr>
+    </w:pPr>
+    <w:r>
+      <w:rPr>
+        <w:b/>
+      </w:rPr>
+      <w:t>João José</w:t>
+    </w:r>
+    <w:r>
+      <w:tab/>
+      <w:t>Academic curriculum vitae</w:t>
+    </w:r>
   </w:p>
 </w:hdr>
 </file>
@@ -1487,31 +2179,31 @@
       </w:rPr>
     </w:lvl>
   </w:abstractNum>
-  <w:num w:numId="1" w16cid:durableId="1843623458">
+  <w:num w:numId="1" w16cid:durableId="1495301232">
     <w:abstractNumId w:val="8"/>
   </w:num>
-  <w:num w:numId="2" w16cid:durableId="124276401">
+  <w:num w:numId="2" w16cid:durableId="901672738">
     <w:abstractNumId w:val="6"/>
   </w:num>
-  <w:num w:numId="3" w16cid:durableId="865875421">
+  <w:num w:numId="3" w16cid:durableId="933787067">
     <w:abstractNumId w:val="5"/>
   </w:num>
-  <w:num w:numId="4" w16cid:durableId="2045590229">
+  <w:num w:numId="4" w16cid:durableId="891624435">
     <w:abstractNumId w:val="4"/>
   </w:num>
-  <w:num w:numId="5" w16cid:durableId="1565721095">
+  <w:num w:numId="5" w16cid:durableId="1519779905">
     <w:abstractNumId w:val="7"/>
   </w:num>
-  <w:num w:numId="6" w16cid:durableId="838421586">
+  <w:num w:numId="6" w16cid:durableId="1721855565">
     <w:abstractNumId w:val="3"/>
   </w:num>
-  <w:num w:numId="7" w16cid:durableId="1772431704">
+  <w:num w:numId="7" w16cid:durableId="1113135534">
     <w:abstractNumId w:val="2"/>
   </w:num>
-  <w:num w:numId="8" w16cid:durableId="1177616555">
+  <w:num w:numId="8" w16cid:durableId="569197617">
     <w:abstractNumId w:val="1"/>
   </w:num>
-  <w:num w:numId="9" w16cid:durableId="371196683">
+  <w:num w:numId="9" w16cid:durableId="1485313922">
     <w:abstractNumId w:val="0"/>
   </w:num>
 </w:numbering>
@@ -1908,11 +2600,12 @@
     <w:qFormat/>
     <w:rsid w:val="00FC693F"/>
     <w:pPr>
-      <w:spacing w:after="100" w:line="259" w:lineRule="auto"/>
+      <w:keepLines/>
+      <w:spacing w:after="120" w:line="269" w:lineRule="auto"/>
     </w:pPr>
     <w:rPr>
-      <w:rFonts w:ascii="Arial" w:hAnsi="Arial"/>
-      <w:color w:val="000000"/>
+      <w:rFonts w:ascii="Segoe UI" w:hAnsi="Segoe UI"/>
+      <w:color w:val="252B32"/>
       <w:sz w:val="21"/>
     </w:rPr>
   </w:style>
@@ -1926,15 +2619,14 @@
     <w:rsid w:val="00FC693F"/>
     <w:pPr>
       <w:keepNext/>
-      <w:keepLines/>
-      <w:spacing w:before="260" w:after="120"/>
+      <w:spacing w:after="300" w:line="252" w:lineRule="auto"/>
       <w:outlineLvl w:val="0"/>
     </w:pPr>
     <w:rPr>
       <w:rFonts w:asciiTheme="majorHAnsi" w:eastAsiaTheme="majorEastAsia" w:hAnsiTheme="majorHAnsi" w:cstheme="majorBidi"/>
-      <w:b/>
       <w:bCs/>
-      <w:sz w:val="24"/>
+      <w:color w:val="000000"/>
+      <w:sz w:val="46"/>
       <w:szCs w:val="28"/>
     </w:rPr>
   </w:style>
@@ -1949,14 +2641,15 @@
     <w:rsid w:val="00FC693F"/>
     <w:pPr>
       <w:keepNext/>
-      <w:keepLines/>
-      <w:spacing w:before="140" w:after="60"/>
+      <w:spacing w:before="340" w:after="140" w:line="264" w:lineRule="auto"/>
       <w:outlineLvl w:val="1"/>
     </w:pPr>
     <w:rPr>
       <w:rFonts w:asciiTheme="majorHAnsi" w:eastAsiaTheme="majorEastAsia" w:hAnsiTheme="majorHAnsi" w:cstheme="majorBidi"/>
       <w:b/>
       <w:bCs/>
+      <w:color w:val="000000"/>
+      <w:sz w:val="28"/>
       <w:szCs w:val="26"/>
     </w:rPr>
   </w:style>
@@ -1971,14 +2664,15 @@
     <w:rsid w:val="00FC693F"/>
     <w:pPr>
       <w:keepNext/>
-      <w:keepLines/>
-      <w:spacing w:before="200" w:after="0"/>
+      <w:spacing w:before="180" w:after="60" w:line="264" w:lineRule="auto"/>
       <w:outlineLvl w:val="2"/>
     </w:pPr>
     <w:rPr>
       <w:rFonts w:asciiTheme="majorHAnsi" w:eastAsiaTheme="majorEastAsia" w:hAnsiTheme="majorHAnsi" w:cstheme="majorBidi"/>
       <w:b/>
       <w:bCs/>
+      <w:color w:val="000000"/>
+      <w:sz w:val="22"/>
     </w:rPr>
   </w:style>
   <w:style w:type="paragraph" w:styleId="Heading4">
@@ -1993,7 +2687,6 @@
     <w:rsid w:val="00FC693F"/>
     <w:pPr>
       <w:keepNext/>
-      <w:keepLines/>
       <w:spacing w:before="200" w:after="0"/>
       <w:outlineLvl w:val="3"/>
     </w:pPr>
@@ -2018,7 +2711,6 @@
     <w:rsid w:val="00FC693F"/>
     <w:pPr>
       <w:keepNext/>
-      <w:keepLines/>
       <w:spacing w:before="200" w:after="0"/>
       <w:outlineLvl w:val="4"/>
     </w:pPr>
@@ -2039,7 +2731,6 @@
     <w:rsid w:val="00FC693F"/>
     <w:pPr>
       <w:keepNext/>
-      <w:keepLines/>
       <w:spacing w:before="200" w:after="0"/>
       <w:outlineLvl w:val="5"/>
     </w:pPr>
@@ -2062,7 +2753,6 @@
     <w:rsid w:val="00FC693F"/>
     <w:pPr>
       <w:keepNext/>
-      <w:keepLines/>
       <w:spacing w:before="200" w:after="0"/>
       <w:outlineLvl w:val="6"/>
     </w:pPr>
@@ -2085,7 +2775,6 @@
     <w:rsid w:val="00FC693F"/>
     <w:pPr>
       <w:keepNext/>
-      <w:keepLines/>
       <w:spacing w:before="200" w:after="0"/>
       <w:outlineLvl w:val="7"/>
     </w:pPr>
@@ -2108,7 +2797,6 @@
     <w:rsid w:val="00FC693F"/>
     <w:pPr>
       <w:keepNext/>
-      <w:keepLines/>
       <w:spacing w:before="200" w:after="0"/>
       <w:outlineLvl w:val="8"/>
     </w:pPr>
@@ -2156,12 +2844,12 @@
     <w:unhideWhenUsed/>
     <w:rsid w:val="00E618BF"/>
     <w:pPr>
-      <w:tabs>
-        <w:tab w:val="center" w:pos="4680"/>
-        <w:tab w:val="right" w:pos="9360"/>
-      </w:tabs>
-      <w:spacing w:after="0" w:line="240" w:lineRule="auto"/>
-    </w:pPr>
+      <w:spacing w:after="0" w:line="264" w:lineRule="auto"/>
+    </w:pPr>
+    <w:rPr>
+      <w:color w:val="000000"/>
+      <w:sz w:val="17"/>
+    </w:rPr>
   </w:style>
   <w:style w:type="character" w:customStyle="1" w:styleId="HeaderChar">
     <w:name w:val="Header Char"/>
@@ -2178,12 +2866,12 @@
     <w:unhideWhenUsed/>
     <w:rsid w:val="00E618BF"/>
     <w:pPr>
-      <w:tabs>
-        <w:tab w:val="center" w:pos="4680"/>
-        <w:tab w:val="right" w:pos="9360"/>
-      </w:tabs>
-      <w:spacing w:after="0" w:line="240" w:lineRule="auto"/>
-    </w:pPr>
+      <w:spacing w:after="0" w:line="264" w:lineRule="auto"/>
+    </w:pPr>
+    <w:rPr>
+      <w:color w:val="505B66"/>
+      <w:sz w:val="17"/>
+    </w:rPr>
   </w:style>
   <w:style w:type="character" w:customStyle="1" w:styleId="FooterChar">
     <w:name w:val="Footer Char"/>
@@ -2253,15 +2941,15 @@
     <w:qFormat/>
     <w:rsid w:val="00FC693F"/>
     <w:pPr>
-      <w:spacing w:after="60" w:line="240" w:lineRule="auto"/>
+      <w:spacing w:after="20" w:line="240" w:lineRule="auto"/>
       <w:contextualSpacing/>
     </w:pPr>
     <w:rPr>
       <w:rFonts w:asciiTheme="majorHAnsi" w:eastAsiaTheme="majorEastAsia" w:hAnsiTheme="majorHAnsi" w:cstheme="majorBidi"/>
-      <w:b/>
+      <w:color w:val="000000"/>
       <w:spacing w:val="5"/>
       <w:kern w:val="28"/>
-      <w:sz w:val="48"/>
+      <w:sz w:val="62"/>
       <w:szCs w:val="52"/>
     </w:rPr>
   </w:style>
@@ -2292,15 +2980,14 @@
       <w:numPr>
         <w:ilvl w:val="1"/>
       </w:numPr>
-      <w:spacing w:after="160"/>
+      <w:spacing w:after="200" w:line="264" w:lineRule="auto"/>
     </w:pPr>
     <w:rPr>
       <w:rFonts w:asciiTheme="majorHAnsi" w:eastAsiaTheme="majorEastAsia" w:hAnsiTheme="majorHAnsi" w:cstheme="majorBidi"/>
-      <w:b/>
-      <w:i/>
       <w:iCs/>
+      <w:color w:val="000000"/>
       <w:spacing w:val="15"/>
-      <w:sz w:val="24"/>
+      <w:sz w:val="26"/>
       <w:szCs w:val="24"/>
     </w:rPr>
   </w:style>
@@ -2338,9 +3025,6 @@
     <w:uiPriority w:val="99"/>
     <w:unhideWhenUsed/>
     <w:rsid w:val="00AA1D8D"/>
-    <w:pPr>
-      <w:spacing w:after="120"/>
-    </w:pPr>
   </w:style>
   <w:style w:type="character" w:customStyle="1" w:styleId="BodyTextChar">
     <w:name w:val="Body Text Char"/>
@@ -2357,7 +3041,7 @@
     <w:unhideWhenUsed/>
     <w:rsid w:val="00AA1D8D"/>
     <w:pPr>
-      <w:spacing w:after="120" w:line="480" w:lineRule="auto"/>
+      <w:spacing w:line="480" w:lineRule="auto"/>
     </w:pPr>
   </w:style>
   <w:style w:type="character" w:customStyle="1" w:styleId="BodyText2Char">
@@ -2374,9 +3058,6 @@
     <w:uiPriority w:val="99"/>
     <w:unhideWhenUsed/>
     <w:rsid w:val="00AA1D8D"/>
-    <w:pPr>
-      <w:spacing w:after="120"/>
-    </w:pPr>
     <w:rPr>
       <w:sz w:val="16"/>
       <w:szCs w:val="16"/>
@@ -2511,7 +3192,6 @@
     <w:unhideWhenUsed/>
     <w:rsid w:val="0029639D"/>
     <w:pPr>
-      <w:spacing w:after="120"/>
       <w:ind w:left="360"/>
       <w:contextualSpacing/>
     </w:pPr>
@@ -2523,7 +3203,6 @@
     <w:unhideWhenUsed/>
     <w:rsid w:val="0029639D"/>
     <w:pPr>
-      <w:spacing w:after="120"/>
       <w:ind w:left="720"/>
       <w:contextualSpacing/>
     </w:pPr>
@@ -2535,7 +3214,6 @@
     <w:unhideWhenUsed/>
     <w:rsid w:val="0029639D"/>
     <w:pPr>
-      <w:spacing w:after="120"/>
       <w:ind w:left="1080"/>
       <w:contextualSpacing/>
     </w:pPr>
@@ -12899,26 +13577,149 @@
       </w:tcPr>
     </w:tblStylePr>
   </w:style>
-  <w:style w:type="paragraph" w:customStyle="1" w:styleId="Publication">
-    <w:name w:val="Publication"/>
+  <w:style w:type="paragraph" w:customStyle="1" w:styleId="Kicker">
+    <w:name w:val="Kicker"/>
     <w:basedOn w:val="Normal"/>
     <w:pPr>
-      <w:keepLines/>
-      <w:spacing w:after="180"/>
+      <w:keepNext/>
+      <w:spacing w:after="160" w:line="264" w:lineRule="auto"/>
+    </w:pPr>
+    <w:rPr>
+      <w:b/>
+      <w:color w:val="000000"/>
+      <w:sz w:val="18"/>
+    </w:rPr>
+  </w:style>
+  <w:style w:type="paragraph" w:customStyle="1" w:styleId="Contact">
+    <w:name w:val="Contact"/>
+    <w:basedOn w:val="Normal"/>
+    <w:pPr>
+      <w:spacing w:after="100" w:line="264" w:lineRule="auto"/>
+    </w:pPr>
+    <w:rPr>
+      <w:color w:val="505B66"/>
+      <w:sz w:val="19"/>
+    </w:rPr>
+  </w:style>
+  <w:style w:type="paragraph" w:customStyle="1" w:styleId="Intro">
+    <w:name w:val="Intro"/>
+    <w:basedOn w:val="Normal"/>
+    <w:pPr>
+      <w:spacing w:after="200" w:line="281" w:lineRule="auto"/>
+    </w:pPr>
+    <w:rPr>
+      <w:sz w:val="23"/>
+    </w:rPr>
+  </w:style>
+  <w:style w:type="paragraph" w:customStyle="1" w:styleId="Meta">
+    <w:name w:val="Meta"/>
+    <w:basedOn w:val="Normal"/>
+    <w:pPr>
+      <w:keepNext/>
+      <w:spacing w:after="100" w:line="264" w:lineRule="auto"/>
+    </w:pPr>
+    <w:rPr>
+      <w:color w:val="505B66"/>
+      <w:sz w:val="18"/>
+    </w:rPr>
+  </w:style>
+  <w:style w:type="paragraph" w:customStyle="1" w:styleId="Project">
+    <w:name w:val="Project"/>
+    <w:basedOn w:val="Normal"/>
+    <w:pPr>
+      <w:spacing w:after="160" w:line="264" w:lineRule="auto"/>
+    </w:pPr>
+  </w:style>
+  <w:style w:type="paragraph" w:customStyle="1" w:styleId="Granttitle">
+    <w:name w:val="Grant title"/>
+    <w:basedOn w:val="Normal"/>
+    <w:pPr>
+      <w:keepNext/>
+      <w:spacing w:before="140" w:after="40" w:line="264" w:lineRule="auto"/>
+    </w:pPr>
+    <w:rPr>
+      <w:b/>
+      <w:color w:val="000000"/>
+    </w:rPr>
+  </w:style>
+  <w:style w:type="paragraph" w:customStyle="1" w:styleId="Grantmeta">
+    <w:name w:val="Grant meta"/>
+    <w:basedOn w:val="Normal"/>
+    <w:pPr>
+      <w:spacing w:after="100" w:line="264" w:lineRule="auto"/>
+    </w:pPr>
+    <w:rPr>
+      <w:color w:val="505B66"/>
+      <w:sz w:val="19"/>
+    </w:rPr>
+  </w:style>
+  <w:style w:type="paragraph" w:customStyle="1" w:styleId="Pubgroup">
+    <w:name w:val="Pub group"/>
+    <w:basedOn w:val="Normal"/>
+    <w:pPr>
+      <w:keepNext/>
+      <w:spacing w:before="240" w:line="252" w:lineRule="auto"/>
+    </w:pPr>
+    <w:rPr>
+      <w:b/>
+      <w:color w:val="000000"/>
+      <w:sz w:val="24"/>
+    </w:rPr>
+  </w:style>
+  <w:style w:type="paragraph" w:customStyle="1" w:styleId="Pubtitle">
+    <w:name w:val="Pub title"/>
+    <w:basedOn w:val="Normal"/>
+    <w:pPr>
+      <w:keepNext/>
+      <w:spacing w:before="140" w:after="40" w:line="252" w:lineRule="auto"/>
+    </w:pPr>
+    <w:rPr>
+      <w:b/>
+      <w:color w:val="000000"/>
+    </w:rPr>
+  </w:style>
+  <w:style w:type="paragraph" w:customStyle="1" w:styleId="Pubauthors">
+    <w:name w:val="Pub authors"/>
+    <w:basedOn w:val="Normal"/>
+    <w:pPr>
+      <w:keepNext/>
+      <w:spacing w:after="20" w:line="254" w:lineRule="auto"/>
+    </w:pPr>
+    <w:rPr>
+      <w:sz w:val="18"/>
+    </w:rPr>
+  </w:style>
+  <w:style w:type="paragraph" w:customStyle="1" w:styleId="Pubvenue">
+    <w:name w:val="Pub venue"/>
+    <w:basedOn w:val="Normal"/>
+    <w:pPr>
+      <w:keepNext/>
+      <w:spacing w:after="20" w:line="254" w:lineRule="auto"/>
+    </w:pPr>
+    <w:rPr>
+      <w:color w:val="505B66"/>
+      <w:sz w:val="18"/>
+    </w:rPr>
+  </w:style>
+  <w:style w:type="paragraph" w:customStyle="1" w:styleId="Publinks">
+    <w:name w:val="Pub links"/>
+    <w:basedOn w:val="Normal"/>
+    <w:pPr>
+      <w:spacing w:after="60" w:line="252" w:lineRule="auto"/>
+    </w:pPr>
+    <w:rPr>
+      <w:color w:val="505B66"/>
+      <w:sz w:val="18"/>
+    </w:rPr>
+  </w:style>
+  <w:style w:type="paragraph" w:customStyle="1" w:styleId="Compact">
+    <w:name w:val="Compact"/>
+    <w:basedOn w:val="Normal"/>
+    <w:pPr>
+      <w:spacing w:after="100" w:line="259" w:lineRule="auto"/>
     </w:pPr>
     <w:rPr>
       <w:sz w:val="20"/>
-    </w:rPr>
-  </w:style>
-  <w:style w:type="paragraph" w:customStyle="1" w:styleId="Metadata">
-    <w:name w:val="Metadata"/>
-    <w:basedOn w:val="Normal"/>
-    <w:pPr>
-      <w:keepNext/>
-    </w:pPr>
-    <w:rPr>
-      <w:color w:val="505050"/>
-      <w:sz w:val="19"/>
     </w:rPr>
   </w:style>
 </w:styles>

</xml_diff>

<commit_message>
Link publication titles and show full inline DOIs
</commit_message>
<xml_diff>
--- a/academic/Joao_Jose_Academic_CV.docx
+++ b/academic/Joao_Jose_Academic_CV.docx
@@ -368,9 +368,17 @@
         </w:rPr>
         <w:t xml:space="preserve">2015   </w:t>
       </w:r>
-      <w:r>
-        <w:t>Computer vision and GIS for the navigation of blind persons in buildings</w:t>
-      </w:r>
+      <w:hyperlink r:id="rId13">
+        <w:r>
+          <w:t xml:space="preserve">Computer vision and GIS for the navigation of blind persons in buildings </w:t>
+        </w:r>
+        <w:r>
+          <w:rPr>
+            <w:rFonts w:ascii="Cambria Math" w:hAnsi="Cambria Math" w:cs="Cambria Math"/>
+          </w:rPr>
+          <w:t>↗</w:t>
+        </w:r>
+      </w:hyperlink>
     </w:p>
     <w:p>
       <w:pPr>
@@ -395,38 +403,22 @@
     <w:p>
       <w:pPr>
         <w:pStyle w:val="Pubvenue"/>
+        <w:keepNext w:val="0"/>
+        <w:spacing w:after="60"/>
         <w:rPr>
           <w:rFonts w:hint="eastAsia"/>
         </w:rPr>
       </w:pPr>
       <w:r>
-        <w:t>Universal Access in the Information Society, 14, 67-80. March 2015; online 19 February 2014.</w:t>
-      </w:r>
-    </w:p>
-    <w:p>
-      <w:pPr>
-        <w:pStyle w:val="Publinks"/>
-        <w:rPr>
-          <w:rFonts w:hint="eastAsia"/>
-        </w:rPr>
-      </w:pPr>
-      <w:hyperlink r:id="rId13">
-        <w:r>
-          <w:rPr>
-            <w:color w:val="176575"/>
-          </w:rPr>
-          <w:t>DOI</w:t>
-        </w:r>
-      </w:hyperlink>
-      <w:r>
-        <w:t xml:space="preserve">   ·   </w:t>
+        <w:t xml:space="preserve">Universal Access in the Information Society, 14, 67-80. March 2015; online 19 February 2014. </w:t>
       </w:r>
       <w:hyperlink r:id="rId14">
         <w:r>
           <w:rPr>
             <w:color w:val="176575"/>
+            <w:sz w:val="19"/>
           </w:rPr>
-          <w:t>PDF</w:t>
+          <w:t>DOI: 10.1007/s10209-013-0338-8</w:t>
         </w:r>
       </w:hyperlink>
     </w:p>
@@ -443,9 +435,17 @@
         </w:rPr>
         <w:t xml:space="preserve">2011   </w:t>
       </w:r>
-      <w:r>
-        <w:t>The SmartVision local navigation aid for blind and visually impaired persons</w:t>
-      </w:r>
+      <w:hyperlink r:id="rId15">
+        <w:r>
+          <w:t xml:space="preserve">The SmartVision local navigation aid for blind and visually impaired persons </w:t>
+        </w:r>
+        <w:r>
+          <w:rPr>
+            <w:rFonts w:ascii="Cambria Math" w:hAnsi="Cambria Math" w:cs="Cambria Math"/>
+          </w:rPr>
+          <w:t>↗</w:t>
+        </w:r>
+      </w:hyperlink>
     </w:p>
     <w:p>
       <w:pPr>
@@ -467,38 +467,22 @@
     <w:p>
       <w:pPr>
         <w:pStyle w:val="Pubvenue"/>
+        <w:keepNext w:val="0"/>
+        <w:spacing w:after="60"/>
         <w:rPr>
           <w:rFonts w:hint="eastAsia"/>
         </w:rPr>
       </w:pPr>
       <w:r>
-        <w:t>International Journal of Digital Content Technology and its Applications, 5(5), 362-375.</w:t>
-      </w:r>
-    </w:p>
-    <w:p>
-      <w:pPr>
-        <w:pStyle w:val="Publinks"/>
-        <w:rPr>
-          <w:rFonts w:hint="eastAsia"/>
-        </w:rPr>
-      </w:pPr>
-      <w:hyperlink r:id="rId15">
-        <w:r>
-          <w:rPr>
-            <w:color w:val="176575"/>
-          </w:rPr>
-          <w:t>DOI</w:t>
-        </w:r>
-      </w:hyperlink>
-      <w:r>
-        <w:t xml:space="preserve">   ·   </w:t>
+        <w:t xml:space="preserve">International Journal of Digital Content Technology and its Applications, 5(5), 362-375. </w:t>
       </w:r>
       <w:hyperlink r:id="rId16">
         <w:r>
           <w:rPr>
             <w:color w:val="176575"/>
+            <w:sz w:val="19"/>
           </w:rPr>
-          <w:t>PDF</w:t>
+          <w:t>DOI: 10.4156/jdcta.vol5.issue5.40</w:t>
         </w:r>
       </w:hyperlink>
     </w:p>
@@ -515,9 +499,17 @@
         </w:rPr>
         <w:t xml:space="preserve">2011   </w:t>
       </w:r>
-      <w:r>
-        <w:t>The SmartVision Navigation Prototype for Blind Users</w:t>
-      </w:r>
+      <w:hyperlink r:id="rId17">
+        <w:r>
+          <w:t xml:space="preserve">The SmartVision Navigation Prototype for Blind Users </w:t>
+        </w:r>
+        <w:r>
+          <w:rPr>
+            <w:rFonts w:ascii="Cambria Math" w:hAnsi="Cambria Math" w:cs="Cambria Math"/>
+          </w:rPr>
+          <w:t>↗</w:t>
+        </w:r>
+      </w:hyperlink>
     </w:p>
     <w:p>
       <w:pPr>
@@ -542,38 +534,22 @@
     <w:p>
       <w:pPr>
         <w:pStyle w:val="Pubvenue"/>
+        <w:keepNext w:val="0"/>
+        <w:spacing w:after="60"/>
         <w:rPr>
           <w:rFonts w:hint="eastAsia"/>
         </w:rPr>
       </w:pPr>
       <w:r>
-        <w:t>International Journal of Digital Content Technology and its Applications, 5(5), 351-361.</w:t>
-      </w:r>
-    </w:p>
-    <w:p>
-      <w:pPr>
-        <w:pStyle w:val="Publinks"/>
-        <w:rPr>
-          <w:rFonts w:hint="eastAsia"/>
-        </w:rPr>
-      </w:pPr>
-      <w:hyperlink r:id="rId17">
-        <w:r>
-          <w:rPr>
-            <w:color w:val="176575"/>
-          </w:rPr>
-          <w:t>DOI</w:t>
-        </w:r>
-      </w:hyperlink>
-      <w:r>
-        <w:t xml:space="preserve">   ·   </w:t>
+        <w:t xml:space="preserve">International Journal of Digital Content Technology and its Applications, 5(5), 351-361. </w:t>
       </w:r>
       <w:hyperlink r:id="rId18">
         <w:r>
           <w:rPr>
             <w:color w:val="176575"/>
+            <w:sz w:val="19"/>
           </w:rPr>
-          <w:t>PDF</w:t>
+          <w:t>DOI: 10.4156/jdcta.vol5.issue5.39</w:t>
         </w:r>
       </w:hyperlink>
     </w:p>
@@ -603,9 +579,17 @@
         </w:rPr>
         <w:t xml:space="preserve">2012   </w:t>
       </w:r>
-      <w:r>
-        <w:t>Realtime Local Navigation for the Blind: Detection of Lateral Doors and Sound Interface</w:t>
-      </w:r>
+      <w:hyperlink r:id="rId19">
+        <w:r>
+          <w:t xml:space="preserve">Realtime Local Navigation for the Blind: Detection of Lateral Doors and Sound Interface </w:t>
+        </w:r>
+        <w:r>
+          <w:rPr>
+            <w:rFonts w:ascii="Cambria Math" w:hAnsi="Cambria Math" w:cs="Cambria Math"/>
+          </w:rPr>
+          <w:t>↗</w:t>
+        </w:r>
+      </w:hyperlink>
     </w:p>
     <w:p>
       <w:pPr>
@@ -630,38 +614,22 @@
     <w:p>
       <w:pPr>
         <w:pStyle w:val="Pubvenue"/>
+        <w:keepNext w:val="0"/>
+        <w:spacing w:after="60"/>
         <w:rPr>
           <w:rFonts w:hint="eastAsia"/>
         </w:rPr>
       </w:pPr>
       <w:r>
-        <w:t>DSAI 2012. Procedia Computer Science, 14, 74-82.</w:t>
-      </w:r>
-    </w:p>
-    <w:p>
-      <w:pPr>
-        <w:pStyle w:val="Publinks"/>
-        <w:rPr>
-          <w:rFonts w:hint="eastAsia"/>
-        </w:rPr>
-      </w:pPr>
-      <w:hyperlink r:id="rId19">
-        <w:r>
-          <w:rPr>
-            <w:color w:val="176575"/>
-          </w:rPr>
-          <w:t>DOI</w:t>
-        </w:r>
-      </w:hyperlink>
-      <w:r>
-        <w:t xml:space="preserve">   ·   </w:t>
+        <w:t xml:space="preserve">DSAI 2012. Procedia Computer Science, 14, 74-82. </w:t>
       </w:r>
       <w:hyperlink r:id="rId20">
         <w:r>
           <w:rPr>
             <w:color w:val="176575"/>
+            <w:sz w:val="19"/>
           </w:rPr>
-          <w:t>PDF</w:t>
+          <w:t>DOI: 10.1016/j.procs.2012.10.009</w:t>
         </w:r>
       </w:hyperlink>
     </w:p>
@@ -678,9 +646,17 @@
         </w:rPr>
         <w:t xml:space="preserve">2012   </w:t>
       </w:r>
-      <w:r>
-        <w:t>Visual Navigation for the Blind - Path and Obstacle Detection</w:t>
-      </w:r>
+      <w:hyperlink r:id="rId21">
+        <w:r>
+          <w:t xml:space="preserve">Visual Navigation for the Blind - Path and Obstacle Detection </w:t>
+        </w:r>
+        <w:r>
+          <w:rPr>
+            <w:rFonts w:ascii="Cambria Math" w:hAnsi="Cambria Math" w:cs="Cambria Math"/>
+          </w:rPr>
+          <w:t>↗</w:t>
+        </w:r>
+      </w:hyperlink>
     </w:p>
     <w:p>
       <w:pPr>
@@ -702,38 +678,22 @@
     <w:p>
       <w:pPr>
         <w:pStyle w:val="Pubvenue"/>
+        <w:keepNext w:val="0"/>
+        <w:spacing w:after="60"/>
         <w:rPr>
           <w:rFonts w:hint="eastAsia"/>
         </w:rPr>
       </w:pPr>
       <w:r>
-        <w:t>1st International Conference on Pattern Recognition Applications and Methods (ICPRAM), 515-519.</w:t>
-      </w:r>
-    </w:p>
-    <w:p>
-      <w:pPr>
-        <w:pStyle w:val="Publinks"/>
-        <w:rPr>
-          <w:rFonts w:hint="eastAsia"/>
-        </w:rPr>
-      </w:pPr>
-      <w:hyperlink r:id="rId21">
-        <w:r>
-          <w:rPr>
-            <w:color w:val="176575"/>
-          </w:rPr>
-          <w:t>DOI</w:t>
-        </w:r>
-      </w:hyperlink>
-      <w:r>
-        <w:t xml:space="preserve">   ·   </w:t>
+        <w:t xml:space="preserve">1st International Conference on Pattern Recognition Applications and Methods (ICPRAM), 515-519. </w:t>
       </w:r>
       <w:hyperlink r:id="rId22">
         <w:r>
           <w:rPr>
             <w:color w:val="176575"/>
+            <w:sz w:val="19"/>
           </w:rPr>
-          <w:t>PDF</w:t>
+          <w:t>DOI: 10.5220/0003711405150519</w:t>
         </w:r>
       </w:hyperlink>
     </w:p>
@@ -750,9 +710,17 @@
         </w:rPr>
         <w:t xml:space="preserve">2010   </w:t>
       </w:r>
-      <w:r>
-        <w:t>A vision system for detecting paths and moving obstacles for the blind</w:t>
-      </w:r>
+      <w:hyperlink r:id="rId23">
+        <w:r>
+          <w:t xml:space="preserve">A vision system for detecting paths and moving obstacles for the blind </w:t>
+        </w:r>
+        <w:r>
+          <w:rPr>
+            <w:rFonts w:ascii="Cambria Math" w:hAnsi="Cambria Math" w:cs="Cambria Math"/>
+          </w:rPr>
+          <w:t>↗</w:t>
+        </w:r>
+      </w:hyperlink>
     </w:p>
     <w:p>
       <w:pPr>
@@ -774,6 +742,8 @@
     <w:p>
       <w:pPr>
         <w:pStyle w:val="Pubvenue"/>
+        <w:keepNext w:val="0"/>
+        <w:spacing w:after="60"/>
         <w:rPr>
           <w:rFonts w:hint="eastAsia"/>
         </w:rPr>
@@ -784,39 +754,31 @@
     </w:p>
     <w:p>
       <w:pPr>
-        <w:pStyle w:val="Publinks"/>
+        <w:pStyle w:val="Pubtitle"/>
         <w:rPr>
           <w:rFonts w:hint="eastAsia"/>
         </w:rPr>
       </w:pPr>
-      <w:hyperlink r:id="rId23">
+      <w:r>
+        <w:rPr>
+          <w:color w:val="176575"/>
+        </w:rPr>
+        <w:t xml:space="preserve">2010   </w:t>
+      </w:r>
+      <w:hyperlink r:id="rId24">
+        <w:r>
+          <w:t xml:space="preserve">The SmartVision Navigation Prototype for the Blind </w:t>
+        </w:r>
         <w:r>
           <w:rPr>
-            <w:color w:val="176575"/>
+            <w:rFonts w:ascii="Cambria Math" w:hAnsi="Cambria Math" w:cs="Cambria Math"/>
           </w:rPr>
-          <w:t>PDF</w:t>
+          <w:t>↗</w:t>
         </w:r>
       </w:hyperlink>
     </w:p>
     <w:p>
       <w:pPr>
-        <w:pStyle w:val="Pubtitle"/>
-        <w:rPr>
-          <w:rFonts w:hint="eastAsia"/>
-        </w:rPr>
-      </w:pPr>
-      <w:r>
-        <w:rPr>
-          <w:color w:val="176575"/>
-        </w:rPr>
-        <w:t xml:space="preserve">2010   </w:t>
-      </w:r>
-      <w:r>
-        <w:t>The SmartVision Navigation Prototype for the Blind</w:t>
-      </w:r>
-    </w:p>
-    <w:p>
-      <w:pPr>
         <w:pStyle w:val="Pubauthors"/>
         <w:rPr>
           <w:rFonts w:hint="eastAsia"/>
@@ -838,6 +800,8 @@
     <w:p>
       <w:pPr>
         <w:pStyle w:val="Pubvenue"/>
+        <w:keepNext w:val="0"/>
+        <w:spacing w:after="60"/>
         <w:rPr>
           <w:rFonts w:hint="eastAsia"/>
         </w:rPr>
@@ -845,22 +809,6 @@
       <w:r>
         <w:t>3rd International Conference on Software Development for Enhancing Accessibility and Fighting Info-exclusion (DSAI), Oxford, 167-174.</w:t>
       </w:r>
-    </w:p>
-    <w:p>
-      <w:pPr>
-        <w:pStyle w:val="Publinks"/>
-        <w:rPr>
-          <w:rFonts w:hint="eastAsia"/>
-        </w:rPr>
-      </w:pPr>
-      <w:hyperlink r:id="rId24">
-        <w:r>
-          <w:rPr>
-            <w:color w:val="176575"/>
-          </w:rPr>
-          <w:t>PDF</w:t>
-        </w:r>
-      </w:hyperlink>
     </w:p>
     <w:p>
       <w:pPr>
@@ -888,9 +836,17 @@
         </w:rPr>
         <w:t xml:space="preserve">2012   </w:t>
       </w:r>
-      <w:r>
-        <w:t>Blavigator: a navigation aid for blind persons</w:t>
-      </w:r>
+      <w:hyperlink r:id="rId25" w:anchor="page=99">
+        <w:r>
+          <w:t xml:space="preserve">Blavigator: a navigation aid for blind persons </w:t>
+        </w:r>
+        <w:r>
+          <w:rPr>
+            <w:rFonts w:ascii="Cambria Math" w:hAnsi="Cambria Math" w:cs="Cambria Math"/>
+          </w:rPr>
+          <w:t>↗</w:t>
+        </w:r>
+      </w:hyperlink>
     </w:p>
     <w:p>
       <w:pPr>
@@ -912,27 +868,22 @@
     <w:p>
       <w:pPr>
         <w:pStyle w:val="Pubvenue"/>
+        <w:keepNext w:val="0"/>
+        <w:spacing w:after="60"/>
         <w:rPr>
           <w:rFonts w:hint="eastAsia"/>
         </w:rPr>
       </w:pPr>
       <w:r>
-        <w:t>ECVP 2012. Perception, 41(1_suppl), p. 99, abstract 97.</w:t>
-      </w:r>
-    </w:p>
-    <w:p>
-      <w:pPr>
-        <w:pStyle w:val="Publinks"/>
-        <w:rPr>
-          <w:rFonts w:hint="eastAsia"/>
-        </w:rPr>
-      </w:pPr>
-      <w:hyperlink r:id="rId25" w:anchor="page=99">
+        <w:t xml:space="preserve">ECVP 2012. Perception, 41(1_suppl), p. 99, abstract 97. </w:t>
+      </w:r>
+      <w:hyperlink r:id="rId26">
         <w:r>
           <w:rPr>
             <w:color w:val="176575"/>
+            <w:sz w:val="19"/>
           </w:rPr>
-          <w:t>Abstract collection PDF · p. 99</w:t>
+          <w:t>Supplement DOI: 10.1177/03010066120410s101</w:t>
         </w:r>
       </w:hyperlink>
     </w:p>
@@ -962,9 +913,17 @@
         </w:rPr>
         <w:t xml:space="preserve">2013   </w:t>
       </w:r>
-      <w:r>
-        <w:t>Real-time path and obstacle detection for blind persons</w:t>
-      </w:r>
+      <w:hyperlink r:id="rId27">
+        <w:r>
+          <w:t xml:space="preserve">Real-time path and obstacle detection for blind persons </w:t>
+        </w:r>
+        <w:r>
+          <w:rPr>
+            <w:rFonts w:ascii="Cambria Math" w:hAnsi="Cambria Math" w:cs="Cambria Math"/>
+          </w:rPr>
+          <w:t>↗</w:t>
+        </w:r>
+      </w:hyperlink>
     </w:p>
     <w:p>
       <w:pPr>
@@ -984,6 +943,7 @@
       <w:pPr>
         <w:pStyle w:val="Pubvenue"/>
         <w:keepNext w:val="0"/>
+        <w:spacing w:after="60"/>
         <w:rPr>
           <w:rFonts w:hint="eastAsia"/>
         </w:rPr>
@@ -1037,11 +997,6 @@
           <w:color w:val="176575"/>
         </w:rPr>
         <w:tab/>
-      </w:r>
-      <w:r>
-        <w:rPr>
-          <w:color w:val="176575"/>
-        </w:rPr>
         <w:t>Sep 2011 - Oct 2013</w:t>
       </w:r>
     </w:p>
@@ -1115,12 +1070,23 @@
         </w:rPr>
         <w:t xml:space="preserve">Dissertation (2010): </w:t>
       </w:r>
-      <w:r>
-        <w:rPr>
-          <w:i/>
-        </w:rPr>
-        <w:t>Real-time path and obstacle detection for blind persons.</w:t>
-      </w:r>
+      <w:hyperlink r:id="rId28">
+        <w:r>
+          <w:rPr>
+            <w:i/>
+            <w:color w:val="000000"/>
+          </w:rPr>
+          <w:t xml:space="preserve">Real-time path and obstacle detection for blind persons </w:t>
+        </w:r>
+        <w:r>
+          <w:rPr>
+            <w:rFonts w:ascii="Cambria Math" w:hAnsi="Cambria Math" w:cs="Cambria Math"/>
+            <w:i/>
+            <w:color w:val="000000"/>
+          </w:rPr>
+          <w:t>↗</w:t>
+        </w:r>
+      </w:hyperlink>
     </w:p>
     <w:p>
       <w:pPr>
@@ -1132,23 +1098,6 @@
       <w:r>
         <w:t>Real-time path and obstacle detection on a small netbook using C/C++, OpenCV and Qt. Supervisor: Prof. Johannes Martinus Hubertina du Buf.</w:t>
       </w:r>
-    </w:p>
-    <w:p>
-      <w:pPr>
-        <w:pStyle w:val="Contact"/>
-        <w:spacing w:after="160"/>
-        <w:rPr>
-          <w:rFonts w:hint="eastAsia"/>
-        </w:rPr>
-      </w:pPr>
-      <w:hyperlink r:id="rId26">
-        <w:r>
-          <w:rPr>
-            <w:color w:val="176575"/>
-          </w:rPr>
-          <w:t>Dissertation · University of Algarve repository</w:t>
-        </w:r>
-      </w:hyperlink>
     </w:p>
     <w:p>
       <w:pPr>
@@ -1762,12 +1711,12 @@
       </w:r>
     </w:p>
     <w:sectPr>
-      <w:headerReference w:type="even" r:id="rId27"/>
-      <w:headerReference w:type="default" r:id="rId28"/>
-      <w:footerReference w:type="even" r:id="rId29"/>
-      <w:footerReference w:type="default" r:id="rId30"/>
-      <w:headerReference w:type="first" r:id="rId31"/>
-      <w:footerReference w:type="first" r:id="rId32"/>
+      <w:headerReference w:type="even" r:id="rId29"/>
+      <w:headerReference w:type="default" r:id="rId30"/>
+      <w:footerReference w:type="even" r:id="rId31"/>
+      <w:footerReference w:type="default" r:id="rId32"/>
+      <w:headerReference w:type="first" r:id="rId33"/>
+      <w:footerReference w:type="first" r:id="rId34"/>
       <w:pgSz w:w="11905" w:h="16838"/>
       <w:pgMar w:top="1077" w:right="1134" w:bottom="1020" w:left="1134" w:header="454" w:footer="454" w:gutter="0"/>
       <w:cols w:space="720"/>
@@ -2179,31 +2128,31 @@
       </w:rPr>
     </w:lvl>
   </w:abstractNum>
-  <w:num w:numId="1" w16cid:durableId="1495301232">
+  <w:num w:numId="1" w16cid:durableId="1612317408">
     <w:abstractNumId w:val="8"/>
   </w:num>
-  <w:num w:numId="2" w16cid:durableId="901672738">
+  <w:num w:numId="2" w16cid:durableId="845292990">
     <w:abstractNumId w:val="6"/>
   </w:num>
-  <w:num w:numId="3" w16cid:durableId="933787067">
+  <w:num w:numId="3" w16cid:durableId="1081022775">
     <w:abstractNumId w:val="5"/>
   </w:num>
-  <w:num w:numId="4" w16cid:durableId="891624435">
+  <w:num w:numId="4" w16cid:durableId="841820563">
     <w:abstractNumId w:val="4"/>
   </w:num>
-  <w:num w:numId="5" w16cid:durableId="1519779905">
+  <w:num w:numId="5" w16cid:durableId="1595742442">
     <w:abstractNumId w:val="7"/>
   </w:num>
-  <w:num w:numId="6" w16cid:durableId="1721855565">
+  <w:num w:numId="6" w16cid:durableId="686829575">
     <w:abstractNumId w:val="3"/>
   </w:num>
-  <w:num w:numId="7" w16cid:durableId="1113135534">
+  <w:num w:numId="7" w16cid:durableId="1900285026">
     <w:abstractNumId w:val="2"/>
   </w:num>
-  <w:num w:numId="8" w16cid:durableId="569197617">
+  <w:num w:numId="8" w16cid:durableId="1360593574">
     <w:abstractNumId w:val="1"/>
   </w:num>
-  <w:num w:numId="9" w16cid:durableId="1485313922">
+  <w:num w:numId="9" w16cid:durableId="1899436684">
     <w:abstractNumId w:val="0"/>
   </w:num>
 </w:numbering>

</xml_diff>

<commit_message>
Balance CV header and remove redundant document label
</commit_message>
<xml_diff>
--- a/academic/Joao_Jose_Academic_CV.docx
+++ b/academic/Joao_Jose_Academic_CV.docx
@@ -2,105 +2,166 @@
 <file path=word/document.xml><?xml version="1.0" encoding="utf-8"?>
 <w:document xmlns:wpc="http://schemas.microsoft.com/office/word/2010/wordprocessingCanvas" xmlns:cx="http://schemas.microsoft.com/office/drawing/2014/chartex" xmlns:cx1="http://schemas.microsoft.com/office/drawing/2015/9/8/chartex" xmlns:cx2="http://schemas.microsoft.com/office/drawing/2015/10/21/chartex" xmlns:cx3="http://schemas.microsoft.com/office/drawing/2016/5/9/chartex" xmlns:cx4="http://schemas.microsoft.com/office/drawing/2016/5/10/chartex" xmlns:cx5="http://schemas.microsoft.com/office/drawing/2016/5/11/chartex" xmlns:cx6="http://schemas.microsoft.com/office/drawing/2016/5/12/chartex" xmlns:cx7="http://schemas.microsoft.com/office/drawing/2016/5/13/chartex" xmlns:cx8="http://schemas.microsoft.com/office/drawing/2016/5/14/chartex" xmlns:mc="http://schemas.openxmlformats.org/markup-compatibility/2006" xmlns:aink="http://schemas.microsoft.com/office/drawing/2016/ink" xmlns:am3d="http://schemas.microsoft.com/office/drawing/2017/model3d" xmlns:o="urn:schemas-microsoft-com:office:office" xmlns:oel="http://schemas.microsoft.com/office/2019/extlst" xmlns:r="http://schemas.openxmlformats.org/officeDocument/2006/relationships" xmlns:m="http://schemas.openxmlformats.org/officeDocument/2006/math" xmlns:v="urn:schemas-microsoft-com:vml" xmlns:wp14="http://schemas.microsoft.com/office/word/2010/wordprocessingDrawing" xmlns:wp="http://schemas.openxmlformats.org/drawingml/2006/wordprocessingDrawing" xmlns:w10="urn:schemas-microsoft-com:office:word" xmlns:w="http://schemas.openxmlformats.org/wordprocessingml/2006/main" xmlns:w14="http://schemas.microsoft.com/office/word/2010/wordml" xmlns:w15="http://schemas.microsoft.com/office/word/2012/wordml" xmlns:w16cex="http://schemas.microsoft.com/office/word/2018/wordml/cex" xmlns:w16cid="http://schemas.microsoft.com/office/word/2016/wordml/cid" xmlns:w16="http://schemas.microsoft.com/office/word/2018/wordml" xmlns:w16du="http://schemas.microsoft.com/office/word/2023/wordml/word16du" xmlns:w16sdtdh="http://schemas.microsoft.com/office/word/2020/wordml/sdtdatahash" xmlns:w16sdtfl="http://schemas.microsoft.com/office/word/2024/wordml/sdtformatlock" xmlns:w16se="http://schemas.microsoft.com/office/word/2015/wordml/symex" xmlns:wpg="http://schemas.microsoft.com/office/word/2010/wordprocessingGroup" xmlns:wpi="http://schemas.microsoft.com/office/word/2010/wordprocessingInk" xmlns:wne="http://schemas.microsoft.com/office/word/2006/wordml" xmlns:wps="http://schemas.microsoft.com/office/word/2010/wordprocessingShape" mc:Ignorable="w14 w15 w16se w16cid w16 w16cex w16sdtdh w16sdtfl w16du wp14">
   <w:body>
+    <w:tbl>
+      <w:tblPr>
+        <w:tblW w:w="0" w:type="auto"/>
+        <w:tblBorders>
+          <w:top w:val="nil"/>
+          <w:left w:val="nil"/>
+          <w:bottom w:val="nil"/>
+          <w:right w:val="nil"/>
+          <w:insideH w:val="nil"/>
+          <w:insideV w:val="nil"/>
+        </w:tblBorders>
+        <w:tblLayout w:type="fixed"/>
+        <w:tblLook w:val="04A0" w:firstRow="1" w:lastRow="0" w:firstColumn="1" w:lastColumn="0" w:noHBand="0" w:noVBand="1"/>
+      </w:tblPr>
+      <w:tblGrid>
+        <w:gridCol w:w="5556"/>
+        <w:gridCol w:w="4082"/>
+      </w:tblGrid>
+      <w:tr>
+        <w:trPr>
+          <w:cantSplit/>
+        </w:trPr>
+        <w:tc>
+          <w:tcPr>
+            <w:tcW w:w="5556" w:type="dxa"/>
+            <w:tcMar>
+              <w:top w:w="0" w:type="dxa"/>
+              <w:left w:w="0" w:type="dxa"/>
+              <w:bottom w:w="0" w:type="dxa"/>
+              <w:right w:w="0" w:type="dxa"/>
+            </w:tcMar>
+          </w:tcPr>
+          <w:p>
+            <w:pPr>
+              <w:pStyle w:val="Title"/>
+              <w:spacing w:after="100"/>
+            </w:pPr>
+            <w:r>
+              <w:t>João José</w:t>
+            </w:r>
+          </w:p>
+          <w:p>
+            <w:pPr>
+              <w:pStyle w:val="Identityarea"/>
+              <w:rPr>
+                <w:rFonts w:hint="eastAsia"/>
+              </w:rPr>
+            </w:pPr>
+            <w:r>
+              <w:t>Computer vision</w:t>
+            </w:r>
+            <w:r>
+              <w:br/>
+              <w:t>and assistive navigation</w:t>
+            </w:r>
+          </w:p>
+        </w:tc>
+        <w:tc>
+          <w:tcPr>
+            <w:tcW w:w="4082" w:type="dxa"/>
+            <w:tcMar>
+              <w:top w:w="0" w:type="dxa"/>
+              <w:left w:w="340" w:type="dxa"/>
+              <w:bottom w:w="0" w:type="dxa"/>
+              <w:right w:w="0" w:type="dxa"/>
+            </w:tcMar>
+          </w:tcPr>
+          <w:p>
+            <w:pPr>
+              <w:pStyle w:val="Identitycontact"/>
+              <w:jc w:val="right"/>
+              <w:rPr>
+                <w:rFonts w:hint="eastAsia"/>
+              </w:rPr>
+            </w:pPr>
+            <w:r>
+              <w:t>Portugal   ·   +351 910 005 592</w:t>
+            </w:r>
+          </w:p>
+          <w:p>
+            <w:pPr>
+              <w:pStyle w:val="Identitycontact"/>
+              <w:jc w:val="right"/>
+              <w:rPr>
+                <w:rFonts w:hint="eastAsia"/>
+              </w:rPr>
+            </w:pPr>
+            <w:hyperlink r:id="rId8">
+              <w:r>
+                <w:rPr>
+                  <w:color w:val="176575"/>
+                </w:rPr>
+                <w:t>joao@jtjsoftware.com</w:t>
+              </w:r>
+            </w:hyperlink>
+          </w:p>
+          <w:p>
+            <w:pPr>
+              <w:pStyle w:val="Identitycontact"/>
+              <w:jc w:val="right"/>
+              <w:rPr>
+                <w:rFonts w:hint="eastAsia"/>
+              </w:rPr>
+            </w:pPr>
+            <w:hyperlink r:id="rId9">
+              <w:r>
+                <w:rPr>
+                  <w:color w:val="176575"/>
+                </w:rPr>
+                <w:t>Academic profile</w:t>
+              </w:r>
+            </w:hyperlink>
+            <w:r>
+              <w:t xml:space="preserve">   ·   </w:t>
+            </w:r>
+            <w:hyperlink r:id="rId10">
+              <w:r>
+                <w:rPr>
+                  <w:color w:val="176575"/>
+                </w:rPr>
+                <w:t>Google Scholar</w:t>
+              </w:r>
+            </w:hyperlink>
+          </w:p>
+          <w:p>
+            <w:pPr>
+              <w:pStyle w:val="Identitycontact"/>
+              <w:spacing w:after="0"/>
+              <w:jc w:val="right"/>
+              <w:rPr>
+                <w:rFonts w:hint="eastAsia"/>
+              </w:rPr>
+            </w:pPr>
+            <w:hyperlink r:id="rId11">
+              <w:r>
+                <w:rPr>
+                  <w:color w:val="176575"/>
+                </w:rPr>
+                <w:t>LinkedIn</w:t>
+              </w:r>
+            </w:hyperlink>
+            <w:r>
+              <w:t xml:space="preserve">   ·   </w:t>
+            </w:r>
+            <w:hyperlink r:id="rId12">
+              <w:r>
+                <w:rPr>
+                  <w:color w:val="176575"/>
+                </w:rPr>
+                <w:t>GitHub</w:t>
+              </w:r>
+            </w:hyperlink>
+          </w:p>
+        </w:tc>
+      </w:tr>
+    </w:tbl>
     <w:p>
       <w:pPr>
-        <w:pStyle w:val="Kicker"/>
-        <w:rPr>
-          <w:rFonts w:hint="eastAsia"/>
-        </w:rPr>
-      </w:pPr>
-      <w:r>
-        <w:t>ACADEMIC CURRICULUM VITAE</w:t>
-      </w:r>
-    </w:p>
-    <w:p>
-      <w:pPr>
-        <w:pStyle w:val="Title"/>
-      </w:pPr>
-      <w:r>
-        <w:t>João José</w:t>
-      </w:r>
-    </w:p>
-    <w:p>
-      <w:pPr>
-        <w:pStyle w:val="Subtitle"/>
-      </w:pPr>
-      <w:r>
-        <w:t>Computer vision and assistive navigation</w:t>
-      </w:r>
-    </w:p>
-    <w:p>
-      <w:pPr>
-        <w:pStyle w:val="Contact"/>
-        <w:rPr>
-          <w:rFonts w:hint="eastAsia"/>
-        </w:rPr>
-      </w:pPr>
-      <w:r>
-        <w:t xml:space="preserve">Portugal   ·   +351 910 005 592   ·   </w:t>
-      </w:r>
-      <w:hyperlink r:id="rId8">
-        <w:r>
-          <w:rPr>
-            <w:color w:val="176575"/>
-          </w:rPr>
-          <w:t>joao@jtjsoftware.com</w:t>
-        </w:r>
-      </w:hyperlink>
-    </w:p>
-    <w:p>
-      <w:pPr>
-        <w:pStyle w:val="Contact"/>
-        <w:spacing w:after="340"/>
-        <w:rPr>
-          <w:rFonts w:hint="eastAsia"/>
-        </w:rPr>
-      </w:pPr>
-      <w:hyperlink r:id="rId9">
-        <w:r>
-          <w:rPr>
-            <w:color w:val="176575"/>
-          </w:rPr>
-          <w:t>Academic profile</w:t>
-        </w:r>
-      </w:hyperlink>
-      <w:r>
-        <w:t xml:space="preserve">   ·   </w:t>
-      </w:r>
-      <w:hyperlink r:id="rId10">
-        <w:r>
-          <w:rPr>
-            <w:color w:val="176575"/>
-          </w:rPr>
-          <w:t>Google Scholar</w:t>
-        </w:r>
-      </w:hyperlink>
-      <w:r>
-        <w:t xml:space="preserve">   ·   </w:t>
-      </w:r>
-      <w:hyperlink r:id="rId11">
-        <w:r>
-          <w:rPr>
-            <w:color w:val="176575"/>
-          </w:rPr>
-          <w:t>LinkedIn</w:t>
-        </w:r>
-      </w:hyperlink>
-      <w:r>
-        <w:t xml:space="preserve">   ·   </w:t>
-      </w:r>
-      <w:hyperlink r:id="rId12">
-        <w:r>
-          <w:rPr>
-            <w:color w:val="176575"/>
-          </w:rPr>
-          <w:t>GitHub</w:t>
-        </w:r>
-      </w:hyperlink>
-    </w:p>
-    <w:p>
-      <w:pPr>
         <w:pStyle w:val="Intro"/>
+        <w:spacing w:before="340"/>
         <w:rPr>
           <w:rFonts w:hint="eastAsia"/>
         </w:rPr>
@@ -1939,8 +2000,15 @@
     </w:r>
     <w:r>
       <w:tab/>
-      <w:t>Academic curriculum vitae</w:t>
     </w:r>
+    <w:hyperlink r:id="rId1">
+      <w:r>
+        <w:rPr>
+          <w:color w:val="176575"/>
+        </w:rPr>
+        <w:t>joao@jtjsoftware.com</w:t>
+      </w:r>
+    </w:hyperlink>
   </w:p>
 </w:hdr>
 </file>
@@ -2128,31 +2196,31 @@
       </w:rPr>
     </w:lvl>
   </w:abstractNum>
-  <w:num w:numId="1" w16cid:durableId="1612317408">
+  <w:num w:numId="1" w16cid:durableId="232741436">
     <w:abstractNumId w:val="8"/>
   </w:num>
-  <w:num w:numId="2" w16cid:durableId="845292990">
+  <w:num w:numId="2" w16cid:durableId="1493522749">
     <w:abstractNumId w:val="6"/>
   </w:num>
-  <w:num w:numId="3" w16cid:durableId="1081022775">
+  <w:num w:numId="3" w16cid:durableId="191649855">
     <w:abstractNumId w:val="5"/>
   </w:num>
-  <w:num w:numId="4" w16cid:durableId="841820563">
+  <w:num w:numId="4" w16cid:durableId="851380673">
     <w:abstractNumId w:val="4"/>
   </w:num>
-  <w:num w:numId="5" w16cid:durableId="1595742442">
+  <w:num w:numId="5" w16cid:durableId="2075080891">
     <w:abstractNumId w:val="7"/>
   </w:num>
-  <w:num w:numId="6" w16cid:durableId="686829575">
+  <w:num w:numId="6" w16cid:durableId="242643147">
     <w:abstractNumId w:val="3"/>
   </w:num>
-  <w:num w:numId="7" w16cid:durableId="1900285026">
+  <w:num w:numId="7" w16cid:durableId="1523786786">
     <w:abstractNumId w:val="2"/>
   </w:num>
-  <w:num w:numId="8" w16cid:durableId="1360593574">
+  <w:num w:numId="8" w16cid:durableId="1668627909">
     <w:abstractNumId w:val="1"/>
   </w:num>
-  <w:num w:numId="9" w16cid:durableId="1899436684">
+  <w:num w:numId="9" w16cid:durableId="1133213890">
     <w:abstractNumId w:val="0"/>
   </w:num>
 </w:numbering>
@@ -13526,17 +13594,26 @@
       </w:tcPr>
     </w:tblStylePr>
   </w:style>
-  <w:style w:type="paragraph" w:customStyle="1" w:styleId="Kicker">
-    <w:name w:val="Kicker"/>
+  <w:style w:type="paragraph" w:customStyle="1" w:styleId="Identityarea">
+    <w:name w:val="Identity area"/>
     <w:basedOn w:val="Normal"/>
     <w:pPr>
-      <w:keepNext/>
-      <w:spacing w:after="160" w:line="264" w:lineRule="auto"/>
+      <w:spacing w:after="0" w:line="276" w:lineRule="auto"/>
     </w:pPr>
     <w:rPr>
-      <w:b/>
       <w:color w:val="000000"/>
-      <w:sz w:val="18"/>
+      <w:sz w:val="25"/>
+    </w:rPr>
+  </w:style>
+  <w:style w:type="paragraph" w:customStyle="1" w:styleId="Identitycontact">
+    <w:name w:val="Identity contact"/>
+    <w:basedOn w:val="Normal"/>
+    <w:pPr>
+      <w:spacing w:after="80" w:line="276" w:lineRule="auto"/>
+    </w:pPr>
+    <w:rPr>
+      <w:color w:val="505B66"/>
+      <w:sz w:val="19"/>
     </w:rPr>
   </w:style>
   <w:style w:type="paragraph" w:customStyle="1" w:styleId="Contact">

</xml_diff>

<commit_message>
Refine CV identity and add centred versioned footers
</commit_message>
<xml_diff>
--- a/academic/Joao_Jose_Academic_CV.docx
+++ b/academic/Joao_Jose_Academic_CV.docx
@@ -17,8 +17,8 @@
         <w:tblLook w:val="04A0" w:firstRow="1" w:lastRow="0" w:firstColumn="1" w:lastColumn="0" w:noHBand="0" w:noVBand="1"/>
       </w:tblPr>
       <w:tblGrid>
-        <w:gridCol w:w="5556"/>
-        <w:gridCol w:w="4082"/>
+        <w:gridCol w:w="6123"/>
+        <w:gridCol w:w="3515"/>
       </w:tblGrid>
       <w:tr>
         <w:trPr>
@@ -26,48 +26,34 @@
         </w:trPr>
         <w:tc>
           <w:tcPr>
-            <w:tcW w:w="5556" w:type="dxa"/>
+            <w:tcW w:w="6123" w:type="dxa"/>
             <w:tcMar>
               <w:top w:w="0" w:type="dxa"/>
               <w:left w:w="0" w:type="dxa"/>
               <w:bottom w:w="0" w:type="dxa"/>
               <w:right w:w="0" w:type="dxa"/>
             </w:tcMar>
+            <w:vAlign w:val="center"/>
           </w:tcPr>
           <w:p>
             <w:pPr>
               <w:pStyle w:val="Title"/>
-              <w:spacing w:after="100"/>
             </w:pPr>
             <w:r>
               <w:t>João José</w:t>
             </w:r>
           </w:p>
-          <w:p>
-            <w:pPr>
-              <w:pStyle w:val="Identityarea"/>
-              <w:rPr>
-                <w:rFonts w:hint="eastAsia"/>
-              </w:rPr>
-            </w:pPr>
-            <w:r>
-              <w:t>Computer vision</w:t>
-            </w:r>
-            <w:r>
-              <w:br/>
-              <w:t>and assistive navigation</w:t>
-            </w:r>
-          </w:p>
         </w:tc>
         <w:tc>
           <w:tcPr>
-            <w:tcW w:w="4082" w:type="dxa"/>
+            <w:tcW w:w="3515" w:type="dxa"/>
             <w:tcMar>
               <w:top w:w="0" w:type="dxa"/>
-              <w:left w:w="340" w:type="dxa"/>
+              <w:left w:w="0" w:type="dxa"/>
               <w:bottom w:w="0" w:type="dxa"/>
               <w:right w:w="0" w:type="dxa"/>
             </w:tcMar>
+            <w:vAlign w:val="center"/>
           </w:tcPr>
           <w:p>
             <w:pPr>
@@ -84,6 +70,7 @@
           <w:p>
             <w:pPr>
               <w:pStyle w:val="Identitycontact"/>
+              <w:spacing w:after="0"/>
               <w:jc w:val="right"/>
               <w:rPr>
                 <w:rFonts w:hint="eastAsia"/>
@@ -98,70 +85,74 @@
               </w:r>
             </w:hyperlink>
           </w:p>
-          <w:p>
-            <w:pPr>
-              <w:pStyle w:val="Identitycontact"/>
-              <w:jc w:val="right"/>
-              <w:rPr>
-                <w:rFonts w:hint="eastAsia"/>
-              </w:rPr>
-            </w:pPr>
-            <w:hyperlink r:id="rId9">
-              <w:r>
-                <w:rPr>
-                  <w:color w:val="176575"/>
-                </w:rPr>
-                <w:t>Academic profile</w:t>
-              </w:r>
-            </w:hyperlink>
-            <w:r>
-              <w:t xml:space="preserve">   ·   </w:t>
-            </w:r>
-            <w:hyperlink r:id="rId10">
-              <w:r>
-                <w:rPr>
-                  <w:color w:val="176575"/>
-                </w:rPr>
-                <w:t>Google Scholar</w:t>
-              </w:r>
-            </w:hyperlink>
-          </w:p>
-          <w:p>
-            <w:pPr>
-              <w:pStyle w:val="Identitycontact"/>
-              <w:spacing w:after="0"/>
-              <w:jc w:val="right"/>
-              <w:rPr>
-                <w:rFonts w:hint="eastAsia"/>
-              </w:rPr>
-            </w:pPr>
-            <w:hyperlink r:id="rId11">
-              <w:r>
-                <w:rPr>
-                  <w:color w:val="176575"/>
-                </w:rPr>
-                <w:t>LinkedIn</w:t>
-              </w:r>
-            </w:hyperlink>
-            <w:r>
-              <w:t xml:space="preserve">   ·   </w:t>
-            </w:r>
-            <w:hyperlink r:id="rId12">
-              <w:r>
-                <w:rPr>
-                  <w:color w:val="176575"/>
-                </w:rPr>
-                <w:t>GitHub</w:t>
-              </w:r>
-            </w:hyperlink>
-          </w:p>
         </w:tc>
       </w:tr>
     </w:tbl>
     <w:p>
       <w:pPr>
+        <w:pStyle w:val="Identityarea"/>
+        <w:rPr>
+          <w:rFonts w:hint="eastAsia"/>
+        </w:rPr>
+      </w:pPr>
+      <w:r>
+        <w:t>Computer vision and assistive navigation</w:t>
+      </w:r>
+    </w:p>
+    <w:p>
+      <w:pPr>
+        <w:pStyle w:val="Contact"/>
+        <w:spacing w:before="80" w:after="0"/>
+        <w:rPr>
+          <w:rFonts w:hint="eastAsia"/>
+        </w:rPr>
+      </w:pPr>
+      <w:hyperlink r:id="rId9">
+        <w:r>
+          <w:rPr>
+            <w:color w:val="176575"/>
+          </w:rPr>
+          <w:t>Academic profile</w:t>
+        </w:r>
+      </w:hyperlink>
+      <w:r>
+        <w:t xml:space="preserve">   ·   </w:t>
+      </w:r>
+      <w:hyperlink r:id="rId10">
+        <w:r>
+          <w:rPr>
+            <w:color w:val="176575"/>
+          </w:rPr>
+          <w:t>Google Scholar</w:t>
+        </w:r>
+      </w:hyperlink>
+      <w:r>
+        <w:t xml:space="preserve">   ·   </w:t>
+      </w:r>
+      <w:hyperlink r:id="rId11">
+        <w:r>
+          <w:rPr>
+            <w:color w:val="176575"/>
+          </w:rPr>
+          <w:t>LinkedIn</w:t>
+        </w:r>
+      </w:hyperlink>
+      <w:r>
+        <w:t xml:space="preserve">   ·   </w:t>
+      </w:r>
+      <w:hyperlink r:id="rId12">
+        <w:r>
+          <w:rPr>
+            <w:color w:val="176575"/>
+          </w:rPr>
+          <w:t>GitHub</w:t>
+        </w:r>
+      </w:hyperlink>
+    </w:p>
+    <w:p>
+      <w:pPr>
         <w:pStyle w:val="Intro"/>
-        <w:spacing w:before="340"/>
+        <w:spacing w:before="280"/>
         <w:rPr>
           <w:rFonts w:hint="eastAsia"/>
         </w:rPr>
@@ -1781,7 +1772,6 @@
       <w:pgSz w:w="11905" w:h="16838"/>
       <w:pgMar w:top="1077" w:right="1134" w:bottom="1020" w:left="1134" w:header="454" w:footer="454" w:gutter="0"/>
       <w:cols w:space="720"/>
-      <w:titlePg/>
       <w:docGrid w:linePitch="360"/>
     </w:sectPr>
   </w:body>
@@ -1835,6 +1825,7 @@
     <w:pPr>
       <w:pStyle w:val="Footer"/>
       <w:tabs>
+        <w:tab w:val="center" w:pos="4818"/>
         <w:tab w:val="right" w:pos="9637"/>
       </w:tabs>
       <w:rPr>
@@ -1842,7 +1833,11 @@
       </w:rPr>
     </w:pPr>
     <w:r>
-      <w:t>17 September 2026</w:t>
+      <w:t>CV ID 20260917_001</w:t>
+    </w:r>
+    <w:r>
+      <w:tab/>
+      <w:t>Curriculum Vitae • João José</w:t>
     </w:r>
     <w:r>
       <w:tab/>
@@ -1863,7 +1858,7 @@
       <w:fldChar w:fldCharType="end"/>
     </w:r>
     <w:r>
-      <w:t xml:space="preserve"> / </w:t>
+      <w:t>/</w:t>
     </w:r>
     <w:r>
       <w:fldChar w:fldCharType="begin"/>
@@ -1889,52 +1884,7 @@
   <w:p>
     <w:pPr>
       <w:pStyle w:val="Footer"/>
-      <w:tabs>
-        <w:tab w:val="right" w:pos="9637"/>
-      </w:tabs>
-      <w:rPr>
-        <w:rFonts w:hint="eastAsia"/>
-      </w:rPr>
-    </w:pPr>
-    <w:r>
-      <w:t>17 September 2026</w:t>
-    </w:r>
-    <w:r>
-      <w:tab/>
-    </w:r>
-    <w:r>
-      <w:fldChar w:fldCharType="begin"/>
-    </w:r>
-    <w:r>
-      <w:instrText>PAGE</w:instrText>
-    </w:r>
-    <w:r>
-      <w:fldChar w:fldCharType="separate"/>
-    </w:r>
-    <w:r>
-      <w:t>1</w:t>
-    </w:r>
-    <w:r>
-      <w:fldChar w:fldCharType="end"/>
-    </w:r>
-    <w:r>
-      <w:t xml:space="preserve"> / </w:t>
-    </w:r>
-    <w:r>
-      <w:fldChar w:fldCharType="begin"/>
-    </w:r>
-    <w:r>
-      <w:instrText>NUMPAGES</w:instrText>
-    </w:r>
-    <w:r>
-      <w:fldChar w:fldCharType="separate"/>
-    </w:r>
-    <w:r>
-      <w:t>4</w:t>
-    </w:r>
-    <w:r>
-      <w:fldChar w:fldCharType="end"/>
-    </w:r>
+    </w:pPr>
   </w:p>
 </w:ftr>
 </file>
@@ -1985,30 +1935,7 @@
   <w:p>
     <w:pPr>
       <w:pStyle w:val="Header"/>
-      <w:tabs>
-        <w:tab w:val="right" w:pos="9637"/>
-      </w:tabs>
-      <w:rPr>
-        <w:rFonts w:hint="eastAsia"/>
-      </w:rPr>
-    </w:pPr>
-    <w:r>
-      <w:rPr>
-        <w:b/>
-      </w:rPr>
-      <w:t>João José</w:t>
-    </w:r>
-    <w:r>
-      <w:tab/>
-    </w:r>
-    <w:hyperlink r:id="rId1">
-      <w:r>
-        <w:rPr>
-          <w:color w:val="176575"/>
-        </w:rPr>
-        <w:t>joao@jtjsoftware.com</w:t>
-      </w:r>
-    </w:hyperlink>
+    </w:pPr>
   </w:p>
 </w:hdr>
 </file>
@@ -2196,31 +2123,31 @@
       </w:rPr>
     </w:lvl>
   </w:abstractNum>
-  <w:num w:numId="1" w16cid:durableId="232741436">
+  <w:num w:numId="1" w16cid:durableId="126709586">
     <w:abstractNumId w:val="8"/>
   </w:num>
-  <w:num w:numId="2" w16cid:durableId="1493522749">
+  <w:num w:numId="2" w16cid:durableId="1917469742">
     <w:abstractNumId w:val="6"/>
   </w:num>
-  <w:num w:numId="3" w16cid:durableId="191649855">
+  <w:num w:numId="3" w16cid:durableId="685710860">
     <w:abstractNumId w:val="5"/>
   </w:num>
-  <w:num w:numId="4" w16cid:durableId="851380673">
+  <w:num w:numId="4" w16cid:durableId="752701633">
     <w:abstractNumId w:val="4"/>
   </w:num>
-  <w:num w:numId="5" w16cid:durableId="2075080891">
+  <w:num w:numId="5" w16cid:durableId="693045561">
     <w:abstractNumId w:val="7"/>
   </w:num>
-  <w:num w:numId="6" w16cid:durableId="242643147">
+  <w:num w:numId="6" w16cid:durableId="1260214620">
     <w:abstractNumId w:val="3"/>
   </w:num>
-  <w:num w:numId="7" w16cid:durableId="1523786786">
+  <w:num w:numId="7" w16cid:durableId="477037405">
     <w:abstractNumId w:val="2"/>
   </w:num>
-  <w:num w:numId="8" w16cid:durableId="1668627909">
+  <w:num w:numId="8" w16cid:durableId="893931933">
     <w:abstractNumId w:val="1"/>
   </w:num>
-  <w:num w:numId="9" w16cid:durableId="1133213890">
+  <w:num w:numId="9" w16cid:durableId="671612997">
     <w:abstractNumId w:val="0"/>
   </w:num>
 </w:numbering>
@@ -2886,8 +2813,8 @@
       <w:spacing w:after="0" w:line="264" w:lineRule="auto"/>
     </w:pPr>
     <w:rPr>
-      <w:color w:val="505B66"/>
-      <w:sz w:val="17"/>
+      <w:color w:val="78818B"/>
+      <w:sz w:val="16"/>
     </w:rPr>
   </w:style>
   <w:style w:type="character" w:customStyle="1" w:styleId="FooterChar">
@@ -2958,15 +2885,16 @@
     <w:qFormat/>
     <w:rsid w:val="00FC693F"/>
     <w:pPr>
-      <w:spacing w:after="20" w:line="240" w:lineRule="auto"/>
+      <w:spacing w:after="0" w:line="240" w:lineRule="auto"/>
       <w:contextualSpacing/>
     </w:pPr>
     <w:rPr>
       <w:rFonts w:asciiTheme="majorHAnsi" w:eastAsiaTheme="majorEastAsia" w:hAnsiTheme="majorHAnsi" w:cstheme="majorBidi"/>
+      <w:b/>
       <w:color w:val="000000"/>
       <w:spacing w:val="5"/>
       <w:kern w:val="28"/>
-      <w:sz w:val="62"/>
+      <w:sz w:val="56"/>
       <w:szCs w:val="52"/>
     </w:rPr>
   </w:style>
@@ -13598,10 +13526,9 @@
     <w:name w:val="Identity area"/>
     <w:basedOn w:val="Normal"/>
     <w:pPr>
-      <w:spacing w:after="0" w:line="276" w:lineRule="auto"/>
+      <w:spacing w:before="120" w:after="0" w:line="264" w:lineRule="auto"/>
     </w:pPr>
     <w:rPr>
-      <w:color w:val="000000"/>
       <w:sz w:val="25"/>
     </w:rPr>
   </w:style>
@@ -13609,7 +13536,7 @@
     <w:name w:val="Identity contact"/>
     <w:basedOn w:val="Normal"/>
     <w:pPr>
-      <w:spacing w:after="80" w:line="276" w:lineRule="auto"/>
+      <w:spacing w:after="40" w:line="264" w:lineRule="auto"/>
     </w:pPr>
     <w:rPr>
       <w:color w:val="505B66"/>

</xml_diff>

<commit_message>
Make academic CV consistent and readable in print
</commit_message>
<xml_diff>
--- a/academic/Joao_Jose_Academic_CV.docx
+++ b/academic/Joao_Jose_Academic_CV.docx
@@ -17,8 +17,8 @@
         <w:tblLook w:val="04A0" w:firstRow="1" w:lastRow="0" w:firstColumn="1" w:lastColumn="0" w:noHBand="0" w:noVBand="1"/>
       </w:tblPr>
       <w:tblGrid>
-        <w:gridCol w:w="6123"/>
-        <w:gridCol w:w="3515"/>
+        <w:gridCol w:w="5159"/>
+        <w:gridCol w:w="4479"/>
       </w:tblGrid>
       <w:tr>
         <w:trPr>
@@ -26,14 +26,13 @@
         </w:trPr>
         <w:tc>
           <w:tcPr>
-            <w:tcW w:w="6123" w:type="dxa"/>
+            <w:tcW w:w="5159" w:type="dxa"/>
             <w:tcMar>
               <w:top w:w="0" w:type="dxa"/>
               <w:left w:w="0" w:type="dxa"/>
               <w:bottom w:w="0" w:type="dxa"/>
               <w:right w:w="0" w:type="dxa"/>
             </w:tcMar>
-            <w:vAlign w:val="center"/>
           </w:tcPr>
           <w:p>
             <w:pPr>
@@ -46,7 +45,7 @@
         </w:tc>
         <w:tc>
           <w:tcPr>
-            <w:tcW w:w="3515" w:type="dxa"/>
+            <w:tcW w:w="4479" w:type="dxa"/>
             <w:tcMar>
               <w:top w:w="0" w:type="dxa"/>
               <w:left w:w="0" w:type="dxa"/>
@@ -63,9 +62,11 @@
                 <w:rFonts w:hint="eastAsia"/>
               </w:rPr>
             </w:pPr>
-            <w:r>
-              <w:t>Portugal   ·   +351 910 005 592</w:t>
-            </w:r>
+            <w:hyperlink r:id="rId8">
+              <w:r>
+                <w:t>joao@jtjsoftware.com</w:t>
+              </w:r>
+            </w:hyperlink>
           </w:p>
           <w:p>
             <w:pPr>
@@ -76,12 +77,9 @@
                 <w:rFonts w:hint="eastAsia"/>
               </w:rPr>
             </w:pPr>
-            <w:hyperlink r:id="rId8">
+            <w:hyperlink r:id="rId9">
               <w:r>
-                <w:rPr>
-                  <w:color w:val="176575"/>
-                </w:rPr>
-                <w:t>joao@jtjsoftware.com</w:t>
+                <w:t>joaotiagojose.github.io/academic/</w:t>
               </w:r>
             </w:hyperlink>
           </w:p>
@@ -101,56 +99,6 @@
     </w:p>
     <w:p>
       <w:pPr>
-        <w:pStyle w:val="Contact"/>
-        <w:spacing w:before="80" w:after="0"/>
-        <w:rPr>
-          <w:rFonts w:hint="eastAsia"/>
-        </w:rPr>
-      </w:pPr>
-      <w:hyperlink r:id="rId9">
-        <w:r>
-          <w:rPr>
-            <w:color w:val="176575"/>
-          </w:rPr>
-          <w:t>Academic profile</w:t>
-        </w:r>
-      </w:hyperlink>
-      <w:r>
-        <w:t xml:space="preserve">   ·   </w:t>
-      </w:r>
-      <w:hyperlink r:id="rId10">
-        <w:r>
-          <w:rPr>
-            <w:color w:val="176575"/>
-          </w:rPr>
-          <w:t>Google Scholar</w:t>
-        </w:r>
-      </w:hyperlink>
-      <w:r>
-        <w:t xml:space="preserve">   ·   </w:t>
-      </w:r>
-      <w:hyperlink r:id="rId11">
-        <w:r>
-          <w:rPr>
-            <w:color w:val="176575"/>
-          </w:rPr>
-          <w:t>LinkedIn</w:t>
-        </w:r>
-      </w:hyperlink>
-      <w:r>
-        <w:t xml:space="preserve">   ·   </w:t>
-      </w:r>
-      <w:hyperlink r:id="rId12">
-        <w:r>
-          <w:rPr>
-            <w:color w:val="176575"/>
-          </w:rPr>
-          <w:t>GitHub</w:t>
-        </w:r>
-      </w:hyperlink>
-    </w:p>
-    <w:p>
-      <w:pPr>
         <w:pStyle w:val="Intro"/>
         <w:spacing w:before="280"/>
         <w:rPr>
@@ -170,33 +118,84 @@
         <w:t>Research experience</w:t>
       </w:r>
     </w:p>
+    <w:tbl>
+      <w:tblPr>
+        <w:tblW w:w="0" w:type="auto"/>
+        <w:tblBorders>
+          <w:top w:val="nil"/>
+          <w:left w:val="nil"/>
+          <w:bottom w:val="nil"/>
+          <w:right w:val="nil"/>
+          <w:insideH w:val="nil"/>
+          <w:insideV w:val="nil"/>
+        </w:tblBorders>
+        <w:tblLayout w:type="fixed"/>
+        <w:tblLook w:val="04A0" w:firstRow="1" w:lastRow="0" w:firstColumn="1" w:lastColumn="0" w:noHBand="0" w:noVBand="1"/>
+      </w:tblPr>
+      <w:tblGrid>
+        <w:gridCol w:w="7483"/>
+        <w:gridCol w:w="2154"/>
+      </w:tblGrid>
+      <w:tr>
+        <w:trPr>
+          <w:cantSplit/>
+        </w:trPr>
+        <w:tc>
+          <w:tcPr>
+            <w:tcW w:w="7483" w:type="dxa"/>
+            <w:tcMar>
+              <w:top w:w="0" w:type="dxa"/>
+              <w:left w:w="0" w:type="dxa"/>
+              <w:bottom w:w="0" w:type="dxa"/>
+              <w:right w:w="0" w:type="dxa"/>
+            </w:tcMar>
+          </w:tcPr>
+          <w:p>
+            <w:pPr>
+              <w:pStyle w:val="Heading3"/>
+              <w:ind w:right="170"/>
+            </w:pPr>
+            <w:r>
+              <w:t>Computer Vision Researcher and Research Fellow</w:t>
+            </w:r>
+          </w:p>
+        </w:tc>
+        <w:tc>
+          <w:tcPr>
+            <w:tcW w:w="2154" w:type="dxa"/>
+            <w:tcMar>
+              <w:top w:w="0" w:type="dxa"/>
+              <w:left w:w="0" w:type="dxa"/>
+              <w:bottom w:w="0" w:type="dxa"/>
+              <w:right w:w="0" w:type="dxa"/>
+            </w:tcMar>
+          </w:tcPr>
+          <w:p>
+            <w:pPr>
+              <w:pStyle w:val="Date1"/>
+              <w:keepNext/>
+              <w:spacing w:before="80" w:after="40"/>
+              <w:jc w:val="right"/>
+              <w:rPr>
+                <w:rFonts w:hint="eastAsia"/>
+              </w:rPr>
+            </w:pPr>
+            <w:r>
+              <w:t>2008 – 2013</w:t>
+            </w:r>
+          </w:p>
+        </w:tc>
+      </w:tr>
+    </w:tbl>
     <w:p>
       <w:pPr>
-        <w:pStyle w:val="Heading3"/>
-      </w:pPr>
-      <w:r>
-        <w:t>Computer Vision Researcher and Research Fellow</w:t>
-      </w:r>
-    </w:p>
-    <w:p>
-      <w:pPr>
         <w:pStyle w:val="Meta"/>
-        <w:tabs>
-          <w:tab w:val="right" w:pos="9637"/>
-        </w:tabs>
         <w:rPr>
           <w:rFonts w:hint="eastAsia"/>
         </w:rPr>
       </w:pPr>
       <w:r>
         <w:t>Vision Laboratory, University of Algarve</w:t>
-      </w:r>
-      <w:r>
-        <w:rPr>
-          <w:color w:val="176575"/>
-        </w:rPr>
-        <w:tab/>
-        <w:t>2008 - 2013</w:t>
       </w:r>
     </w:p>
     <w:p>
@@ -386,6 +385,157 @@
     </w:p>
     <w:p>
       <w:pPr>
+        <w:pStyle w:val="Heading2"/>
+        <w:spacing w:before="300"/>
+      </w:pPr>
+      <w:r>
+        <w:t>Contact and profiles</w:t>
+      </w:r>
+    </w:p>
+    <w:p>
+      <w:pPr>
+        <w:pStyle w:val="Contact"/>
+        <w:rPr>
+          <w:rFonts w:hint="eastAsia"/>
+        </w:rPr>
+      </w:pPr>
+      <w:r>
+        <w:t>Portugal  ·  +351 910 005 592</w:t>
+      </w:r>
+    </w:p>
+    <w:p>
+      <w:pPr>
+        <w:pStyle w:val="Contact"/>
+        <w:spacing w:after="80"/>
+        <w:rPr>
+          <w:rFonts w:hint="eastAsia"/>
+        </w:rPr>
+      </w:pPr>
+      <w:r>
+        <w:rPr>
+          <w:noProof/>
+        </w:rPr>
+        <w:drawing>
+          <wp:inline distT="0" distB="0" distL="0" distR="0" wp14:anchorId="1E6B3E86" wp14:editId="134A5653">
+            <wp:extent cx="118800" cy="118800"/>
+            <wp:effectExtent l="0" t="0" r="0" b="0"/>
+            <wp:docPr id="1" name="Picture 1"/>
+            <wp:cNvGraphicFramePr>
+              <a:graphicFrameLocks xmlns:a="http://schemas.openxmlformats.org/drawingml/2006/main" noChangeAspect="1"/>
+            </wp:cNvGraphicFramePr>
+            <a:graphic xmlns:a="http://schemas.openxmlformats.org/drawingml/2006/main">
+              <a:graphicData uri="http://schemas.openxmlformats.org/drawingml/2006/picture">
+                <pic:pic xmlns:pic="http://schemas.openxmlformats.org/drawingml/2006/picture">
+                  <pic:nvPicPr>
+                    <pic:cNvPr id="0" name="linkedin.png"/>
+                    <pic:cNvPicPr/>
+                  </pic:nvPicPr>
+                  <pic:blipFill>
+                    <a:blip r:embed="rId10"/>
+                    <a:stretch>
+                      <a:fillRect/>
+                    </a:stretch>
+                  </pic:blipFill>
+                  <pic:spPr>
+                    <a:xfrm>
+                      <a:off x="0" y="0"/>
+                      <a:ext cx="118800" cy="118800"/>
+                    </a:xfrm>
+                    <a:prstGeom prst="rect">
+                      <a:avLst/>
+                    </a:prstGeom>
+                  </pic:spPr>
+                </pic:pic>
+              </a:graphicData>
+            </a:graphic>
+          </wp:inline>
+        </w:drawing>
+      </w:r>
+      <w:r>
+        <w:t xml:space="preserve">  </w:t>
+      </w:r>
+      <w:hyperlink r:id="rId11">
+        <w:r>
+          <w:t>linkedin.com/in/joaojose</w:t>
+        </w:r>
+      </w:hyperlink>
+    </w:p>
+    <w:p>
+      <w:pPr>
+        <w:pStyle w:val="Contact"/>
+        <w:spacing w:after="80"/>
+        <w:rPr>
+          <w:rFonts w:hint="eastAsia"/>
+        </w:rPr>
+      </w:pPr>
+      <w:r>
+        <w:rPr>
+          <w:noProof/>
+        </w:rPr>
+        <w:drawing>
+          <wp:inline distT="0" distB="0" distL="0" distR="0" wp14:anchorId="25DE781C" wp14:editId="62B2885C">
+            <wp:extent cx="118800" cy="118800"/>
+            <wp:effectExtent l="0" t="0" r="0" b="0"/>
+            <wp:docPr id="2" name="Picture 2"/>
+            <wp:cNvGraphicFramePr>
+              <a:graphicFrameLocks xmlns:a="http://schemas.openxmlformats.org/drawingml/2006/main" noChangeAspect="1"/>
+            </wp:cNvGraphicFramePr>
+            <a:graphic xmlns:a="http://schemas.openxmlformats.org/drawingml/2006/main">
+              <a:graphicData uri="http://schemas.openxmlformats.org/drawingml/2006/picture">
+                <pic:pic xmlns:pic="http://schemas.openxmlformats.org/drawingml/2006/picture">
+                  <pic:nvPicPr>
+                    <pic:cNvPr id="0" name="github.png"/>
+                    <pic:cNvPicPr/>
+                  </pic:nvPicPr>
+                  <pic:blipFill>
+                    <a:blip r:embed="rId12"/>
+                    <a:stretch>
+                      <a:fillRect/>
+                    </a:stretch>
+                  </pic:blipFill>
+                  <pic:spPr>
+                    <a:xfrm>
+                      <a:off x="0" y="0"/>
+                      <a:ext cx="118800" cy="118800"/>
+                    </a:xfrm>
+                    <a:prstGeom prst="rect">
+                      <a:avLst/>
+                    </a:prstGeom>
+                  </pic:spPr>
+                </pic:pic>
+              </a:graphicData>
+            </a:graphic>
+          </wp:inline>
+        </w:drawing>
+      </w:r>
+      <w:r>
+        <w:t xml:space="preserve">  </w:t>
+      </w:r>
+      <w:hyperlink r:id="rId13">
+        <w:r>
+          <w:t>github.com/joaotiagojose</w:t>
+        </w:r>
+      </w:hyperlink>
+    </w:p>
+    <w:p>
+      <w:pPr>
+        <w:pStyle w:val="Contact"/>
+        <w:spacing w:after="0"/>
+        <w:rPr>
+          <w:rFonts w:hint="eastAsia"/>
+        </w:rPr>
+      </w:pPr>
+      <w:r>
+        <w:t xml:space="preserve">Google Scholar  ·  </w:t>
+      </w:r>
+      <w:hyperlink r:id="rId14">
+        <w:r>
+          <w:t>scholar.google.com/citations?user=3z3wfQMAAAAJ</w:t>
+        </w:r>
+      </w:hyperlink>
+    </w:p>
+    <w:p>
+      <w:pPr>
         <w:pStyle w:val="Heading1"/>
         <w:pageBreakBefore/>
       </w:pPr>
@@ -406,32 +556,79 @@
         <w:t>Journal articles</w:t>
       </w:r>
     </w:p>
-    <w:p>
-      <w:pPr>
-        <w:pStyle w:val="Pubtitle"/>
-        <w:spacing w:before="0"/>
-        <w:rPr>
-          <w:rFonts w:hint="eastAsia"/>
-        </w:rPr>
-      </w:pPr>
-      <w:r>
-        <w:rPr>
-          <w:color w:val="176575"/>
-        </w:rPr>
-        <w:t xml:space="preserve">2015   </w:t>
-      </w:r>
-      <w:hyperlink r:id="rId13">
-        <w:r>
-          <w:t xml:space="preserve">Computer vision and GIS for the navigation of blind persons in buildings </w:t>
-        </w:r>
-        <w:r>
-          <w:rPr>
-            <w:rFonts w:ascii="Cambria Math" w:hAnsi="Cambria Math" w:cs="Cambria Math"/>
-          </w:rPr>
-          <w:t>↗</w:t>
-        </w:r>
-      </w:hyperlink>
-    </w:p>
+    <w:tbl>
+      <w:tblPr>
+        <w:tblW w:w="0" w:type="auto"/>
+        <w:tblBorders>
+          <w:top w:val="nil"/>
+          <w:left w:val="nil"/>
+          <w:bottom w:val="nil"/>
+          <w:right w:val="nil"/>
+          <w:insideH w:val="nil"/>
+          <w:insideV w:val="nil"/>
+        </w:tblBorders>
+        <w:tblLayout w:type="fixed"/>
+        <w:tblLook w:val="04A0" w:firstRow="1" w:lastRow="0" w:firstColumn="1" w:lastColumn="0" w:noHBand="0" w:noVBand="1"/>
+      </w:tblPr>
+      <w:tblGrid>
+        <w:gridCol w:w="7483"/>
+        <w:gridCol w:w="2154"/>
+      </w:tblGrid>
+      <w:tr>
+        <w:trPr>
+          <w:cantSplit/>
+        </w:trPr>
+        <w:tc>
+          <w:tcPr>
+            <w:tcW w:w="7483" w:type="dxa"/>
+            <w:tcMar>
+              <w:top w:w="0" w:type="dxa"/>
+              <w:left w:w="0" w:type="dxa"/>
+              <w:bottom w:w="0" w:type="dxa"/>
+              <w:right w:w="0" w:type="dxa"/>
+            </w:tcMar>
+          </w:tcPr>
+          <w:p>
+            <w:pPr>
+              <w:pStyle w:val="Pubtitle"/>
+              <w:spacing w:before="0"/>
+              <w:ind w:right="170"/>
+              <w:rPr>
+                <w:rFonts w:hint="eastAsia"/>
+              </w:rPr>
+            </w:pPr>
+            <w:r>
+              <w:t>Computer vision and GIS for the navigation of blind persons in buildings</w:t>
+            </w:r>
+          </w:p>
+        </w:tc>
+        <w:tc>
+          <w:tcPr>
+            <w:tcW w:w="2154" w:type="dxa"/>
+            <w:tcMar>
+              <w:top w:w="0" w:type="dxa"/>
+              <w:left w:w="0" w:type="dxa"/>
+              <w:bottom w:w="0" w:type="dxa"/>
+              <w:right w:w="0" w:type="dxa"/>
+            </w:tcMar>
+          </w:tcPr>
+          <w:p>
+            <w:pPr>
+              <w:pStyle w:val="Date1"/>
+              <w:keepNext/>
+              <w:spacing w:before="0" w:after="40"/>
+              <w:jc w:val="right"/>
+              <w:rPr>
+                <w:rFonts w:hint="eastAsia"/>
+              </w:rPr>
+            </w:pPr>
+            <w:r>
+              <w:t>2015</w:t>
+            </w:r>
+          </w:p>
+        </w:tc>
+      </w:tr>
+    </w:tbl>
     <w:p>
       <w:pPr>
         <w:pStyle w:val="Pubauthors"/>
@@ -462,43 +659,96 @@
         </w:rPr>
       </w:pPr>
       <w:r>
-        <w:t xml:space="preserve">Universal Access in the Information Society, 14, 67-80. March 2015; online 19 February 2014. </w:t>
+        <w:t>Universal Access in the Information Society, 14, 67-80. March 2015; online 19 February 2014.</w:t>
       </w:r>
-      <w:hyperlink r:id="rId14">
+      <w:r>
+        <w:br/>
+      </w:r>
+      <w:hyperlink r:id="rId15">
         <w:r>
           <w:rPr>
-            <w:color w:val="176575"/>
             <w:sz w:val="19"/>
           </w:rPr>
           <w:t>DOI: 10.1007/s10209-013-0338-8</w:t>
         </w:r>
       </w:hyperlink>
     </w:p>
-    <w:p>
-      <w:pPr>
-        <w:pStyle w:val="Pubtitle"/>
-        <w:rPr>
-          <w:rFonts w:hint="eastAsia"/>
-        </w:rPr>
-      </w:pPr>
-      <w:r>
-        <w:rPr>
-          <w:color w:val="176575"/>
-        </w:rPr>
-        <w:t xml:space="preserve">2011   </w:t>
-      </w:r>
-      <w:hyperlink r:id="rId15">
-        <w:r>
-          <w:t xml:space="preserve">The SmartVision local navigation aid for blind and visually impaired persons </w:t>
-        </w:r>
-        <w:r>
-          <w:rPr>
-            <w:rFonts w:ascii="Cambria Math" w:hAnsi="Cambria Math" w:cs="Cambria Math"/>
-          </w:rPr>
-          <w:t>↗</w:t>
-        </w:r>
-      </w:hyperlink>
-    </w:p>
+    <w:tbl>
+      <w:tblPr>
+        <w:tblW w:w="0" w:type="auto"/>
+        <w:tblBorders>
+          <w:top w:val="nil"/>
+          <w:left w:val="nil"/>
+          <w:bottom w:val="nil"/>
+          <w:right w:val="nil"/>
+          <w:insideH w:val="nil"/>
+          <w:insideV w:val="nil"/>
+        </w:tblBorders>
+        <w:tblLayout w:type="fixed"/>
+        <w:tblLook w:val="04A0" w:firstRow="1" w:lastRow="0" w:firstColumn="1" w:lastColumn="0" w:noHBand="0" w:noVBand="1"/>
+      </w:tblPr>
+      <w:tblGrid>
+        <w:gridCol w:w="7483"/>
+        <w:gridCol w:w="2154"/>
+      </w:tblGrid>
+      <w:tr>
+        <w:trPr>
+          <w:cantSplit/>
+        </w:trPr>
+        <w:tc>
+          <w:tcPr>
+            <w:tcW w:w="7483" w:type="dxa"/>
+            <w:tcMar>
+              <w:top w:w="0" w:type="dxa"/>
+              <w:left w:w="0" w:type="dxa"/>
+              <w:bottom w:w="0" w:type="dxa"/>
+              <w:right w:w="0" w:type="dxa"/>
+            </w:tcMar>
+          </w:tcPr>
+          <w:p>
+            <w:pPr>
+              <w:pStyle w:val="Pubtitle"/>
+              <w:ind w:right="170"/>
+              <w:rPr>
+                <w:rFonts w:hint="eastAsia"/>
+              </w:rPr>
+            </w:pPr>
+            <w:r>
+              <w:t>The SmartVision local navigation aid</w:t>
+            </w:r>
+            <w:r>
+              <w:br/>
+              <w:t>for blind and visually impaired persons</w:t>
+            </w:r>
+          </w:p>
+        </w:tc>
+        <w:tc>
+          <w:tcPr>
+            <w:tcW w:w="2154" w:type="dxa"/>
+            <w:tcMar>
+              <w:top w:w="0" w:type="dxa"/>
+              <w:left w:w="0" w:type="dxa"/>
+              <w:bottom w:w="0" w:type="dxa"/>
+              <w:right w:w="0" w:type="dxa"/>
+            </w:tcMar>
+          </w:tcPr>
+          <w:p>
+            <w:pPr>
+              <w:pStyle w:val="Date1"/>
+              <w:keepNext/>
+              <w:spacing w:before="140" w:after="40"/>
+              <w:jc w:val="right"/>
+              <w:rPr>
+                <w:rFonts w:hint="eastAsia"/>
+              </w:rPr>
+            </w:pPr>
+            <w:r>
+              <w:t>2011</w:t>
+            </w:r>
+          </w:p>
+        </w:tc>
+      </w:tr>
+    </w:tbl>
     <w:p>
       <w:pPr>
         <w:pStyle w:val="Pubauthors"/>
@@ -526,43 +776,92 @@
         </w:rPr>
       </w:pPr>
       <w:r>
-        <w:t xml:space="preserve">International Journal of Digital Content Technology and its Applications, 5(5), 362-375. </w:t>
+        <w:t>International Journal of Digital Content Technology and its Applications, 5(5), 362-375.</w:t>
+      </w:r>
+      <w:r>
+        <w:br/>
       </w:r>
       <w:hyperlink r:id="rId16">
         <w:r>
           <w:rPr>
-            <w:color w:val="176575"/>
             <w:sz w:val="19"/>
           </w:rPr>
           <w:t>DOI: 10.4156/jdcta.vol5.issue5.40</w:t>
         </w:r>
       </w:hyperlink>
     </w:p>
-    <w:p>
-      <w:pPr>
-        <w:pStyle w:val="Pubtitle"/>
-        <w:rPr>
-          <w:rFonts w:hint="eastAsia"/>
-        </w:rPr>
-      </w:pPr>
-      <w:r>
-        <w:rPr>
-          <w:color w:val="176575"/>
-        </w:rPr>
-        <w:t xml:space="preserve">2011   </w:t>
-      </w:r>
-      <w:hyperlink r:id="rId17">
-        <w:r>
-          <w:t xml:space="preserve">The SmartVision Navigation Prototype for Blind Users </w:t>
-        </w:r>
-        <w:r>
-          <w:rPr>
-            <w:rFonts w:ascii="Cambria Math" w:hAnsi="Cambria Math" w:cs="Cambria Math"/>
-          </w:rPr>
-          <w:t>↗</w:t>
-        </w:r>
-      </w:hyperlink>
-    </w:p>
+    <w:tbl>
+      <w:tblPr>
+        <w:tblW w:w="0" w:type="auto"/>
+        <w:tblBorders>
+          <w:top w:val="nil"/>
+          <w:left w:val="nil"/>
+          <w:bottom w:val="nil"/>
+          <w:right w:val="nil"/>
+          <w:insideH w:val="nil"/>
+          <w:insideV w:val="nil"/>
+        </w:tblBorders>
+        <w:tblLayout w:type="fixed"/>
+        <w:tblLook w:val="04A0" w:firstRow="1" w:lastRow="0" w:firstColumn="1" w:lastColumn="0" w:noHBand="0" w:noVBand="1"/>
+      </w:tblPr>
+      <w:tblGrid>
+        <w:gridCol w:w="7483"/>
+        <w:gridCol w:w="2154"/>
+      </w:tblGrid>
+      <w:tr>
+        <w:trPr>
+          <w:cantSplit/>
+        </w:trPr>
+        <w:tc>
+          <w:tcPr>
+            <w:tcW w:w="7483" w:type="dxa"/>
+            <w:tcMar>
+              <w:top w:w="0" w:type="dxa"/>
+              <w:left w:w="0" w:type="dxa"/>
+              <w:bottom w:w="0" w:type="dxa"/>
+              <w:right w:w="0" w:type="dxa"/>
+            </w:tcMar>
+          </w:tcPr>
+          <w:p>
+            <w:pPr>
+              <w:pStyle w:val="Pubtitle"/>
+              <w:ind w:right="170"/>
+              <w:rPr>
+                <w:rFonts w:hint="eastAsia"/>
+              </w:rPr>
+            </w:pPr>
+            <w:r>
+              <w:t>The SmartVision Navigation Prototype for Blind Users</w:t>
+            </w:r>
+          </w:p>
+        </w:tc>
+        <w:tc>
+          <w:tcPr>
+            <w:tcW w:w="2154" w:type="dxa"/>
+            <w:tcMar>
+              <w:top w:w="0" w:type="dxa"/>
+              <w:left w:w="0" w:type="dxa"/>
+              <w:bottom w:w="0" w:type="dxa"/>
+              <w:right w:w="0" w:type="dxa"/>
+            </w:tcMar>
+          </w:tcPr>
+          <w:p>
+            <w:pPr>
+              <w:pStyle w:val="Date1"/>
+              <w:keepNext/>
+              <w:spacing w:before="140" w:after="40"/>
+              <w:jc w:val="right"/>
+              <w:rPr>
+                <w:rFonts w:hint="eastAsia"/>
+              </w:rPr>
+            </w:pPr>
+            <w:r>
+              <w:t>2011</w:t>
+            </w:r>
+          </w:p>
+        </w:tc>
+      </w:tr>
+    </w:tbl>
     <w:p>
       <w:pPr>
         <w:pStyle w:val="Pubauthors"/>
@@ -593,12 +892,14 @@
         </w:rPr>
       </w:pPr>
       <w:r>
-        <w:t xml:space="preserve">International Journal of Digital Content Technology and its Applications, 5(5), 351-361. </w:t>
+        <w:t>International Journal of Digital Content Technology and its Applications, 5(5), 351-361.</w:t>
       </w:r>
-      <w:hyperlink r:id="rId18">
+      <w:r>
+        <w:br/>
+      </w:r>
+      <w:hyperlink r:id="rId17">
         <w:r>
           <w:rPr>
-            <w:color w:val="176575"/>
             <w:sz w:val="19"/>
           </w:rPr>
           <w:t>DOI: 10.4156/jdcta.vol5.issue5.39</w:t>
@@ -617,32 +918,83 @@
         <w:t>Conference papers</w:t>
       </w:r>
     </w:p>
-    <w:p>
-      <w:pPr>
-        <w:pStyle w:val="Pubtitle"/>
-        <w:spacing w:before="0"/>
-        <w:rPr>
-          <w:rFonts w:hint="eastAsia"/>
-        </w:rPr>
-      </w:pPr>
-      <w:r>
-        <w:rPr>
-          <w:color w:val="176575"/>
-        </w:rPr>
-        <w:t xml:space="preserve">2012   </w:t>
-      </w:r>
-      <w:hyperlink r:id="rId19">
-        <w:r>
-          <w:t xml:space="preserve">Realtime Local Navigation for the Blind: Detection of Lateral Doors and Sound Interface </w:t>
-        </w:r>
-        <w:r>
-          <w:rPr>
-            <w:rFonts w:ascii="Cambria Math" w:hAnsi="Cambria Math" w:cs="Cambria Math"/>
-          </w:rPr>
-          <w:t>↗</w:t>
-        </w:r>
-      </w:hyperlink>
-    </w:p>
+    <w:tbl>
+      <w:tblPr>
+        <w:tblW w:w="0" w:type="auto"/>
+        <w:tblBorders>
+          <w:top w:val="nil"/>
+          <w:left w:val="nil"/>
+          <w:bottom w:val="nil"/>
+          <w:right w:val="nil"/>
+          <w:insideH w:val="nil"/>
+          <w:insideV w:val="nil"/>
+        </w:tblBorders>
+        <w:tblLayout w:type="fixed"/>
+        <w:tblLook w:val="04A0" w:firstRow="1" w:lastRow="0" w:firstColumn="1" w:lastColumn="0" w:noHBand="0" w:noVBand="1"/>
+      </w:tblPr>
+      <w:tblGrid>
+        <w:gridCol w:w="7483"/>
+        <w:gridCol w:w="2154"/>
+      </w:tblGrid>
+      <w:tr>
+        <w:trPr>
+          <w:cantSplit/>
+        </w:trPr>
+        <w:tc>
+          <w:tcPr>
+            <w:tcW w:w="7483" w:type="dxa"/>
+            <w:tcMar>
+              <w:top w:w="0" w:type="dxa"/>
+              <w:left w:w="0" w:type="dxa"/>
+              <w:bottom w:w="0" w:type="dxa"/>
+              <w:right w:w="0" w:type="dxa"/>
+            </w:tcMar>
+          </w:tcPr>
+          <w:p>
+            <w:pPr>
+              <w:pStyle w:val="Pubtitle"/>
+              <w:spacing w:before="0"/>
+              <w:ind w:right="170"/>
+              <w:rPr>
+                <w:rFonts w:hint="eastAsia"/>
+              </w:rPr>
+            </w:pPr>
+            <w:r>
+              <w:t>Realtime Local Navigation for the Blind:</w:t>
+            </w:r>
+            <w:r>
+              <w:br/>
+              <w:t>Detection of Lateral Doors and Sound Interface</w:t>
+            </w:r>
+          </w:p>
+        </w:tc>
+        <w:tc>
+          <w:tcPr>
+            <w:tcW w:w="2154" w:type="dxa"/>
+            <w:tcMar>
+              <w:top w:w="0" w:type="dxa"/>
+              <w:left w:w="0" w:type="dxa"/>
+              <w:bottom w:w="0" w:type="dxa"/>
+              <w:right w:w="0" w:type="dxa"/>
+            </w:tcMar>
+          </w:tcPr>
+          <w:p>
+            <w:pPr>
+              <w:pStyle w:val="Date1"/>
+              <w:keepNext/>
+              <w:spacing w:before="0" w:after="40"/>
+              <w:jc w:val="right"/>
+              <w:rPr>
+                <w:rFonts w:hint="eastAsia"/>
+              </w:rPr>
+            </w:pPr>
+            <w:r>
+              <w:t>2012</w:t>
+            </w:r>
+          </w:p>
+        </w:tc>
+      </w:tr>
+    </w:tbl>
     <w:p>
       <w:pPr>
         <w:pStyle w:val="Pubauthors"/>
@@ -675,41 +1027,87 @@
       <w:r>
         <w:t xml:space="preserve">DSAI 2012. Procedia Computer Science, 14, 74-82. </w:t>
       </w:r>
-      <w:hyperlink r:id="rId20">
+      <w:hyperlink r:id="rId18">
         <w:r>
           <w:rPr>
-            <w:color w:val="176575"/>
             <w:sz w:val="19"/>
           </w:rPr>
           <w:t>DOI: 10.1016/j.procs.2012.10.009</w:t>
         </w:r>
       </w:hyperlink>
     </w:p>
-    <w:p>
-      <w:pPr>
-        <w:pStyle w:val="Pubtitle"/>
-        <w:rPr>
-          <w:rFonts w:hint="eastAsia"/>
-        </w:rPr>
-      </w:pPr>
-      <w:r>
-        <w:rPr>
-          <w:color w:val="176575"/>
-        </w:rPr>
-        <w:t xml:space="preserve">2012   </w:t>
-      </w:r>
-      <w:hyperlink r:id="rId21">
-        <w:r>
-          <w:t xml:space="preserve">Visual Navigation for the Blind - Path and Obstacle Detection </w:t>
-        </w:r>
-        <w:r>
-          <w:rPr>
-            <w:rFonts w:ascii="Cambria Math" w:hAnsi="Cambria Math" w:cs="Cambria Math"/>
-          </w:rPr>
-          <w:t>↗</w:t>
-        </w:r>
-      </w:hyperlink>
-    </w:p>
+    <w:tbl>
+      <w:tblPr>
+        <w:tblW w:w="0" w:type="auto"/>
+        <w:tblBorders>
+          <w:top w:val="nil"/>
+          <w:left w:val="nil"/>
+          <w:bottom w:val="nil"/>
+          <w:right w:val="nil"/>
+          <w:insideH w:val="nil"/>
+          <w:insideV w:val="nil"/>
+        </w:tblBorders>
+        <w:tblLayout w:type="fixed"/>
+        <w:tblLook w:val="04A0" w:firstRow="1" w:lastRow="0" w:firstColumn="1" w:lastColumn="0" w:noHBand="0" w:noVBand="1"/>
+      </w:tblPr>
+      <w:tblGrid>
+        <w:gridCol w:w="7483"/>
+        <w:gridCol w:w="2154"/>
+      </w:tblGrid>
+      <w:tr>
+        <w:trPr>
+          <w:cantSplit/>
+        </w:trPr>
+        <w:tc>
+          <w:tcPr>
+            <w:tcW w:w="7483" w:type="dxa"/>
+            <w:tcMar>
+              <w:top w:w="0" w:type="dxa"/>
+              <w:left w:w="0" w:type="dxa"/>
+              <w:bottom w:w="0" w:type="dxa"/>
+              <w:right w:w="0" w:type="dxa"/>
+            </w:tcMar>
+          </w:tcPr>
+          <w:p>
+            <w:pPr>
+              <w:pStyle w:val="Pubtitle"/>
+              <w:ind w:right="170"/>
+              <w:rPr>
+                <w:rFonts w:hint="eastAsia"/>
+              </w:rPr>
+            </w:pPr>
+            <w:r>
+              <w:t>Visual Navigation for the Blind - Path and Obstacle Detection</w:t>
+            </w:r>
+          </w:p>
+        </w:tc>
+        <w:tc>
+          <w:tcPr>
+            <w:tcW w:w="2154" w:type="dxa"/>
+            <w:tcMar>
+              <w:top w:w="0" w:type="dxa"/>
+              <w:left w:w="0" w:type="dxa"/>
+              <w:bottom w:w="0" w:type="dxa"/>
+              <w:right w:w="0" w:type="dxa"/>
+            </w:tcMar>
+          </w:tcPr>
+          <w:p>
+            <w:pPr>
+              <w:pStyle w:val="Date1"/>
+              <w:keepNext/>
+              <w:spacing w:before="140" w:after="40"/>
+              <w:jc w:val="right"/>
+              <w:rPr>
+                <w:rFonts w:hint="eastAsia"/>
+              </w:rPr>
+            </w:pPr>
+            <w:r>
+              <w:t>2012</w:t>
+            </w:r>
+          </w:p>
+        </w:tc>
+      </w:tr>
+    </w:tbl>
     <w:p>
       <w:pPr>
         <w:pStyle w:val="Pubauthors"/>
@@ -737,43 +1135,92 @@
         </w:rPr>
       </w:pPr>
       <w:r>
-        <w:t xml:space="preserve">1st International Conference on Pattern Recognition Applications and Methods (ICPRAM), 515-519. </w:t>
+        <w:t>1st International Conference on Pattern Recognition Applications and Methods (ICPRAM), 515-519.</w:t>
       </w:r>
-      <w:hyperlink r:id="rId22">
+      <w:r>
+        <w:br/>
+      </w:r>
+      <w:hyperlink r:id="rId19">
         <w:r>
           <w:rPr>
-            <w:color w:val="176575"/>
             <w:sz w:val="19"/>
           </w:rPr>
           <w:t>DOI: 10.5220/0003711405150519</w:t>
         </w:r>
       </w:hyperlink>
     </w:p>
-    <w:p>
-      <w:pPr>
-        <w:pStyle w:val="Pubtitle"/>
-        <w:rPr>
-          <w:rFonts w:hint="eastAsia"/>
-        </w:rPr>
-      </w:pPr>
-      <w:r>
-        <w:rPr>
-          <w:color w:val="176575"/>
-        </w:rPr>
-        <w:t xml:space="preserve">2010   </w:t>
-      </w:r>
-      <w:hyperlink r:id="rId23">
-        <w:r>
-          <w:t xml:space="preserve">A vision system for detecting paths and moving obstacles for the blind </w:t>
-        </w:r>
-        <w:r>
-          <w:rPr>
-            <w:rFonts w:ascii="Cambria Math" w:hAnsi="Cambria Math" w:cs="Cambria Math"/>
-          </w:rPr>
-          <w:t>↗</w:t>
-        </w:r>
-      </w:hyperlink>
-    </w:p>
+    <w:tbl>
+      <w:tblPr>
+        <w:tblW w:w="0" w:type="auto"/>
+        <w:tblBorders>
+          <w:top w:val="nil"/>
+          <w:left w:val="nil"/>
+          <w:bottom w:val="nil"/>
+          <w:right w:val="nil"/>
+          <w:insideH w:val="nil"/>
+          <w:insideV w:val="nil"/>
+        </w:tblBorders>
+        <w:tblLayout w:type="fixed"/>
+        <w:tblLook w:val="04A0" w:firstRow="1" w:lastRow="0" w:firstColumn="1" w:lastColumn="0" w:noHBand="0" w:noVBand="1"/>
+      </w:tblPr>
+      <w:tblGrid>
+        <w:gridCol w:w="7483"/>
+        <w:gridCol w:w="2154"/>
+      </w:tblGrid>
+      <w:tr>
+        <w:trPr>
+          <w:cantSplit/>
+        </w:trPr>
+        <w:tc>
+          <w:tcPr>
+            <w:tcW w:w="7483" w:type="dxa"/>
+            <w:tcMar>
+              <w:top w:w="0" w:type="dxa"/>
+              <w:left w:w="0" w:type="dxa"/>
+              <w:bottom w:w="0" w:type="dxa"/>
+              <w:right w:w="0" w:type="dxa"/>
+            </w:tcMar>
+          </w:tcPr>
+          <w:p>
+            <w:pPr>
+              <w:pStyle w:val="Pubtitle"/>
+              <w:ind w:right="170"/>
+              <w:rPr>
+                <w:rFonts w:hint="eastAsia"/>
+              </w:rPr>
+            </w:pPr>
+            <w:r>
+              <w:t>A vision system for detecting paths and moving obstacles for the blind</w:t>
+            </w:r>
+          </w:p>
+        </w:tc>
+        <w:tc>
+          <w:tcPr>
+            <w:tcW w:w="2154" w:type="dxa"/>
+            <w:tcMar>
+              <w:top w:w="0" w:type="dxa"/>
+              <w:left w:w="0" w:type="dxa"/>
+              <w:bottom w:w="0" w:type="dxa"/>
+              <w:right w:w="0" w:type="dxa"/>
+            </w:tcMar>
+          </w:tcPr>
+          <w:p>
+            <w:pPr>
+              <w:pStyle w:val="Date1"/>
+              <w:keepNext/>
+              <w:spacing w:before="140" w:after="40"/>
+              <w:jc w:val="right"/>
+              <w:rPr>
+                <w:rFonts w:hint="eastAsia"/>
+              </w:rPr>
+            </w:pPr>
+            <w:r>
+              <w:t>2010</w:t>
+            </w:r>
+          </w:p>
+        </w:tc>
+      </w:tr>
+    </w:tbl>
     <w:p>
       <w:pPr>
         <w:pStyle w:val="Pubauthors"/>
@@ -804,31 +1251,78 @@
         <w:t>3rd International Conference on Software Development for Enhancing Accessibility and Fighting Info-exclusion (DSAI), Oxford, 175-182.</w:t>
       </w:r>
     </w:p>
-    <w:p>
-      <w:pPr>
-        <w:pStyle w:val="Pubtitle"/>
-        <w:rPr>
-          <w:rFonts w:hint="eastAsia"/>
-        </w:rPr>
-      </w:pPr>
-      <w:r>
-        <w:rPr>
-          <w:color w:val="176575"/>
-        </w:rPr>
-        <w:t xml:space="preserve">2010   </w:t>
-      </w:r>
-      <w:hyperlink r:id="rId24">
-        <w:r>
-          <w:t xml:space="preserve">The SmartVision Navigation Prototype for the Blind </w:t>
-        </w:r>
-        <w:r>
-          <w:rPr>
-            <w:rFonts w:ascii="Cambria Math" w:hAnsi="Cambria Math" w:cs="Cambria Math"/>
-          </w:rPr>
-          <w:t>↗</w:t>
-        </w:r>
-      </w:hyperlink>
-    </w:p>
+    <w:tbl>
+      <w:tblPr>
+        <w:tblW w:w="0" w:type="auto"/>
+        <w:tblBorders>
+          <w:top w:val="nil"/>
+          <w:left w:val="nil"/>
+          <w:bottom w:val="nil"/>
+          <w:right w:val="nil"/>
+          <w:insideH w:val="nil"/>
+          <w:insideV w:val="nil"/>
+        </w:tblBorders>
+        <w:tblLayout w:type="fixed"/>
+        <w:tblLook w:val="04A0" w:firstRow="1" w:lastRow="0" w:firstColumn="1" w:lastColumn="0" w:noHBand="0" w:noVBand="1"/>
+      </w:tblPr>
+      <w:tblGrid>
+        <w:gridCol w:w="7483"/>
+        <w:gridCol w:w="2154"/>
+      </w:tblGrid>
+      <w:tr>
+        <w:trPr>
+          <w:cantSplit/>
+        </w:trPr>
+        <w:tc>
+          <w:tcPr>
+            <w:tcW w:w="7483" w:type="dxa"/>
+            <w:tcMar>
+              <w:top w:w="0" w:type="dxa"/>
+              <w:left w:w="0" w:type="dxa"/>
+              <w:bottom w:w="0" w:type="dxa"/>
+              <w:right w:w="0" w:type="dxa"/>
+            </w:tcMar>
+          </w:tcPr>
+          <w:p>
+            <w:pPr>
+              <w:pStyle w:val="Pubtitle"/>
+              <w:ind w:right="170"/>
+              <w:rPr>
+                <w:rFonts w:hint="eastAsia"/>
+              </w:rPr>
+            </w:pPr>
+            <w:r>
+              <w:t>The SmartVision Navigation Prototype for the Blind</w:t>
+            </w:r>
+          </w:p>
+        </w:tc>
+        <w:tc>
+          <w:tcPr>
+            <w:tcW w:w="2154" w:type="dxa"/>
+            <w:tcMar>
+              <w:top w:w="0" w:type="dxa"/>
+              <w:left w:w="0" w:type="dxa"/>
+              <w:bottom w:w="0" w:type="dxa"/>
+              <w:right w:w="0" w:type="dxa"/>
+            </w:tcMar>
+          </w:tcPr>
+          <w:p>
+            <w:pPr>
+              <w:pStyle w:val="Date1"/>
+              <w:keepNext/>
+              <w:spacing w:before="140" w:after="40"/>
+              <w:jc w:val="right"/>
+              <w:rPr>
+                <w:rFonts w:hint="eastAsia"/>
+              </w:rPr>
+            </w:pPr>
+            <w:r>
+              <w:t>2010</w:t>
+            </w:r>
+          </w:p>
+        </w:tc>
+      </w:tr>
+    </w:tbl>
     <w:p>
       <w:pPr>
         <w:pStyle w:val="Pubauthors"/>
@@ -874,32 +1368,79 @@
         <w:t>Conference abstract</w:t>
       </w:r>
     </w:p>
-    <w:p>
-      <w:pPr>
-        <w:pStyle w:val="Pubtitle"/>
-        <w:spacing w:before="0"/>
-        <w:rPr>
-          <w:rFonts w:hint="eastAsia"/>
-        </w:rPr>
-      </w:pPr>
-      <w:r>
-        <w:rPr>
-          <w:color w:val="176575"/>
-        </w:rPr>
-        <w:t xml:space="preserve">2012   </w:t>
-      </w:r>
-      <w:hyperlink r:id="rId25" w:anchor="page=99">
-        <w:r>
-          <w:t xml:space="preserve">Blavigator: a navigation aid for blind persons </w:t>
-        </w:r>
-        <w:r>
-          <w:rPr>
-            <w:rFonts w:ascii="Cambria Math" w:hAnsi="Cambria Math" w:cs="Cambria Math"/>
-          </w:rPr>
-          <w:t>↗</w:t>
-        </w:r>
-      </w:hyperlink>
-    </w:p>
+    <w:tbl>
+      <w:tblPr>
+        <w:tblW w:w="0" w:type="auto"/>
+        <w:tblBorders>
+          <w:top w:val="nil"/>
+          <w:left w:val="nil"/>
+          <w:bottom w:val="nil"/>
+          <w:right w:val="nil"/>
+          <w:insideH w:val="nil"/>
+          <w:insideV w:val="nil"/>
+        </w:tblBorders>
+        <w:tblLayout w:type="fixed"/>
+        <w:tblLook w:val="04A0" w:firstRow="1" w:lastRow="0" w:firstColumn="1" w:lastColumn="0" w:noHBand="0" w:noVBand="1"/>
+      </w:tblPr>
+      <w:tblGrid>
+        <w:gridCol w:w="7483"/>
+        <w:gridCol w:w="2154"/>
+      </w:tblGrid>
+      <w:tr>
+        <w:trPr>
+          <w:cantSplit/>
+        </w:trPr>
+        <w:tc>
+          <w:tcPr>
+            <w:tcW w:w="7483" w:type="dxa"/>
+            <w:tcMar>
+              <w:top w:w="0" w:type="dxa"/>
+              <w:left w:w="0" w:type="dxa"/>
+              <w:bottom w:w="0" w:type="dxa"/>
+              <w:right w:w="0" w:type="dxa"/>
+            </w:tcMar>
+          </w:tcPr>
+          <w:p>
+            <w:pPr>
+              <w:pStyle w:val="Pubtitle"/>
+              <w:spacing w:before="0"/>
+              <w:ind w:right="170"/>
+              <w:rPr>
+                <w:rFonts w:hint="eastAsia"/>
+              </w:rPr>
+            </w:pPr>
+            <w:r>
+              <w:t>Blavigator: a navigation aid for blind persons</w:t>
+            </w:r>
+          </w:p>
+        </w:tc>
+        <w:tc>
+          <w:tcPr>
+            <w:tcW w:w="2154" w:type="dxa"/>
+            <w:tcMar>
+              <w:top w:w="0" w:type="dxa"/>
+              <w:left w:w="0" w:type="dxa"/>
+              <w:bottom w:w="0" w:type="dxa"/>
+              <w:right w:w="0" w:type="dxa"/>
+            </w:tcMar>
+          </w:tcPr>
+          <w:p>
+            <w:pPr>
+              <w:pStyle w:val="Date1"/>
+              <w:keepNext/>
+              <w:spacing w:before="0" w:after="40"/>
+              <w:jc w:val="right"/>
+              <w:rPr>
+                <w:rFonts w:hint="eastAsia"/>
+              </w:rPr>
+            </w:pPr>
+            <w:r>
+              <w:t>2012</w:t>
+            </w:r>
+          </w:p>
+        </w:tc>
+      </w:tr>
+    </w:tbl>
     <w:p>
       <w:pPr>
         <w:pStyle w:val="Pubauthors"/>
@@ -929,10 +1470,9 @@
       <w:r>
         <w:t xml:space="preserve">ECVP 2012. Perception, 41(1_suppl), p. 99, abstract 97. </w:t>
       </w:r>
-      <w:hyperlink r:id="rId26">
+      <w:hyperlink r:id="rId20">
         <w:r>
           <w:rPr>
-            <w:color w:val="176575"/>
             <w:sz w:val="19"/>
           </w:rPr>
           <w:t>Supplement DOI: 10.1177/03010066120410s101</w:t>
@@ -951,32 +1491,79 @@
         <w:t>Book</w:t>
       </w:r>
     </w:p>
-    <w:p>
-      <w:pPr>
-        <w:pStyle w:val="Pubtitle"/>
-        <w:spacing w:before="0"/>
-        <w:rPr>
-          <w:rFonts w:hint="eastAsia"/>
-        </w:rPr>
-      </w:pPr>
-      <w:r>
-        <w:rPr>
-          <w:color w:val="176575"/>
-        </w:rPr>
-        <w:t xml:space="preserve">2013   </w:t>
-      </w:r>
-      <w:hyperlink r:id="rId27">
-        <w:r>
-          <w:t xml:space="preserve">Real-time path and obstacle detection for blind persons </w:t>
-        </w:r>
-        <w:r>
-          <w:rPr>
-            <w:rFonts w:ascii="Cambria Math" w:hAnsi="Cambria Math" w:cs="Cambria Math"/>
-          </w:rPr>
-          <w:t>↗</w:t>
-        </w:r>
-      </w:hyperlink>
-    </w:p>
+    <w:tbl>
+      <w:tblPr>
+        <w:tblW w:w="0" w:type="auto"/>
+        <w:tblBorders>
+          <w:top w:val="nil"/>
+          <w:left w:val="nil"/>
+          <w:bottom w:val="nil"/>
+          <w:right w:val="nil"/>
+          <w:insideH w:val="nil"/>
+          <w:insideV w:val="nil"/>
+        </w:tblBorders>
+        <w:tblLayout w:type="fixed"/>
+        <w:tblLook w:val="04A0" w:firstRow="1" w:lastRow="0" w:firstColumn="1" w:lastColumn="0" w:noHBand="0" w:noVBand="1"/>
+      </w:tblPr>
+      <w:tblGrid>
+        <w:gridCol w:w="7483"/>
+        <w:gridCol w:w="2154"/>
+      </w:tblGrid>
+      <w:tr>
+        <w:trPr>
+          <w:cantSplit/>
+        </w:trPr>
+        <w:tc>
+          <w:tcPr>
+            <w:tcW w:w="7483" w:type="dxa"/>
+            <w:tcMar>
+              <w:top w:w="0" w:type="dxa"/>
+              <w:left w:w="0" w:type="dxa"/>
+              <w:bottom w:w="0" w:type="dxa"/>
+              <w:right w:w="0" w:type="dxa"/>
+            </w:tcMar>
+          </w:tcPr>
+          <w:p>
+            <w:pPr>
+              <w:pStyle w:val="Pubtitle"/>
+              <w:spacing w:before="0"/>
+              <w:ind w:right="170"/>
+              <w:rPr>
+                <w:rFonts w:hint="eastAsia"/>
+              </w:rPr>
+            </w:pPr>
+            <w:r>
+              <w:t>Real-time path and obstacle detection for blind persons</w:t>
+            </w:r>
+          </w:p>
+        </w:tc>
+        <w:tc>
+          <w:tcPr>
+            <w:tcW w:w="2154" w:type="dxa"/>
+            <w:tcMar>
+              <w:top w:w="0" w:type="dxa"/>
+              <w:left w:w="0" w:type="dxa"/>
+              <w:bottom w:w="0" w:type="dxa"/>
+              <w:right w:w="0" w:type="dxa"/>
+            </w:tcMar>
+          </w:tcPr>
+          <w:p>
+            <w:pPr>
+              <w:pStyle w:val="Date1"/>
+              <w:keepNext/>
+              <w:spacing w:before="0" w:after="40"/>
+              <w:jc w:val="right"/>
+              <w:rPr>
+                <w:rFonts w:hint="eastAsia"/>
+              </w:rPr>
+            </w:pPr>
+            <w:r>
+              <w:t>2013</w:t>
+            </w:r>
+          </w:p>
+        </w:tc>
+      </w:tr>
+    </w:tbl>
     <w:p>
       <w:pPr>
         <w:pStyle w:val="Pubauthors"/>
@@ -1023,33 +1610,84 @@
         <w:t>Education</w:t>
       </w:r>
     </w:p>
+    <w:tbl>
+      <w:tblPr>
+        <w:tblW w:w="0" w:type="auto"/>
+        <w:tblBorders>
+          <w:top w:val="nil"/>
+          <w:left w:val="nil"/>
+          <w:bottom w:val="nil"/>
+          <w:right w:val="nil"/>
+          <w:insideH w:val="nil"/>
+          <w:insideV w:val="nil"/>
+        </w:tblBorders>
+        <w:tblLayout w:type="fixed"/>
+        <w:tblLook w:val="04A0" w:firstRow="1" w:lastRow="0" w:firstColumn="1" w:lastColumn="0" w:noHBand="0" w:noVBand="1"/>
+      </w:tblPr>
+      <w:tblGrid>
+        <w:gridCol w:w="7483"/>
+        <w:gridCol w:w="2154"/>
+      </w:tblGrid>
+      <w:tr>
+        <w:trPr>
+          <w:cantSplit/>
+        </w:trPr>
+        <w:tc>
+          <w:tcPr>
+            <w:tcW w:w="7483" w:type="dxa"/>
+            <w:tcMar>
+              <w:top w:w="0" w:type="dxa"/>
+              <w:left w:w="0" w:type="dxa"/>
+              <w:bottom w:w="0" w:type="dxa"/>
+              <w:right w:w="0" w:type="dxa"/>
+            </w:tcMar>
+          </w:tcPr>
+          <w:p>
+            <w:pPr>
+              <w:pStyle w:val="Heading3"/>
+              <w:ind w:right="170"/>
+            </w:pPr>
+            <w:r>
+              <w:t>Doctoral studies in Computer Science Engineering</w:t>
+            </w:r>
+          </w:p>
+        </w:tc>
+        <w:tc>
+          <w:tcPr>
+            <w:tcW w:w="2154" w:type="dxa"/>
+            <w:tcMar>
+              <w:top w:w="0" w:type="dxa"/>
+              <w:left w:w="0" w:type="dxa"/>
+              <w:bottom w:w="0" w:type="dxa"/>
+              <w:right w:w="0" w:type="dxa"/>
+            </w:tcMar>
+          </w:tcPr>
+          <w:p>
+            <w:pPr>
+              <w:pStyle w:val="Date1"/>
+              <w:keepNext/>
+              <w:spacing w:before="80" w:after="40"/>
+              <w:jc w:val="right"/>
+              <w:rPr>
+                <w:rFonts w:hint="eastAsia"/>
+              </w:rPr>
+            </w:pPr>
+            <w:r>
+              <w:t>Sep 2011 – Oct 2013</w:t>
+            </w:r>
+          </w:p>
+        </w:tc>
+      </w:tr>
+    </w:tbl>
     <w:p>
       <w:pPr>
-        <w:pStyle w:val="Heading3"/>
-      </w:pPr>
-      <w:r>
-        <w:t>Doctoral studies in Computer Science Engineering</w:t>
-      </w:r>
-    </w:p>
-    <w:p>
-      <w:pPr>
         <w:pStyle w:val="Meta"/>
-        <w:tabs>
-          <w:tab w:val="right" w:pos="9637"/>
-        </w:tabs>
         <w:rPr>
           <w:rFonts w:hint="eastAsia"/>
         </w:rPr>
       </w:pPr>
       <w:r>
         <w:t>University of Algarve</w:t>
-      </w:r>
-      <w:r>
-        <w:rPr>
-          <w:color w:val="176575"/>
-        </w:rPr>
-        <w:tab/>
-        <w:t>Sep 2011 - Oct 2013</w:t>
       </w:r>
     </w:p>
     <w:p>
@@ -1060,36 +1698,87 @@
         </w:rPr>
       </w:pPr>
       <w:r>
-        <w:t>Completed the programme expected for the first two years; doctorate not completed and studies subsequently suspended. Research covered robust visual recognition of objects and environments for blind users, literature review and algorithm comparison, an initial object-recognition model, and hand and arm segmentation.</w:t>
+        <w:t>Completed the first two years of the programme; doctorate not completed, studies suspended. Research on robust visual recognition of objects and environments for blind users: literature review, algorithm comparison, an initial object-recognition model, and hand and arm segmentation.</w:t>
       </w:r>
     </w:p>
+    <w:tbl>
+      <w:tblPr>
+        <w:tblW w:w="0" w:type="auto"/>
+        <w:tblBorders>
+          <w:top w:val="nil"/>
+          <w:left w:val="nil"/>
+          <w:bottom w:val="nil"/>
+          <w:right w:val="nil"/>
+          <w:insideH w:val="nil"/>
+          <w:insideV w:val="nil"/>
+        </w:tblBorders>
+        <w:tblLayout w:type="fixed"/>
+        <w:tblLook w:val="04A0" w:firstRow="1" w:lastRow="0" w:firstColumn="1" w:lastColumn="0" w:noHBand="0" w:noVBand="1"/>
+      </w:tblPr>
+      <w:tblGrid>
+        <w:gridCol w:w="7483"/>
+        <w:gridCol w:w="2154"/>
+      </w:tblGrid>
+      <w:tr>
+        <w:trPr>
+          <w:cantSplit/>
+        </w:trPr>
+        <w:tc>
+          <w:tcPr>
+            <w:tcW w:w="7483" w:type="dxa"/>
+            <w:tcMar>
+              <w:top w:w="0" w:type="dxa"/>
+              <w:left w:w="0" w:type="dxa"/>
+              <w:bottom w:w="0" w:type="dxa"/>
+              <w:right w:w="0" w:type="dxa"/>
+            </w:tcMar>
+          </w:tcPr>
+          <w:p>
+            <w:pPr>
+              <w:pStyle w:val="Heading3"/>
+              <w:ind w:right="170"/>
+            </w:pPr>
+            <w:r>
+              <w:t>MSc in Computer Science Engineering</w:t>
+            </w:r>
+          </w:p>
+        </w:tc>
+        <w:tc>
+          <w:tcPr>
+            <w:tcW w:w="2154" w:type="dxa"/>
+            <w:tcMar>
+              <w:top w:w="0" w:type="dxa"/>
+              <w:left w:w="0" w:type="dxa"/>
+              <w:bottom w:w="0" w:type="dxa"/>
+              <w:right w:w="0" w:type="dxa"/>
+            </w:tcMar>
+          </w:tcPr>
+          <w:p>
+            <w:pPr>
+              <w:pStyle w:val="Date1"/>
+              <w:keepNext/>
+              <w:spacing w:before="80" w:after="40"/>
+              <w:jc w:val="right"/>
+              <w:rPr>
+                <w:rFonts w:hint="eastAsia"/>
+              </w:rPr>
+            </w:pPr>
+            <w:r>
+              <w:t>Sep 2008 – Jun 2011</w:t>
+            </w:r>
+          </w:p>
+        </w:tc>
+      </w:tr>
+    </w:tbl>
     <w:p>
       <w:pPr>
-        <w:pStyle w:val="Heading3"/>
-      </w:pPr>
-      <w:r>
-        <w:t>MSc in Computer Science Engineering</w:t>
-      </w:r>
-    </w:p>
-    <w:p>
-      <w:pPr>
         <w:pStyle w:val="Meta"/>
-        <w:tabs>
-          <w:tab w:val="right" w:pos="9637"/>
-        </w:tabs>
         <w:rPr>
           <w:rFonts w:hint="eastAsia"/>
         </w:rPr>
       </w:pPr>
       <w:r>
         <w:t>University of Algarve</w:t>
-      </w:r>
-      <w:r>
-        <w:rPr>
-          <w:color w:val="176575"/>
-        </w:rPr>
-        <w:tab/>
-        <w:t>Sep 2008 - Jun 2011</w:t>
       </w:r>
     </w:p>
     <w:p>
@@ -1109,6 +1798,79 @@
         <w:t>Dissertation grade: 18/20.</w:t>
       </w:r>
     </w:p>
+    <w:tbl>
+      <w:tblPr>
+        <w:tblW w:w="0" w:type="auto"/>
+        <w:tblBorders>
+          <w:top w:val="nil"/>
+          <w:left w:val="nil"/>
+          <w:bottom w:val="nil"/>
+          <w:right w:val="nil"/>
+          <w:insideH w:val="nil"/>
+          <w:insideV w:val="nil"/>
+        </w:tblBorders>
+        <w:tblLayout w:type="fixed"/>
+        <w:tblLook w:val="04A0" w:firstRow="1" w:lastRow="0" w:firstColumn="1" w:lastColumn="0" w:noHBand="0" w:noVBand="1"/>
+      </w:tblPr>
+      <w:tblGrid>
+        <w:gridCol w:w="7483"/>
+        <w:gridCol w:w="2154"/>
+      </w:tblGrid>
+      <w:tr>
+        <w:trPr>
+          <w:cantSplit/>
+        </w:trPr>
+        <w:tc>
+          <w:tcPr>
+            <w:tcW w:w="7483" w:type="dxa"/>
+            <w:tcMar>
+              <w:top w:w="0" w:type="dxa"/>
+              <w:left w:w="0" w:type="dxa"/>
+              <w:bottom w:w="0" w:type="dxa"/>
+              <w:right w:w="0" w:type="dxa"/>
+            </w:tcMar>
+          </w:tcPr>
+          <w:p>
+            <w:pPr>
+              <w:pStyle w:val="Subrole"/>
+              <w:keepNext/>
+              <w:ind w:right="170"/>
+              <w:rPr>
+                <w:rFonts w:hint="eastAsia"/>
+              </w:rPr>
+            </w:pPr>
+            <w:r>
+              <w:t>Dissertation: Real-time path and obstacle detection for blind persons</w:t>
+            </w:r>
+          </w:p>
+        </w:tc>
+        <w:tc>
+          <w:tcPr>
+            <w:tcW w:w="2154" w:type="dxa"/>
+            <w:tcMar>
+              <w:top w:w="0" w:type="dxa"/>
+              <w:left w:w="0" w:type="dxa"/>
+              <w:bottom w:w="0" w:type="dxa"/>
+              <w:right w:w="0" w:type="dxa"/>
+            </w:tcMar>
+          </w:tcPr>
+          <w:p>
+            <w:pPr>
+              <w:pStyle w:val="Date1"/>
+              <w:keepNext/>
+              <w:spacing w:before="40" w:after="40"/>
+              <w:jc w:val="right"/>
+              <w:rPr>
+                <w:rFonts w:hint="eastAsia"/>
+              </w:rPr>
+            </w:pPr>
+            <w:r>
+              <w:t>2010</w:t>
+            </w:r>
+          </w:p>
+        </w:tc>
+      </w:tr>
+    </w:tbl>
     <w:p>
       <w:pPr>
         <w:pStyle w:val="Compact"/>
@@ -1117,28 +1879,100 @@
         </w:rPr>
       </w:pPr>
       <w:r>
-        <w:rPr>
-          <w:b/>
-        </w:rPr>
-        <w:t xml:space="preserve">Dissertation (2010): </w:t>
+        <w:t>C/C++, OpenCV and Qt on a netbook; supervised by Prof. Johannes Martinus Hubertina du Buf.</w:t>
       </w:r>
-      <w:hyperlink r:id="rId28">
+      <w:r>
+        <w:br/>
+        <w:t xml:space="preserve">Repository: </w:t>
+      </w:r>
+      <w:hyperlink r:id="rId21">
         <w:r>
           <w:rPr>
-            <w:i/>
-            <w:color w:val="000000"/>
+            <w:color w:val="444444"/>
           </w:rPr>
-          <w:t xml:space="preserve">Real-time path and obstacle detection for blind persons </w:t>
-        </w:r>
-        <w:r>
-          <w:rPr>
-            <w:rFonts w:ascii="Cambria Math" w:hAnsi="Cambria Math" w:cs="Cambria Math"/>
-            <w:i/>
-            <w:color w:val="000000"/>
-          </w:rPr>
-          <w:t>↗</w:t>
+          <w:t>hdl.handle.net/10400.1/944</w:t>
         </w:r>
       </w:hyperlink>
+    </w:p>
+    <w:tbl>
+      <w:tblPr>
+        <w:tblW w:w="0" w:type="auto"/>
+        <w:tblBorders>
+          <w:top w:val="nil"/>
+          <w:left w:val="nil"/>
+          <w:bottom w:val="nil"/>
+          <w:right w:val="nil"/>
+          <w:insideH w:val="nil"/>
+          <w:insideV w:val="nil"/>
+        </w:tblBorders>
+        <w:tblLayout w:type="fixed"/>
+        <w:tblLook w:val="04A0" w:firstRow="1" w:lastRow="0" w:firstColumn="1" w:lastColumn="0" w:noHBand="0" w:noVBand="1"/>
+      </w:tblPr>
+      <w:tblGrid>
+        <w:gridCol w:w="7483"/>
+        <w:gridCol w:w="2154"/>
+      </w:tblGrid>
+      <w:tr>
+        <w:trPr>
+          <w:cantSplit/>
+        </w:trPr>
+        <w:tc>
+          <w:tcPr>
+            <w:tcW w:w="7483" w:type="dxa"/>
+            <w:tcMar>
+              <w:top w:w="0" w:type="dxa"/>
+              <w:left w:w="0" w:type="dxa"/>
+              <w:bottom w:w="0" w:type="dxa"/>
+              <w:right w:w="0" w:type="dxa"/>
+            </w:tcMar>
+          </w:tcPr>
+          <w:p>
+            <w:pPr>
+              <w:pStyle w:val="Heading3"/>
+              <w:ind w:right="170"/>
+            </w:pPr>
+            <w:r>
+              <w:t>BSc in Computer Science Engineering</w:t>
+            </w:r>
+          </w:p>
+        </w:tc>
+        <w:tc>
+          <w:tcPr>
+            <w:tcW w:w="2154" w:type="dxa"/>
+            <w:tcMar>
+              <w:top w:w="0" w:type="dxa"/>
+              <w:left w:w="0" w:type="dxa"/>
+              <w:bottom w:w="0" w:type="dxa"/>
+              <w:right w:w="0" w:type="dxa"/>
+            </w:tcMar>
+          </w:tcPr>
+          <w:p>
+            <w:pPr>
+              <w:pStyle w:val="Date1"/>
+              <w:keepNext/>
+              <w:spacing w:before="80" w:after="40"/>
+              <w:jc w:val="right"/>
+              <w:rPr>
+                <w:rFonts w:hint="eastAsia"/>
+              </w:rPr>
+            </w:pPr>
+            <w:r>
+              <w:t>Sep 2003 – Jul 2008</w:t>
+            </w:r>
+          </w:p>
+        </w:tc>
+      </w:tr>
+    </w:tbl>
+    <w:p>
+      <w:pPr>
+        <w:pStyle w:val="Meta"/>
+        <w:rPr>
+          <w:rFonts w:hint="eastAsia"/>
+        </w:rPr>
+      </w:pPr>
+      <w:r>
+        <w:t>University of Algarve</w:t>
+      </w:r>
     </w:p>
     <w:p>
       <w:pPr>
@@ -1148,76 +1982,87 @@
         </w:rPr>
       </w:pPr>
       <w:r>
-        <w:t>Real-time path and obstacle detection on a small netbook using C/C++, OpenCV and Qt. Supervisor: Prof. Johannes Martinus Hubertina du Buf.</w:t>
+        <w:t>Selected project: a web content-management system for football news and results, using HTML, PHP, JavaScript, PostgreSQL and PL/pgSQL. Project grade: 19/20.</w:t>
       </w:r>
     </w:p>
+    <w:tbl>
+      <w:tblPr>
+        <w:tblW w:w="0" w:type="auto"/>
+        <w:tblBorders>
+          <w:top w:val="nil"/>
+          <w:left w:val="nil"/>
+          <w:bottom w:val="nil"/>
+          <w:right w:val="nil"/>
+          <w:insideH w:val="nil"/>
+          <w:insideV w:val="nil"/>
+        </w:tblBorders>
+        <w:tblLayout w:type="fixed"/>
+        <w:tblLook w:val="04A0" w:firstRow="1" w:lastRow="0" w:firstColumn="1" w:lastColumn="0" w:noHBand="0" w:noVBand="1"/>
+      </w:tblPr>
+      <w:tblGrid>
+        <w:gridCol w:w="7483"/>
+        <w:gridCol w:w="2154"/>
+      </w:tblGrid>
+      <w:tr>
+        <w:trPr>
+          <w:cantSplit/>
+        </w:trPr>
+        <w:tc>
+          <w:tcPr>
+            <w:tcW w:w="7483" w:type="dxa"/>
+            <w:tcMar>
+              <w:top w:w="0" w:type="dxa"/>
+              <w:left w:w="0" w:type="dxa"/>
+              <w:bottom w:w="0" w:type="dxa"/>
+              <w:right w:w="0" w:type="dxa"/>
+            </w:tcMar>
+          </w:tcPr>
+          <w:p>
+            <w:pPr>
+              <w:pStyle w:val="Heading3"/>
+              <w:ind w:right="170"/>
+            </w:pPr>
+            <w:r>
+              <w:t>Studies in Electronics Engineering</w:t>
+            </w:r>
+          </w:p>
+        </w:tc>
+        <w:tc>
+          <w:tcPr>
+            <w:tcW w:w="2154" w:type="dxa"/>
+            <w:tcMar>
+              <w:top w:w="0" w:type="dxa"/>
+              <w:left w:w="0" w:type="dxa"/>
+              <w:bottom w:w="0" w:type="dxa"/>
+              <w:right w:w="0" w:type="dxa"/>
+            </w:tcMar>
+          </w:tcPr>
+          <w:p>
+            <w:pPr>
+              <w:pStyle w:val="Date1"/>
+              <w:keepNext/>
+              <w:spacing w:before="80" w:after="40"/>
+              <w:jc w:val="right"/>
+              <w:rPr>
+                <w:rFonts w:hint="eastAsia"/>
+              </w:rPr>
+            </w:pPr>
+            <w:r>
+              <w:t>Sep 2001 – Jul 2003</w:t>
+            </w:r>
+          </w:p>
+        </w:tc>
+      </w:tr>
+    </w:tbl>
     <w:p>
       <w:pPr>
-        <w:pStyle w:val="Heading3"/>
-      </w:pPr>
-      <w:r>
-        <w:t>BSc in Computer Science Engineering</w:t>
-      </w:r>
-    </w:p>
-    <w:p>
-      <w:pPr>
         <w:pStyle w:val="Meta"/>
-        <w:tabs>
-          <w:tab w:val="right" w:pos="9637"/>
-        </w:tabs>
         <w:rPr>
           <w:rFonts w:hint="eastAsia"/>
         </w:rPr>
       </w:pPr>
       <w:r>
         <w:t>University of Algarve</w:t>
-      </w:r>
-      <w:r>
-        <w:rPr>
-          <w:color w:val="176575"/>
-        </w:rPr>
-        <w:tab/>
-        <w:t>Sep 2003 - Jul 2008</w:t>
-      </w:r>
-    </w:p>
-    <w:p>
-      <w:pPr>
-        <w:pStyle w:val="Compact"/>
-        <w:rPr>
-          <w:rFonts w:hint="eastAsia"/>
-        </w:rPr>
-      </w:pPr>
-      <w:r>
-        <w:t>Selected project: a web content-management system for football news and results, using HTML, PHP, JavaScript, PostgreSQL and PL/pgSQL. Project grade: 19/20.</w:t>
-      </w:r>
-    </w:p>
-    <w:p>
-      <w:pPr>
-        <w:pStyle w:val="Heading3"/>
-      </w:pPr>
-      <w:r>
-        <w:t>Studies in Electronics Engineering</w:t>
-      </w:r>
-    </w:p>
-    <w:p>
-      <w:pPr>
-        <w:pStyle w:val="Meta"/>
-        <w:tabs>
-          <w:tab w:val="right" w:pos="9637"/>
-        </w:tabs>
-        <w:rPr>
-          <w:rFonts w:hint="eastAsia"/>
-        </w:rPr>
-      </w:pPr>
-      <w:r>
-        <w:t>University of Algarve</w:t>
-      </w:r>
-      <w:r>
-        <w:rPr>
-          <w:color w:val="176575"/>
-        </w:rPr>
-        <w:tab/>
-        <w:t>Sep 2001 - Jul 2003</w:t>
       </w:r>
     </w:p>
     <w:p>
@@ -1240,45 +2085,84 @@
         <w:t>Teaching</w:t>
       </w:r>
     </w:p>
+    <w:tbl>
+      <w:tblPr>
+        <w:tblW w:w="0" w:type="auto"/>
+        <w:tblBorders>
+          <w:top w:val="nil"/>
+          <w:left w:val="nil"/>
+          <w:bottom w:val="nil"/>
+          <w:right w:val="nil"/>
+          <w:insideH w:val="nil"/>
+          <w:insideV w:val="nil"/>
+        </w:tblBorders>
+        <w:tblLayout w:type="fixed"/>
+        <w:tblLook w:val="04A0" w:firstRow="1" w:lastRow="0" w:firstColumn="1" w:lastColumn="0" w:noHBand="0" w:noVBand="1"/>
+      </w:tblPr>
+      <w:tblGrid>
+        <w:gridCol w:w="7483"/>
+        <w:gridCol w:w="2154"/>
+      </w:tblGrid>
+      <w:tr>
+        <w:trPr>
+          <w:cantSplit/>
+        </w:trPr>
+        <w:tc>
+          <w:tcPr>
+            <w:tcW w:w="7483" w:type="dxa"/>
+            <w:tcMar>
+              <w:top w:w="0" w:type="dxa"/>
+              <w:left w:w="0" w:type="dxa"/>
+              <w:bottom w:w="0" w:type="dxa"/>
+              <w:right w:w="0" w:type="dxa"/>
+            </w:tcMar>
+          </w:tcPr>
+          <w:p>
+            <w:pPr>
+              <w:pStyle w:val="Heading3"/>
+              <w:ind w:right="170"/>
+            </w:pPr>
+            <w:r>
+              <w:t>Cisco CCNA Exploration Instructor</w:t>
+            </w:r>
+          </w:p>
+        </w:tc>
+        <w:tc>
+          <w:tcPr>
+            <w:tcW w:w="2154" w:type="dxa"/>
+            <w:tcMar>
+              <w:top w:w="0" w:type="dxa"/>
+              <w:left w:w="0" w:type="dxa"/>
+              <w:bottom w:w="0" w:type="dxa"/>
+              <w:right w:w="0" w:type="dxa"/>
+            </w:tcMar>
+          </w:tcPr>
+          <w:p>
+            <w:pPr>
+              <w:pStyle w:val="Date1"/>
+              <w:keepNext/>
+              <w:spacing w:before="80" w:after="40"/>
+              <w:jc w:val="right"/>
+              <w:rPr>
+                <w:rFonts w:hint="eastAsia"/>
+              </w:rPr>
+            </w:pPr>
+            <w:r>
+              <w:t>Nov 2008 – Jun 2009</w:t>
+            </w:r>
+          </w:p>
+        </w:tc>
+      </w:tr>
+    </w:tbl>
     <w:p>
       <w:pPr>
-        <w:pStyle w:val="Heading3"/>
-      </w:pPr>
-      <w:r>
-        <w:t>Cisco CCNA Exploration Instructor</w:t>
-      </w:r>
-    </w:p>
-    <w:p>
-      <w:pPr>
         <w:pStyle w:val="Meta"/>
-        <w:tabs>
-          <w:tab w:val="right" w:pos="9637"/>
-        </w:tabs>
         <w:rPr>
           <w:rFonts w:hint="eastAsia"/>
         </w:rPr>
       </w:pPr>
       <w:r>
-        <w:t>Cisco Academy, FCT - University of Algarve</w:t>
-      </w:r>
-      <w:r>
-        <w:rPr>
-          <w:color w:val="176575"/>
-        </w:rPr>
-        <w:tab/>
-        <w:t>Nov 2008 - Jun 2009</w:t>
-      </w:r>
-    </w:p>
-    <w:p>
-      <w:pPr>
-        <w:pStyle w:val="Compact"/>
-        <w:spacing w:after="60"/>
-        <w:rPr>
-          <w:rFonts w:hint="eastAsia"/>
-        </w:rPr>
-      </w:pPr>
-      <w:r>
-        <w:t>Faro, Portugal. Taught the four CCNA Exploration modules:</w:t>
+        <w:t>Cisco Academy, FCT - University of Algarve · Faro, Portugal</w:t>
       </w:r>
     </w:p>
     <w:p>
@@ -1358,6 +2242,79 @@
         <w:t>Training and qualifications</w:t>
       </w:r>
     </w:p>
+    <w:tbl>
+      <w:tblPr>
+        <w:tblW w:w="0" w:type="auto"/>
+        <w:tblBorders>
+          <w:top w:val="nil"/>
+          <w:left w:val="nil"/>
+          <w:bottom w:val="nil"/>
+          <w:right w:val="nil"/>
+          <w:insideH w:val="nil"/>
+          <w:insideV w:val="nil"/>
+        </w:tblBorders>
+        <w:tblLayout w:type="fixed"/>
+        <w:tblLook w:val="04A0" w:firstRow="1" w:lastRow="0" w:firstColumn="1" w:lastColumn="0" w:noHBand="0" w:noVBand="1"/>
+      </w:tblPr>
+      <w:tblGrid>
+        <w:gridCol w:w="7483"/>
+        <w:gridCol w:w="2154"/>
+      </w:tblGrid>
+      <w:tr>
+        <w:trPr>
+          <w:cantSplit/>
+        </w:trPr>
+        <w:tc>
+          <w:tcPr>
+            <w:tcW w:w="7483" w:type="dxa"/>
+            <w:tcMar>
+              <w:top w:w="0" w:type="dxa"/>
+              <w:left w:w="0" w:type="dxa"/>
+              <w:bottom w:w="0" w:type="dxa"/>
+              <w:right w:w="0" w:type="dxa"/>
+            </w:tcMar>
+          </w:tcPr>
+          <w:p>
+            <w:pPr>
+              <w:pStyle w:val="Subrole"/>
+              <w:keepNext/>
+              <w:ind w:right="170"/>
+              <w:rPr>
+                <w:rFonts w:hint="eastAsia"/>
+              </w:rPr>
+            </w:pPr>
+            <w:r>
+              <w:t>Professional Scrum Master I</w:t>
+            </w:r>
+          </w:p>
+        </w:tc>
+        <w:tc>
+          <w:tcPr>
+            <w:tcW w:w="2154" w:type="dxa"/>
+            <w:tcMar>
+              <w:top w:w="0" w:type="dxa"/>
+              <w:left w:w="0" w:type="dxa"/>
+              <w:bottom w:w="0" w:type="dxa"/>
+              <w:right w:w="0" w:type="dxa"/>
+            </w:tcMar>
+          </w:tcPr>
+          <w:p>
+            <w:pPr>
+              <w:pStyle w:val="Date1"/>
+              <w:keepNext/>
+              <w:spacing w:before="40" w:after="40"/>
+              <w:jc w:val="right"/>
+              <w:rPr>
+                <w:rFonts w:hint="eastAsia"/>
+              </w:rPr>
+            </w:pPr>
+            <w:r>
+              <w:t>Mar 2018</w:t>
+            </w:r>
+          </w:p>
+        </w:tc>
+      </w:tr>
+    </w:tbl>
     <w:p>
       <w:pPr>
         <w:pStyle w:val="Compact"/>
@@ -1366,15 +2323,82 @@
         </w:rPr>
       </w:pPr>
       <w:r>
-        <w:rPr>
-          <w:b/>
-        </w:rPr>
-        <w:t xml:space="preserve">Certificate of Pedagogical Competences (CCP) · 2015. </w:t>
-      </w:r>
-      <w:r>
-        <w:t>IEFP, March 2015. Initial trainer training in pedagogical methods and competences at Training House, Faro, January-March 2015.</w:t>
+        <w:t>Scrum.org.</w:t>
       </w:r>
     </w:p>
+    <w:tbl>
+      <w:tblPr>
+        <w:tblW w:w="0" w:type="auto"/>
+        <w:tblBorders>
+          <w:top w:val="nil"/>
+          <w:left w:val="nil"/>
+          <w:bottom w:val="nil"/>
+          <w:right w:val="nil"/>
+          <w:insideH w:val="nil"/>
+          <w:insideV w:val="nil"/>
+        </w:tblBorders>
+        <w:tblLayout w:type="fixed"/>
+        <w:tblLook w:val="04A0" w:firstRow="1" w:lastRow="0" w:firstColumn="1" w:lastColumn="0" w:noHBand="0" w:noVBand="1"/>
+      </w:tblPr>
+      <w:tblGrid>
+        <w:gridCol w:w="7483"/>
+        <w:gridCol w:w="2154"/>
+      </w:tblGrid>
+      <w:tr>
+        <w:trPr>
+          <w:cantSplit/>
+        </w:trPr>
+        <w:tc>
+          <w:tcPr>
+            <w:tcW w:w="7483" w:type="dxa"/>
+            <w:tcMar>
+              <w:top w:w="0" w:type="dxa"/>
+              <w:left w:w="0" w:type="dxa"/>
+              <w:bottom w:w="0" w:type="dxa"/>
+              <w:right w:w="0" w:type="dxa"/>
+            </w:tcMar>
+          </w:tcPr>
+          <w:p>
+            <w:pPr>
+              <w:pStyle w:val="Subrole"/>
+              <w:keepNext/>
+              <w:ind w:right="170"/>
+              <w:rPr>
+                <w:rFonts w:hint="eastAsia"/>
+              </w:rPr>
+            </w:pPr>
+            <w:r>
+              <w:t>Certificate of Pedagogical Competences (CCP)</w:t>
+            </w:r>
+          </w:p>
+        </w:tc>
+        <w:tc>
+          <w:tcPr>
+            <w:tcW w:w="2154" w:type="dxa"/>
+            <w:tcMar>
+              <w:top w:w="0" w:type="dxa"/>
+              <w:left w:w="0" w:type="dxa"/>
+              <w:bottom w:w="0" w:type="dxa"/>
+              <w:right w:w="0" w:type="dxa"/>
+            </w:tcMar>
+          </w:tcPr>
+          <w:p>
+            <w:pPr>
+              <w:pStyle w:val="Date1"/>
+              <w:keepNext/>
+              <w:spacing w:before="40" w:after="40"/>
+              <w:jc w:val="right"/>
+              <w:rPr>
+                <w:rFonts w:hint="eastAsia"/>
+              </w:rPr>
+            </w:pPr>
+            <w:r>
+              <w:t>Mar 2015</w:t>
+            </w:r>
+          </w:p>
+        </w:tc>
+      </w:tr>
+    </w:tbl>
     <w:p>
       <w:pPr>
         <w:pStyle w:val="Compact"/>
@@ -1383,15 +2407,82 @@
         </w:rPr>
       </w:pPr>
       <w:r>
-        <w:rPr>
-          <w:b/>
-        </w:rPr>
-        <w:t xml:space="preserve">Cisco Certified Network Associate (CCNA) · 2008. </w:t>
-      </w:r>
-      <w:r>
-        <w:t>Cisco Academy, FCT - University of Algarve, October 2007-May 2008. Modules 1-4; average grade: 90%.</w:t>
+        <w:t>IEFP. Initial trainer training in pedagogical methods and competences, Training House, Faro (Jan–Mar 2015).</w:t>
       </w:r>
     </w:p>
+    <w:tbl>
+      <w:tblPr>
+        <w:tblW w:w="0" w:type="auto"/>
+        <w:tblBorders>
+          <w:top w:val="nil"/>
+          <w:left w:val="nil"/>
+          <w:bottom w:val="nil"/>
+          <w:right w:val="nil"/>
+          <w:insideH w:val="nil"/>
+          <w:insideV w:val="nil"/>
+        </w:tblBorders>
+        <w:tblLayout w:type="fixed"/>
+        <w:tblLook w:val="04A0" w:firstRow="1" w:lastRow="0" w:firstColumn="1" w:lastColumn="0" w:noHBand="0" w:noVBand="1"/>
+      </w:tblPr>
+      <w:tblGrid>
+        <w:gridCol w:w="7483"/>
+        <w:gridCol w:w="2154"/>
+      </w:tblGrid>
+      <w:tr>
+        <w:trPr>
+          <w:cantSplit/>
+        </w:trPr>
+        <w:tc>
+          <w:tcPr>
+            <w:tcW w:w="7483" w:type="dxa"/>
+            <w:tcMar>
+              <w:top w:w="0" w:type="dxa"/>
+              <w:left w:w="0" w:type="dxa"/>
+              <w:bottom w:w="0" w:type="dxa"/>
+              <w:right w:w="0" w:type="dxa"/>
+            </w:tcMar>
+          </w:tcPr>
+          <w:p>
+            <w:pPr>
+              <w:pStyle w:val="Subrole"/>
+              <w:keepNext/>
+              <w:ind w:right="170"/>
+              <w:rPr>
+                <w:rFonts w:hint="eastAsia"/>
+              </w:rPr>
+            </w:pPr>
+            <w:r>
+              <w:t>Cisco Certified Network Associate (CCNA)</w:t>
+            </w:r>
+          </w:p>
+        </w:tc>
+        <w:tc>
+          <w:tcPr>
+            <w:tcW w:w="2154" w:type="dxa"/>
+            <w:tcMar>
+              <w:top w:w="0" w:type="dxa"/>
+              <w:left w:w="0" w:type="dxa"/>
+              <w:bottom w:w="0" w:type="dxa"/>
+              <w:right w:w="0" w:type="dxa"/>
+            </w:tcMar>
+          </w:tcPr>
+          <w:p>
+            <w:pPr>
+              <w:pStyle w:val="Date1"/>
+              <w:keepNext/>
+              <w:spacing w:before="40" w:after="40"/>
+              <w:jc w:val="right"/>
+              <w:rPr>
+                <w:rFonts w:hint="eastAsia"/>
+              </w:rPr>
+            </w:pPr>
+            <w:r>
+              <w:t>Oct 2007 – May 2008</w:t>
+            </w:r>
+          </w:p>
+        </w:tc>
+      </w:tr>
+    </w:tbl>
     <w:p>
       <w:pPr>
         <w:pStyle w:val="Compact"/>
@@ -1400,13 +2491,7 @@
         </w:rPr>
       </w:pPr>
       <w:r>
-        <w:rPr>
-          <w:b/>
-        </w:rPr>
-        <w:t xml:space="preserve">Professional Scrum Master I · 2018. </w:t>
-      </w:r>
-      <w:r>
-        <w:t>Scrum.org, March 2018.</w:t>
+        <w:t>Cisco Academy, FCT - University of Algarve. Modules 1-4; average grade: 90%.</w:t>
       </w:r>
     </w:p>
     <w:p>
@@ -1419,20 +2504,78 @@
         <w:t>Professional experience</w:t>
       </w:r>
     </w:p>
+    <w:tbl>
+      <w:tblPr>
+        <w:tblW w:w="0" w:type="auto"/>
+        <w:tblBorders>
+          <w:top w:val="nil"/>
+          <w:left w:val="nil"/>
+          <w:bottom w:val="nil"/>
+          <w:right w:val="nil"/>
+          <w:insideH w:val="nil"/>
+          <w:insideV w:val="nil"/>
+        </w:tblBorders>
+        <w:tblLayout w:type="fixed"/>
+        <w:tblLook w:val="04A0" w:firstRow="1" w:lastRow="0" w:firstColumn="1" w:lastColumn="0" w:noHBand="0" w:noVBand="1"/>
+      </w:tblPr>
+      <w:tblGrid>
+        <w:gridCol w:w="7483"/>
+        <w:gridCol w:w="2154"/>
+      </w:tblGrid>
+      <w:tr>
+        <w:trPr>
+          <w:cantSplit/>
+        </w:trPr>
+        <w:tc>
+          <w:tcPr>
+            <w:tcW w:w="7483" w:type="dxa"/>
+            <w:tcMar>
+              <w:top w:w="0" w:type="dxa"/>
+              <w:left w:w="0" w:type="dxa"/>
+              <w:bottom w:w="0" w:type="dxa"/>
+              <w:right w:w="0" w:type="dxa"/>
+            </w:tcMar>
+          </w:tcPr>
+          <w:p>
+            <w:pPr>
+              <w:pStyle w:val="Heading3"/>
+              <w:ind w:right="170"/>
+            </w:pPr>
+            <w:r>
+              <w:t>Independent Software Engineer</w:t>
+            </w:r>
+          </w:p>
+        </w:tc>
+        <w:tc>
+          <w:tcPr>
+            <w:tcW w:w="2154" w:type="dxa"/>
+            <w:tcMar>
+              <w:top w:w="0" w:type="dxa"/>
+              <w:left w:w="0" w:type="dxa"/>
+              <w:bottom w:w="0" w:type="dxa"/>
+              <w:right w:w="0" w:type="dxa"/>
+            </w:tcMar>
+          </w:tcPr>
+          <w:p>
+            <w:pPr>
+              <w:pStyle w:val="Date1"/>
+              <w:keepNext/>
+              <w:spacing w:before="80" w:after="40"/>
+              <w:jc w:val="right"/>
+              <w:rPr>
+                <w:rFonts w:hint="eastAsia"/>
+              </w:rPr>
+            </w:pPr>
+            <w:r>
+              <w:t>Nov 2022 – Present</w:t>
+            </w:r>
+          </w:p>
+        </w:tc>
+      </w:tr>
+    </w:tbl>
     <w:p>
       <w:pPr>
-        <w:pStyle w:val="Heading3"/>
-      </w:pPr>
-      <w:r>
-        <w:t>Independent Software Engineer</w:t>
-      </w:r>
-    </w:p>
-    <w:p>
-      <w:pPr>
         <w:pStyle w:val="Meta"/>
-        <w:tabs>
-          <w:tab w:val="right" w:pos="9637"/>
-        </w:tabs>
         <w:rPr>
           <w:rFonts w:hint="eastAsia"/>
         </w:rPr>
@@ -1440,12 +2583,340 @@
       <w:r>
         <w:t>JTJ Software · Netherlands and Portugal</w:t>
       </w:r>
+    </w:p>
+    <w:tbl>
+      <w:tblPr>
+        <w:tblW w:w="0" w:type="auto"/>
+        <w:tblBorders>
+          <w:top w:val="nil"/>
+          <w:left w:val="nil"/>
+          <w:bottom w:val="nil"/>
+          <w:right w:val="nil"/>
+          <w:insideH w:val="nil"/>
+          <w:insideV w:val="nil"/>
+        </w:tblBorders>
+        <w:tblLayout w:type="fixed"/>
+        <w:tblLook w:val="04A0" w:firstRow="1" w:lastRow="0" w:firstColumn="1" w:lastColumn="0" w:noHBand="0" w:noVBand="1"/>
+      </w:tblPr>
+      <w:tblGrid>
+        <w:gridCol w:w="7483"/>
+        <w:gridCol w:w="2154"/>
+      </w:tblGrid>
+      <w:tr>
+        <w:trPr>
+          <w:cantSplit/>
+        </w:trPr>
+        <w:tc>
+          <w:tcPr>
+            <w:tcW w:w="7483" w:type="dxa"/>
+            <w:tcMar>
+              <w:top w:w="0" w:type="dxa"/>
+              <w:left w:w="0" w:type="dxa"/>
+              <w:bottom w:w="0" w:type="dxa"/>
+              <w:right w:w="0" w:type="dxa"/>
+            </w:tcMar>
+          </w:tcPr>
+          <w:p>
+            <w:pPr>
+              <w:pStyle w:val="Subrole"/>
+              <w:keepNext/>
+              <w:ind w:left="227" w:right="170"/>
+              <w:rPr>
+                <w:rFonts w:hint="eastAsia"/>
+              </w:rPr>
+            </w:pPr>
+            <w:r>
+              <w:t>LVNL SIM Builder</w:t>
+            </w:r>
+          </w:p>
+        </w:tc>
+        <w:tc>
+          <w:tcPr>
+            <w:tcW w:w="2154" w:type="dxa"/>
+            <w:tcMar>
+              <w:top w:w="0" w:type="dxa"/>
+              <w:left w:w="0" w:type="dxa"/>
+              <w:bottom w:w="0" w:type="dxa"/>
+              <w:right w:w="0" w:type="dxa"/>
+            </w:tcMar>
+          </w:tcPr>
+          <w:p>
+            <w:pPr>
+              <w:pStyle w:val="Date1"/>
+              <w:keepNext/>
+              <w:spacing w:before="40" w:after="40"/>
+              <w:jc w:val="right"/>
+              <w:rPr>
+                <w:rFonts w:hint="eastAsia"/>
+              </w:rPr>
+            </w:pPr>
+            <w:r>
+              <w:t>Jun 2024 – Feb 2026</w:t>
+            </w:r>
+          </w:p>
+        </w:tc>
+      </w:tr>
+    </w:tbl>
+    <w:p>
+      <w:pPr>
+        <w:pStyle w:val="Compact"/>
+        <w:ind w:left="227"/>
+        <w:rPr>
+          <w:rFonts w:hint="eastAsia"/>
+        </w:rPr>
+      </w:pPr>
       <w:r>
+        <w:t>Full-stack development and Scrum Master responsibilities for a web-based ATM scenario platform built on an adapted BlueSky simulator.</w:t>
+      </w:r>
+    </w:p>
+    <w:tbl>
+      <w:tblPr>
+        <w:tblW w:w="0" w:type="auto"/>
+        <w:tblBorders>
+          <w:top w:val="nil"/>
+          <w:left w:val="nil"/>
+          <w:bottom w:val="nil"/>
+          <w:right w:val="nil"/>
+          <w:insideH w:val="nil"/>
+          <w:insideV w:val="nil"/>
+        </w:tblBorders>
+        <w:tblLayout w:type="fixed"/>
+        <w:tblLook w:val="04A0" w:firstRow="1" w:lastRow="0" w:firstColumn="1" w:lastColumn="0" w:noHBand="0" w:noVBand="1"/>
+      </w:tblPr>
+      <w:tblGrid>
+        <w:gridCol w:w="7483"/>
+        <w:gridCol w:w="2154"/>
+      </w:tblGrid>
+      <w:tr>
+        <w:trPr>
+          <w:cantSplit/>
+        </w:trPr>
+        <w:tc>
+          <w:tcPr>
+            <w:tcW w:w="7483" w:type="dxa"/>
+            <w:tcMar>
+              <w:top w:w="0" w:type="dxa"/>
+              <w:left w:w="0" w:type="dxa"/>
+              <w:bottom w:w="0" w:type="dxa"/>
+              <w:right w:w="0" w:type="dxa"/>
+            </w:tcMar>
+          </w:tcPr>
+          <w:p>
+            <w:pPr>
+              <w:pStyle w:val="Subrole"/>
+              <w:keepNext/>
+              <w:ind w:left="227" w:right="170"/>
+              <w:rPr>
+                <w:rFonts w:hint="eastAsia"/>
+              </w:rPr>
+            </w:pPr>
+            <w:r>
+              <w:t>LVNL iCAS SIM</w:t>
+            </w:r>
+          </w:p>
+        </w:tc>
+        <w:tc>
+          <w:tcPr>
+            <w:tcW w:w="2154" w:type="dxa"/>
+            <w:tcMar>
+              <w:top w:w="0" w:type="dxa"/>
+              <w:left w:w="0" w:type="dxa"/>
+              <w:bottom w:w="0" w:type="dxa"/>
+              <w:right w:w="0" w:type="dxa"/>
+            </w:tcMar>
+          </w:tcPr>
+          <w:p>
+            <w:pPr>
+              <w:pStyle w:val="Date1"/>
+              <w:keepNext/>
+              <w:spacing w:before="40" w:after="40"/>
+              <w:jc w:val="right"/>
+              <w:rPr>
+                <w:rFonts w:hint="eastAsia"/>
+              </w:rPr>
+            </w:pPr>
+            <w:r>
+              <w:t>Nov 2022 – Dec 2025</w:t>
+            </w:r>
+          </w:p>
+        </w:tc>
+      </w:tr>
+    </w:tbl>
+    <w:p>
+      <w:pPr>
+        <w:pStyle w:val="Compact"/>
+        <w:ind w:left="227"/>
         <w:rPr>
-          <w:color w:val="176575"/>
+          <w:rFonts w:hint="eastAsia"/>
         </w:rPr>
-        <w:tab/>
-        <w:t>Nov 2022 - Present</w:t>
+      </w:pPr>
+      <w:r>
+        <w:t>Developed and maintained the simulation and training environment for the Netherlands’ next-generation air traffic management system, including peripheral-system integration.</w:t>
+      </w:r>
+    </w:p>
+    <w:tbl>
+      <w:tblPr>
+        <w:tblW w:w="0" w:type="auto"/>
+        <w:tblBorders>
+          <w:top w:val="nil"/>
+          <w:left w:val="nil"/>
+          <w:bottom w:val="nil"/>
+          <w:right w:val="nil"/>
+          <w:insideH w:val="nil"/>
+          <w:insideV w:val="nil"/>
+        </w:tblBorders>
+        <w:tblLayout w:type="fixed"/>
+        <w:tblLook w:val="04A0" w:firstRow="1" w:lastRow="0" w:firstColumn="1" w:lastColumn="0" w:noHBand="0" w:noVBand="1"/>
+      </w:tblPr>
+      <w:tblGrid>
+        <w:gridCol w:w="7483"/>
+        <w:gridCol w:w="2154"/>
+      </w:tblGrid>
+      <w:tr>
+        <w:trPr>
+          <w:cantSplit/>
+        </w:trPr>
+        <w:tc>
+          <w:tcPr>
+            <w:tcW w:w="7483" w:type="dxa"/>
+            <w:tcMar>
+              <w:top w:w="0" w:type="dxa"/>
+              <w:left w:w="0" w:type="dxa"/>
+              <w:bottom w:w="0" w:type="dxa"/>
+              <w:right w:w="0" w:type="dxa"/>
+            </w:tcMar>
+          </w:tcPr>
+          <w:p>
+            <w:pPr>
+              <w:pStyle w:val="Subrole"/>
+              <w:keepNext/>
+              <w:ind w:left="227" w:right="170"/>
+              <w:rPr>
+                <w:rFonts w:hint="eastAsia"/>
+              </w:rPr>
+            </w:pPr>
+            <w:r>
+              <w:t>Portuguese real-estate software</w:t>
+            </w:r>
+          </w:p>
+        </w:tc>
+        <w:tc>
+          <w:tcPr>
+            <w:tcW w:w="2154" w:type="dxa"/>
+            <w:tcMar>
+              <w:top w:w="0" w:type="dxa"/>
+              <w:left w:w="0" w:type="dxa"/>
+              <w:bottom w:w="0" w:type="dxa"/>
+              <w:right w:w="0" w:type="dxa"/>
+            </w:tcMar>
+          </w:tcPr>
+          <w:p>
+            <w:pPr>
+              <w:pStyle w:val="Date1"/>
+              <w:keepNext/>
+              <w:spacing w:before="40" w:after="40"/>
+              <w:jc w:val="right"/>
+              <w:rPr>
+                <w:rFonts w:hint="eastAsia"/>
+              </w:rPr>
+            </w:pPr>
+            <w:r>
+              <w:t>Jan 2026 – Present</w:t>
+            </w:r>
+          </w:p>
+        </w:tc>
+      </w:tr>
+    </w:tbl>
+    <w:p>
+      <w:pPr>
+        <w:pStyle w:val="Compact"/>
+        <w:ind w:left="227"/>
+        <w:rPr>
+          <w:rFonts w:hint="eastAsia"/>
+        </w:rPr>
+      </w:pPr>
+      <w:r>
+        <w:t>Product discovery, architecture and implementation for the Portuguese real-estate market.</w:t>
+      </w:r>
+    </w:p>
+    <w:tbl>
+      <w:tblPr>
+        <w:tblW w:w="0" w:type="auto"/>
+        <w:tblBorders>
+          <w:top w:val="nil"/>
+          <w:left w:val="nil"/>
+          <w:bottom w:val="nil"/>
+          <w:right w:val="nil"/>
+          <w:insideH w:val="nil"/>
+          <w:insideV w:val="nil"/>
+        </w:tblBorders>
+        <w:tblLayout w:type="fixed"/>
+        <w:tblLook w:val="04A0" w:firstRow="1" w:lastRow="0" w:firstColumn="1" w:lastColumn="0" w:noHBand="0" w:noVBand="1"/>
+      </w:tblPr>
+      <w:tblGrid>
+        <w:gridCol w:w="7483"/>
+        <w:gridCol w:w="2154"/>
+      </w:tblGrid>
+      <w:tr>
+        <w:trPr>
+          <w:cantSplit/>
+        </w:trPr>
+        <w:tc>
+          <w:tcPr>
+            <w:tcW w:w="7483" w:type="dxa"/>
+            <w:tcMar>
+              <w:top w:w="0" w:type="dxa"/>
+              <w:left w:w="0" w:type="dxa"/>
+              <w:bottom w:w="0" w:type="dxa"/>
+              <w:right w:w="0" w:type="dxa"/>
+            </w:tcMar>
+          </w:tcPr>
+          <w:p>
+            <w:pPr>
+              <w:pStyle w:val="Heading3"/>
+              <w:ind w:right="170"/>
+            </w:pPr>
+            <w:r>
+              <w:t>C++ Software Developer</w:t>
+            </w:r>
+          </w:p>
+        </w:tc>
+        <w:tc>
+          <w:tcPr>
+            <w:tcW w:w="2154" w:type="dxa"/>
+            <w:tcMar>
+              <w:top w:w="0" w:type="dxa"/>
+              <w:left w:w="0" w:type="dxa"/>
+              <w:bottom w:w="0" w:type="dxa"/>
+              <w:right w:w="0" w:type="dxa"/>
+            </w:tcMar>
+          </w:tcPr>
+          <w:p>
+            <w:pPr>
+              <w:pStyle w:val="Date1"/>
+              <w:keepNext/>
+              <w:spacing w:before="80" w:after="40"/>
+              <w:jc w:val="right"/>
+              <w:rPr>
+                <w:rFonts w:hint="eastAsia"/>
+              </w:rPr>
+            </w:pPr>
+            <w:r>
+              <w:t>May 2021 – Nov 2022</w:t>
+            </w:r>
+          </w:p>
+        </w:tc>
+      </w:tr>
+    </w:tbl>
+    <w:p>
+      <w:pPr>
+        <w:pStyle w:val="Meta"/>
+        <w:rPr>
+          <w:rFonts w:hint="eastAsia"/>
+        </w:rPr>
+      </w:pPr>
+      <w:r>
+        <w:t>Accent Pointe B.V. · Netherlands</w:t>
       </w:r>
     </w:p>
     <w:p>
@@ -1456,13 +2927,87 @@
         </w:rPr>
       </w:pPr>
       <w:r>
+        <w:t>Developed trading software integrated with brokers and market-data feeds; modernised a legacy MFC and Microsoft RPC codebase.</w:t>
+      </w:r>
+    </w:p>
+    <w:tbl>
+      <w:tblPr>
+        <w:tblW w:w="0" w:type="auto"/>
+        <w:tblBorders>
+          <w:top w:val="nil"/>
+          <w:left w:val="nil"/>
+          <w:bottom w:val="nil"/>
+          <w:right w:val="nil"/>
+          <w:insideH w:val="nil"/>
+          <w:insideV w:val="nil"/>
+        </w:tblBorders>
+        <w:tblLayout w:type="fixed"/>
+        <w:tblLook w:val="04A0" w:firstRow="1" w:lastRow="0" w:firstColumn="1" w:lastColumn="0" w:noHBand="0" w:noVBand="1"/>
+      </w:tblPr>
+      <w:tblGrid>
+        <w:gridCol w:w="7483"/>
+        <w:gridCol w:w="2154"/>
+      </w:tblGrid>
+      <w:tr>
+        <w:trPr>
+          <w:cantSplit/>
+        </w:trPr>
+        <w:tc>
+          <w:tcPr>
+            <w:tcW w:w="7483" w:type="dxa"/>
+            <w:tcMar>
+              <w:top w:w="0" w:type="dxa"/>
+              <w:left w:w="0" w:type="dxa"/>
+              <w:bottom w:w="0" w:type="dxa"/>
+              <w:right w:w="0" w:type="dxa"/>
+            </w:tcMar>
+          </w:tcPr>
+          <w:p>
+            <w:pPr>
+              <w:pStyle w:val="Heading3"/>
+              <w:ind w:right="170"/>
+            </w:pPr>
+            <w:r>
+              <w:t>C++ Software Developer</w:t>
+            </w:r>
+          </w:p>
+        </w:tc>
+        <w:tc>
+          <w:tcPr>
+            <w:tcW w:w="2154" w:type="dxa"/>
+            <w:tcMar>
+              <w:top w:w="0" w:type="dxa"/>
+              <w:left w:w="0" w:type="dxa"/>
+              <w:bottom w:w="0" w:type="dxa"/>
+              <w:right w:w="0" w:type="dxa"/>
+            </w:tcMar>
+          </w:tcPr>
+          <w:p>
+            <w:pPr>
+              <w:pStyle w:val="Date1"/>
+              <w:keepNext/>
+              <w:spacing w:before="80" w:after="40"/>
+              <w:jc w:val="right"/>
+              <w:rPr>
+                <w:rFonts w:hint="eastAsia"/>
+              </w:rPr>
+            </w:pPr>
+            <w:r>
+              <w:t>Nov 2016 – May 2021</w:t>
+            </w:r>
+          </w:p>
+        </w:tc>
+      </w:tr>
+    </w:tbl>
+    <w:p>
+      <w:pPr>
+        <w:pStyle w:val="Meta"/>
         <w:rPr>
-          <w:b/>
+          <w:rFonts w:hint="eastAsia"/>
         </w:rPr>
-        <w:t xml:space="preserve">LVNL SIM Builder · Jun 2024 - Feb 2026. </w:t>
-      </w:r>
+      </w:pPr>
       <w:r>
-        <w:t>Contributed across the full stack of a web-based ATM scenario platform built on an adapted BlueSky simulator, combining development and Scrum Master responsibilities.</w:t>
+        <w:t>ABN AMRO Clearing Bank · Netherlands</w:t>
       </w:r>
     </w:p>
     <w:p>
@@ -1473,13 +3018,87 @@
         </w:rPr>
       </w:pPr>
       <w:r>
+        <w:t>Delivered financial risk-management software and integrated service interfaces, messaging and authentication components.</w:t>
+      </w:r>
+    </w:p>
+    <w:tbl>
+      <w:tblPr>
+        <w:tblW w:w="0" w:type="auto"/>
+        <w:tblBorders>
+          <w:top w:val="nil"/>
+          <w:left w:val="nil"/>
+          <w:bottom w:val="nil"/>
+          <w:right w:val="nil"/>
+          <w:insideH w:val="nil"/>
+          <w:insideV w:val="nil"/>
+        </w:tblBorders>
+        <w:tblLayout w:type="fixed"/>
+        <w:tblLook w:val="04A0" w:firstRow="1" w:lastRow="0" w:firstColumn="1" w:lastColumn="0" w:noHBand="0" w:noVBand="1"/>
+      </w:tblPr>
+      <w:tblGrid>
+        <w:gridCol w:w="7483"/>
+        <w:gridCol w:w="2154"/>
+      </w:tblGrid>
+      <w:tr>
+        <w:trPr>
+          <w:cantSplit/>
+        </w:trPr>
+        <w:tc>
+          <w:tcPr>
+            <w:tcW w:w="7483" w:type="dxa"/>
+            <w:tcMar>
+              <w:top w:w="0" w:type="dxa"/>
+              <w:left w:w="0" w:type="dxa"/>
+              <w:bottom w:w="0" w:type="dxa"/>
+              <w:right w:w="0" w:type="dxa"/>
+            </w:tcMar>
+          </w:tcPr>
+          <w:p>
+            <w:pPr>
+              <w:pStyle w:val="Heading3"/>
+              <w:ind w:right="170"/>
+            </w:pPr>
+            <w:r>
+              <w:t>Software Engineer</w:t>
+            </w:r>
+          </w:p>
+        </w:tc>
+        <w:tc>
+          <w:tcPr>
+            <w:tcW w:w="2154" w:type="dxa"/>
+            <w:tcMar>
+              <w:top w:w="0" w:type="dxa"/>
+              <w:left w:w="0" w:type="dxa"/>
+              <w:bottom w:w="0" w:type="dxa"/>
+              <w:right w:w="0" w:type="dxa"/>
+            </w:tcMar>
+          </w:tcPr>
+          <w:p>
+            <w:pPr>
+              <w:pStyle w:val="Date1"/>
+              <w:keepNext/>
+              <w:spacing w:before="80" w:after="40"/>
+              <w:jc w:val="right"/>
+              <w:rPr>
+                <w:rFonts w:hint="eastAsia"/>
+              </w:rPr>
+            </w:pPr>
+            <w:r>
+              <w:t>Apr 2016 – Oct 2016</w:t>
+            </w:r>
+          </w:p>
+        </w:tc>
+      </w:tr>
+    </w:tbl>
+    <w:p>
+      <w:pPr>
+        <w:pStyle w:val="Meta"/>
         <w:rPr>
-          <w:b/>
+          <w:rFonts w:hint="eastAsia"/>
         </w:rPr>
-        <w:t xml:space="preserve">LVNL iCAS SIM · Nov 2022 - Dec 2025. </w:t>
-      </w:r>
+      </w:pPr>
       <w:r>
-        <w:t>Developed and maintained the simulation and training environment for the Netherlands’ next-generation air traffic management system, including integration with peripheral systems.</w:t>
+        <w:t>Frinch · Faro, Portugal / Remote</w:t>
       </w:r>
     </w:p>
     <w:p>
@@ -1490,42 +3109,87 @@
         </w:rPr>
       </w:pPr>
       <w:r>
-        <w:rPr>
-          <w:b/>
-        </w:rPr>
-        <w:t xml:space="preserve">Portuguese real-estate software · Jan 2026 - Present. </w:t>
-      </w:r>
-      <w:r>
-        <w:t>Product discovery, architecture and implementation for the Portuguese real-estate market.</w:t>
+        <w:t>Developed Product Information Management software with a distributed team working with the company’s Munich headquarters.</w:t>
       </w:r>
     </w:p>
+    <w:tbl>
+      <w:tblPr>
+        <w:tblW w:w="0" w:type="auto"/>
+        <w:tblBorders>
+          <w:top w:val="nil"/>
+          <w:left w:val="nil"/>
+          <w:bottom w:val="nil"/>
+          <w:right w:val="nil"/>
+          <w:insideH w:val="nil"/>
+          <w:insideV w:val="nil"/>
+        </w:tblBorders>
+        <w:tblLayout w:type="fixed"/>
+        <w:tblLook w:val="04A0" w:firstRow="1" w:lastRow="0" w:firstColumn="1" w:lastColumn="0" w:noHBand="0" w:noVBand="1"/>
+      </w:tblPr>
+      <w:tblGrid>
+        <w:gridCol w:w="7483"/>
+        <w:gridCol w:w="2154"/>
+      </w:tblGrid>
+      <w:tr>
+        <w:trPr>
+          <w:cantSplit/>
+        </w:trPr>
+        <w:tc>
+          <w:tcPr>
+            <w:tcW w:w="7483" w:type="dxa"/>
+            <w:tcMar>
+              <w:top w:w="0" w:type="dxa"/>
+              <w:left w:w="0" w:type="dxa"/>
+              <w:bottom w:w="0" w:type="dxa"/>
+              <w:right w:w="0" w:type="dxa"/>
+            </w:tcMar>
+          </w:tcPr>
+          <w:p>
+            <w:pPr>
+              <w:pStyle w:val="Heading3"/>
+              <w:ind w:right="170"/>
+            </w:pPr>
+            <w:r>
+              <w:t>Software Engineer and Lead Researcher</w:t>
+            </w:r>
+          </w:p>
+        </w:tc>
+        <w:tc>
+          <w:tcPr>
+            <w:tcW w:w="2154" w:type="dxa"/>
+            <w:tcMar>
+              <w:top w:w="0" w:type="dxa"/>
+              <w:left w:w="0" w:type="dxa"/>
+              <w:bottom w:w="0" w:type="dxa"/>
+              <w:right w:w="0" w:type="dxa"/>
+            </w:tcMar>
+          </w:tcPr>
+          <w:p>
+            <w:pPr>
+              <w:pStyle w:val="Date1"/>
+              <w:keepNext/>
+              <w:spacing w:before="80" w:after="40"/>
+              <w:jc w:val="right"/>
+              <w:rPr>
+                <w:rFonts w:hint="eastAsia"/>
+              </w:rPr>
+            </w:pPr>
+            <w:r>
+              <w:t>Oct 2013 – Sep 2015</w:t>
+            </w:r>
+          </w:p>
+        </w:tc>
+      </w:tr>
+    </w:tbl>
     <w:p>
       <w:pPr>
-        <w:pStyle w:val="Heading3"/>
-      </w:pPr>
-      <w:r>
-        <w:t>C++ Software Developer</w:t>
-      </w:r>
-    </w:p>
-    <w:p>
-      <w:pPr>
         <w:pStyle w:val="Meta"/>
-        <w:tabs>
-          <w:tab w:val="right" w:pos="9637"/>
-        </w:tabs>
         <w:rPr>
           <w:rFonts w:hint="eastAsia"/>
         </w:rPr>
       </w:pPr>
       <w:r>
-        <w:t>Accent Pointe B.V. · Netherlands</w:t>
-      </w:r>
-      <w:r>
-        <w:rPr>
-          <w:color w:val="176575"/>
-        </w:rPr>
-        <w:tab/>
-        <w:t>May 2021 - Nov 2022</w:t>
+        <w:t>Evision Industry Software · Faro, Portugal</w:t>
       </w:r>
     </w:p>
     <w:p>
@@ -1536,156 +3200,87 @@
         </w:rPr>
       </w:pPr>
       <w:r>
-        <w:t>Developed trading software integrated with brokers and market-data feeds; modernised a legacy MFC and Microsoft RPC codebase.</w:t>
+        <w:t>Developed algorithms for text detection, raster-to-vector conversion and automatic interpretation of piping and instrumentation diagrams and AutoCAD files, including pipe and instrument recognition. Worked with the team in The Hague using C# and TypeScript.</w:t>
       </w:r>
     </w:p>
+    <w:tbl>
+      <w:tblPr>
+        <w:tblW w:w="0" w:type="auto"/>
+        <w:tblBorders>
+          <w:top w:val="nil"/>
+          <w:left w:val="nil"/>
+          <w:bottom w:val="nil"/>
+          <w:right w:val="nil"/>
+          <w:insideH w:val="nil"/>
+          <w:insideV w:val="nil"/>
+        </w:tblBorders>
+        <w:tblLayout w:type="fixed"/>
+        <w:tblLook w:val="04A0" w:firstRow="1" w:lastRow="0" w:firstColumn="1" w:lastColumn="0" w:noHBand="0" w:noVBand="1"/>
+      </w:tblPr>
+      <w:tblGrid>
+        <w:gridCol w:w="7483"/>
+        <w:gridCol w:w="2154"/>
+      </w:tblGrid>
+      <w:tr>
+        <w:trPr>
+          <w:cantSplit/>
+        </w:trPr>
+        <w:tc>
+          <w:tcPr>
+            <w:tcW w:w="7483" w:type="dxa"/>
+            <w:tcMar>
+              <w:top w:w="0" w:type="dxa"/>
+              <w:left w:w="0" w:type="dxa"/>
+              <w:bottom w:w="0" w:type="dxa"/>
+              <w:right w:w="0" w:type="dxa"/>
+            </w:tcMar>
+          </w:tcPr>
+          <w:p>
+            <w:pPr>
+              <w:pStyle w:val="Heading3"/>
+              <w:ind w:right="170"/>
+            </w:pPr>
+            <w:r>
+              <w:t>Invited Expert</w:t>
+            </w:r>
+          </w:p>
+        </w:tc>
+        <w:tc>
+          <w:tcPr>
+            <w:tcW w:w="2154" w:type="dxa"/>
+            <w:tcMar>
+              <w:top w:w="0" w:type="dxa"/>
+              <w:left w:w="0" w:type="dxa"/>
+              <w:bottom w:w="0" w:type="dxa"/>
+              <w:right w:w="0" w:type="dxa"/>
+            </w:tcMar>
+          </w:tcPr>
+          <w:p>
+            <w:pPr>
+              <w:pStyle w:val="Date1"/>
+              <w:keepNext/>
+              <w:spacing w:before="80" w:after="40"/>
+              <w:jc w:val="right"/>
+              <w:rPr>
+                <w:rFonts w:hint="eastAsia"/>
+              </w:rPr>
+            </w:pPr>
+            <w:r>
+              <w:t>May 2007 – Aug 2007</w:t>
+            </w:r>
+          </w:p>
+        </w:tc>
+      </w:tr>
+    </w:tbl>
     <w:p>
       <w:pPr>
-        <w:pStyle w:val="Heading3"/>
-      </w:pPr>
-      <w:r>
-        <w:t>C++ Software Developer</w:t>
-      </w:r>
-    </w:p>
-    <w:p>
-      <w:pPr>
         <w:pStyle w:val="Meta"/>
-        <w:tabs>
-          <w:tab w:val="right" w:pos="9637"/>
-        </w:tabs>
         <w:rPr>
           <w:rFonts w:hint="eastAsia"/>
         </w:rPr>
       </w:pPr>
       <w:r>
-        <w:t>ABN AMRO Clearing Bank · Netherlands</w:t>
-      </w:r>
-      <w:r>
-        <w:rPr>
-          <w:color w:val="176575"/>
-        </w:rPr>
-        <w:tab/>
-        <w:t>Nov 2016 - May 2021</w:t>
-      </w:r>
-    </w:p>
-    <w:p>
-      <w:pPr>
-        <w:pStyle w:val="Compact"/>
-        <w:rPr>
-          <w:rFonts w:hint="eastAsia"/>
-        </w:rPr>
-      </w:pPr>
-      <w:r>
-        <w:t>Delivered financial risk-management software and integrated service interfaces, messaging and authentication components.</w:t>
-      </w:r>
-    </w:p>
-    <w:p>
-      <w:pPr>
-        <w:pStyle w:val="Heading3"/>
-      </w:pPr>
-      <w:r>
-        <w:t>Software Engineer</w:t>
-      </w:r>
-    </w:p>
-    <w:p>
-      <w:pPr>
-        <w:pStyle w:val="Meta"/>
-        <w:tabs>
-          <w:tab w:val="right" w:pos="9637"/>
-        </w:tabs>
-        <w:rPr>
-          <w:rFonts w:hint="eastAsia"/>
-        </w:rPr>
-      </w:pPr>
-      <w:r>
-        <w:t>Frinch · Faro, Portugal / Remote</w:t>
-      </w:r>
-      <w:r>
-        <w:rPr>
-          <w:color w:val="176575"/>
-        </w:rPr>
-        <w:tab/>
-        <w:t>Apr 2016 - Oct 2016</w:t>
-      </w:r>
-    </w:p>
-    <w:p>
-      <w:pPr>
-        <w:pStyle w:val="Compact"/>
-        <w:rPr>
-          <w:rFonts w:hint="eastAsia"/>
-        </w:rPr>
-      </w:pPr>
-      <w:r>
-        <w:t>Developed Product Information Management software with a distributed team working with the company’s Munich headquarters.</w:t>
-      </w:r>
-    </w:p>
-    <w:p>
-      <w:pPr>
-        <w:pStyle w:val="Heading3"/>
-      </w:pPr>
-      <w:r>
-        <w:t>Software Engineer and Lead Researcher</w:t>
-      </w:r>
-    </w:p>
-    <w:p>
-      <w:pPr>
-        <w:pStyle w:val="Meta"/>
-        <w:tabs>
-          <w:tab w:val="right" w:pos="9637"/>
-        </w:tabs>
-        <w:rPr>
-          <w:rFonts w:hint="eastAsia"/>
-        </w:rPr>
-      </w:pPr>
-      <w:r>
-        <w:t>Evision Industry Software · Faro, Portugal</w:t>
-      </w:r>
-      <w:r>
-        <w:rPr>
-          <w:color w:val="176575"/>
-        </w:rPr>
-        <w:tab/>
-        <w:t>Oct 2013 - Sep 2015</w:t>
-      </w:r>
-    </w:p>
-    <w:p>
-      <w:pPr>
-        <w:pStyle w:val="Compact"/>
-        <w:rPr>
-          <w:rFonts w:hint="eastAsia"/>
-        </w:rPr>
-      </w:pPr>
-      <w:r>
-        <w:t>Developed algorithms for text detection, raster-to-vector conversion and automatic interpretation of piping and instrumentation diagrams and AutoCAD files, including pipe and instrument recognition. Worked with the team in The Hague using C# and TypeScript.</w:t>
-      </w:r>
-    </w:p>
-    <w:p>
-      <w:pPr>
-        <w:pStyle w:val="Heading3"/>
-      </w:pPr>
-      <w:r>
-        <w:t>Invited Expert</w:t>
-      </w:r>
-    </w:p>
-    <w:p>
-      <w:pPr>
-        <w:pStyle w:val="Meta"/>
-        <w:tabs>
-          <w:tab w:val="right" w:pos="9637"/>
-        </w:tabs>
-        <w:rPr>
-          <w:rFonts w:hint="eastAsia"/>
-        </w:rPr>
-      </w:pPr>
-      <w:r>
         <w:t>SEF · Faro, Portugal</w:t>
-      </w:r>
-      <w:r>
-        <w:rPr>
-          <w:color w:val="176575"/>
-        </w:rPr>
-        <w:tab/>
-        <w:t>May 2007 - Aug 2007</w:t>
       </w:r>
     </w:p>
     <w:p>
@@ -1702,7 +3297,7 @@
     <w:p>
       <w:pPr>
         <w:pStyle w:val="Heading2"/>
-        <w:spacing w:before="260"/>
+        <w:spacing w:before="180"/>
       </w:pPr>
       <w:r>
         <w:t>Technical skills</w:t>
@@ -1745,7 +3340,7 @@
     <w:p>
       <w:pPr>
         <w:pStyle w:val="Heading2"/>
-        <w:spacing w:before="220"/>
+        <w:spacing w:before="140"/>
       </w:pPr>
       <w:r>
         <w:t>Languages</w:t>
@@ -1763,12 +3358,12 @@
       </w:r>
     </w:p>
     <w:sectPr>
-      <w:headerReference w:type="even" r:id="rId29"/>
-      <w:headerReference w:type="default" r:id="rId30"/>
-      <w:footerReference w:type="even" r:id="rId31"/>
-      <w:footerReference w:type="default" r:id="rId32"/>
-      <w:headerReference w:type="first" r:id="rId33"/>
-      <w:footerReference w:type="first" r:id="rId34"/>
+      <w:headerReference w:type="even" r:id="rId22"/>
+      <w:headerReference w:type="default" r:id="rId23"/>
+      <w:footerReference w:type="even" r:id="rId24"/>
+      <w:footerReference w:type="default" r:id="rId25"/>
+      <w:headerReference w:type="first" r:id="rId26"/>
+      <w:footerReference w:type="first" r:id="rId27"/>
       <w:pgSz w:w="11905" w:h="16838"/>
       <w:pgMar w:top="1077" w:right="1134" w:bottom="1020" w:left="1134" w:header="454" w:footer="454" w:gutter="0"/>
       <w:cols w:space="720"/>
@@ -1833,7 +3428,7 @@
       </w:rPr>
     </w:pPr>
     <w:r>
-      <w:t>CV ID 20260917_001</w:t>
+      <w:t>CV ID 20260918_001</w:t>
     </w:r>
     <w:r>
       <w:tab/>
@@ -2123,31 +3718,31 @@
       </w:rPr>
     </w:lvl>
   </w:abstractNum>
-  <w:num w:numId="1" w16cid:durableId="126709586">
+  <w:num w:numId="1" w16cid:durableId="1347439702">
     <w:abstractNumId w:val="8"/>
   </w:num>
-  <w:num w:numId="2" w16cid:durableId="1917469742">
+  <w:num w:numId="2" w16cid:durableId="456071892">
     <w:abstractNumId w:val="6"/>
   </w:num>
-  <w:num w:numId="3" w16cid:durableId="685710860">
+  <w:num w:numId="3" w16cid:durableId="829515606">
     <w:abstractNumId w:val="5"/>
   </w:num>
-  <w:num w:numId="4" w16cid:durableId="752701633">
+  <w:num w:numId="4" w16cid:durableId="969556626">
     <w:abstractNumId w:val="4"/>
   </w:num>
-  <w:num w:numId="5" w16cid:durableId="693045561">
+  <w:num w:numId="5" w16cid:durableId="1601142331">
     <w:abstractNumId w:val="7"/>
   </w:num>
-  <w:num w:numId="6" w16cid:durableId="1260214620">
+  <w:num w:numId="6" w16cid:durableId="2068451793">
     <w:abstractNumId w:val="3"/>
   </w:num>
-  <w:num w:numId="7" w16cid:durableId="477037405">
+  <w:num w:numId="7" w16cid:durableId="301884598">
     <w:abstractNumId w:val="2"/>
   </w:num>
-  <w:num w:numId="8" w16cid:durableId="893931933">
+  <w:num w:numId="8" w16cid:durableId="1857688325">
     <w:abstractNumId w:val="1"/>
   </w:num>
-  <w:num w:numId="9" w16cid:durableId="671612997">
+  <w:num w:numId="9" w16cid:durableId="585848143">
     <w:abstractNumId w:val="0"/>
   </w:num>
 </w:numbering>
@@ -2563,7 +4158,7 @@
     <w:rsid w:val="00FC693F"/>
     <w:pPr>
       <w:keepNext/>
-      <w:spacing w:after="300" w:line="252" w:lineRule="auto"/>
+      <w:spacing w:after="240" w:line="252" w:lineRule="auto"/>
       <w:outlineLvl w:val="0"/>
     </w:pPr>
     <w:rPr>
@@ -2608,7 +4203,7 @@
     <w:rsid w:val="00FC693F"/>
     <w:pPr>
       <w:keepNext/>
-      <w:spacing w:before="180" w:after="60" w:line="264" w:lineRule="auto"/>
+      <w:spacing w:before="80" w:after="40" w:line="264" w:lineRule="auto"/>
       <w:outlineLvl w:val="2"/>
     </w:pPr>
     <w:rPr>
@@ -2813,7 +4408,7 @@
       <w:spacing w:after="0" w:line="264" w:lineRule="auto"/>
     </w:pPr>
     <w:rPr>
-      <w:color w:val="78818B"/>
+      <w:color w:val="666666"/>
       <w:sz w:val="16"/>
     </w:rPr>
   </w:style>
@@ -2894,7 +4489,7 @@
       <w:color w:val="000000"/>
       <w:spacing w:val="5"/>
       <w:kern w:val="28"/>
-      <w:sz w:val="56"/>
+      <w:sz w:val="60"/>
       <w:szCs w:val="52"/>
     </w:rPr>
   </w:style>
@@ -13522,6 +15117,29 @@
       </w:tcPr>
     </w:tblStylePr>
   </w:style>
+  <w:style w:type="paragraph" w:customStyle="1" w:styleId="Date1">
+    <w:name w:val="Date1"/>
+    <w:basedOn w:val="Normal"/>
+    <w:pPr>
+      <w:spacing w:before="160" w:after="60" w:line="264" w:lineRule="auto"/>
+    </w:pPr>
+    <w:rPr>
+      <w:color w:val="444444"/>
+      <w:sz w:val="18"/>
+    </w:rPr>
+  </w:style>
+  <w:style w:type="paragraph" w:customStyle="1" w:styleId="Subrole">
+    <w:name w:val="Subrole"/>
+    <w:basedOn w:val="Normal"/>
+    <w:pPr>
+      <w:spacing w:before="40" w:after="40" w:line="259" w:lineRule="auto"/>
+    </w:pPr>
+    <w:rPr>
+      <w:b/>
+      <w:color w:val="000000"/>
+      <w:sz w:val="20"/>
+    </w:rPr>
+  </w:style>
   <w:style w:type="paragraph" w:customStyle="1" w:styleId="Identityarea">
     <w:name w:val="Identity area"/>
     <w:basedOn w:val="Normal"/>
@@ -13539,7 +15157,7 @@
       <w:spacing w:after="40" w:line="264" w:lineRule="auto"/>
     </w:pPr>
     <w:rPr>
-      <w:color w:val="505B66"/>
+      <w:color w:val="444444"/>
       <w:sz w:val="19"/>
     </w:rPr>
   </w:style>
@@ -13550,7 +15168,7 @@
       <w:spacing w:after="100" w:line="264" w:lineRule="auto"/>
     </w:pPr>
     <w:rPr>
-      <w:color w:val="505B66"/>
+      <w:color w:val="444444"/>
       <w:sz w:val="19"/>
     </w:rPr>
   </w:style>
@@ -13569,10 +15187,10 @@
     <w:basedOn w:val="Normal"/>
     <w:pPr>
       <w:keepNext/>
-      <w:spacing w:after="100" w:line="264" w:lineRule="auto"/>
+      <w:spacing w:after="80" w:line="264" w:lineRule="auto"/>
     </w:pPr>
     <w:rPr>
-      <w:color w:val="505B66"/>
+      <w:color w:val="444444"/>
       <w:sz w:val="18"/>
     </w:rPr>
   </w:style>
@@ -13602,7 +15220,7 @@
       <w:spacing w:after="100" w:line="264" w:lineRule="auto"/>
     </w:pPr>
     <w:rPr>
-      <w:color w:val="505B66"/>
+      <w:color w:val="444444"/>
       <w:sz w:val="19"/>
     </w:rPr>
   </w:style>
@@ -13650,7 +15268,7 @@
       <w:spacing w:after="20" w:line="254" w:lineRule="auto"/>
     </w:pPr>
     <w:rPr>
-      <w:color w:val="505B66"/>
+      <w:color w:val="444444"/>
       <w:sz w:val="18"/>
     </w:rPr>
   </w:style>
@@ -13661,7 +15279,7 @@
       <w:spacing w:after="60" w:line="252" w:lineRule="auto"/>
     </w:pPr>
     <w:rPr>
-      <w:color w:val="505B66"/>
+      <w:color w:val="444444"/>
       <w:sz w:val="18"/>
     </w:rPr>
   </w:style>
@@ -13669,7 +15287,7 @@
     <w:name w:val="Compact"/>
     <w:basedOn w:val="Normal"/>
     <w:pPr>
-      <w:spacing w:after="100" w:line="259" w:lineRule="auto"/>
+      <w:spacing w:after="80" w:line="259" w:lineRule="auto"/>
     </w:pPr>
     <w:rPr>
       <w:sz w:val="20"/>

</xml_diff>

<commit_message>
Use personal Gmail address on academic profile and CV
</commit_message>
<xml_diff>
--- a/academic/Joao_Jose_Academic_CV.docx
+++ b/academic/Joao_Jose_Academic_CV.docx
@@ -64,7 +64,7 @@
             </w:pPr>
             <w:hyperlink r:id="rId8">
               <w:r>
-                <w:t>joao@jtjsoftware.com</w:t>
+                <w:t>joaotiagojose@gmail.com</w:t>
               </w:r>
             </w:hyperlink>
           </w:p>
@@ -416,7 +416,7 @@
           <w:noProof/>
         </w:rPr>
         <w:drawing>
-          <wp:inline distT="0" distB="0" distL="0" distR="0" wp14:anchorId="1E6B3E86" wp14:editId="134A5653">
+          <wp:inline distT="0" distB="0" distL="0" distR="0" wp14:anchorId="71AC660E" wp14:editId="7DD4238A">
             <wp:extent cx="118800" cy="118800"/>
             <wp:effectExtent l="0" t="0" r="0" b="0"/>
             <wp:docPr id="1" name="Picture 1"/>
@@ -473,7 +473,7 @@
           <w:noProof/>
         </w:rPr>
         <w:drawing>
-          <wp:inline distT="0" distB="0" distL="0" distR="0" wp14:anchorId="25DE781C" wp14:editId="62B2885C">
+          <wp:inline distT="0" distB="0" distL="0" distR="0" wp14:anchorId="4E645A18" wp14:editId="7AE13962">
             <wp:extent cx="118800" cy="118800"/>
             <wp:effectExtent l="0" t="0" r="0" b="0"/>
             <wp:docPr id="2" name="Picture 2"/>
@@ -3428,7 +3428,7 @@
       </w:rPr>
     </w:pPr>
     <w:r>
-      <w:t>CV ID 20260918_001</w:t>
+      <w:t>CV ID 20260918_002</w:t>
     </w:r>
     <w:r>
       <w:tab/>
@@ -3718,31 +3718,31 @@
       </w:rPr>
     </w:lvl>
   </w:abstractNum>
-  <w:num w:numId="1" w16cid:durableId="1347439702">
+  <w:num w:numId="1" w16cid:durableId="1621523533">
     <w:abstractNumId w:val="8"/>
   </w:num>
-  <w:num w:numId="2" w16cid:durableId="456071892">
+  <w:num w:numId="2" w16cid:durableId="154881304">
     <w:abstractNumId w:val="6"/>
   </w:num>
-  <w:num w:numId="3" w16cid:durableId="829515606">
+  <w:num w:numId="3" w16cid:durableId="1256593438">
     <w:abstractNumId w:val="5"/>
   </w:num>
-  <w:num w:numId="4" w16cid:durableId="969556626">
+  <w:num w:numId="4" w16cid:durableId="954403446">
     <w:abstractNumId w:val="4"/>
   </w:num>
-  <w:num w:numId="5" w16cid:durableId="1601142331">
+  <w:num w:numId="5" w16cid:durableId="247689050">
     <w:abstractNumId w:val="7"/>
   </w:num>
-  <w:num w:numId="6" w16cid:durableId="2068451793">
+  <w:num w:numId="6" w16cid:durableId="829979653">
     <w:abstractNumId w:val="3"/>
   </w:num>
-  <w:num w:numId="7" w16cid:durableId="301884598">
+  <w:num w:numId="7" w16cid:durableId="1322732761">
     <w:abstractNumId w:val="2"/>
   </w:num>
-  <w:num w:numId="8" w16cid:durableId="1857688325">
+  <w:num w:numId="8" w16cid:durableId="1317224576">
     <w:abstractNumId w:val="1"/>
   </w:num>
-  <w:num w:numId="9" w16cid:durableId="585848143">
+  <w:num w:numId="9" w16cid:durableId="823669440">
     <w:abstractNumId w:val="0"/>
   </w:num>
 </w:numbering>

</xml_diff>